<commit_message>
Añadido contenido al README y actualizada la memoria del proyecto
</commit_message>
<xml_diff>
--- a/Documentos/Memoria.docx
+++ b/Documentos/Memoria.docx
@@ -2935,122 +2935,6 @@
     </w:p>
     <w:p>
       <w:pPr>
-        <w:pStyle w:val="ListParagraph"/>
-        <w:ind w:hanging="0" w:left="0"/>
-        <w:rPr>
-          <w:i/>
-          <w:i/>
-          <w:color w:val="FF0000"/>
-          <w:sz w:val="20"/>
-          <w:szCs w:val="20"/>
-          <w:lang w:val="gl-ES"/>
-        </w:rPr>
-      </w:pPr>
-      <w:r>
-        <w:rPr>
-          <w:i/>
-          <w:color w:val="FF0000"/>
-          <w:sz w:val="20"/>
-          <w:szCs w:val="20"/>
-          <w:lang w:val="gl-ES"/>
-        </w:rPr>
-        <w:t>&lt;</w:t>
-      </w:r>
-    </w:p>
-    <w:p>
-      <w:pPr>
-        <w:pStyle w:val="ListParagraph"/>
-        <w:ind w:hanging="0" w:left="0"/>
-        <w:jc w:val="both"/>
-        <w:rPr>
-          <w:i/>
-          <w:i/>
-          <w:color w:val="FF0000"/>
-          <w:lang w:val="gl-ES"/>
-        </w:rPr>
-      </w:pPr>
-      <w:r>
-        <w:rPr>
-          <w:i/>
-          <w:color w:val="FF0000"/>
-          <w:sz w:val="20"/>
-          <w:szCs w:val="20"/>
-          <w:lang w:val="gl-ES"/>
-        </w:rPr>
-        <w:t>Obxectivo que se marca o proxecto. Debe estar expresado dun xeito, claro e preciso, concreto  que permita determinar o éxito ou fracaso do mesmo</w:t>
-      </w:r>
-    </w:p>
-    <w:p>
-      <w:pPr>
-        <w:pStyle w:val="ListParagraph"/>
-        <w:ind w:hanging="0" w:left="0"/>
-        <w:jc w:val="both"/>
-        <w:rPr>
-          <w:i/>
-          <w:i/>
-          <w:color w:val="FF0000"/>
-          <w:lang w:val="gl-ES"/>
-        </w:rPr>
-      </w:pPr>
-      <w:r>
-        <w:rPr>
-          <w:color w:val="FF0000"/>
-          <w:sz w:val="20"/>
-          <w:szCs w:val="20"/>
-          <w:lang w:val="gl-ES"/>
-        </w:rPr>
-        <w:t xml:space="preserve">CA 2.4. Establecéronse os obxectivos </w:t>
-      </w:r>
-    </w:p>
-    <w:p>
-      <w:pPr>
-        <w:pStyle w:val="ListParagraph"/>
-        <w:ind w:hanging="0" w:left="0"/>
-        <w:jc w:val="both"/>
-        <w:rPr>
-          <w:color w:val="FF0000"/>
-          <w:sz w:val="20"/>
-          <w:szCs w:val="20"/>
-          <w:lang w:val="gl-ES"/>
-        </w:rPr>
-      </w:pPr>
-      <w:r>
-        <w:rPr>
-          <w:color w:val="FF0000"/>
-          <w:sz w:val="20"/>
-          <w:szCs w:val="20"/>
-          <w:lang w:val="gl-ES"/>
-        </w:rPr>
-        <w:t>CA 5.1. Enunciáronse os obxectivos do proxecto.</w:t>
-      </w:r>
-    </w:p>
-    <w:p>
-      <w:pPr>
-        <w:pStyle w:val="ListParagraph"/>
-        <w:ind w:hanging="0" w:left="0"/>
-        <w:jc w:val="both"/>
-        <w:rPr>
-          <w:i/>
-          <w:i/>
-          <w:color w:val="FF0000"/>
-          <w:sz w:val="20"/>
-          <w:szCs w:val="20"/>
-          <w:lang w:val="gl-ES"/>
-        </w:rPr>
-      </w:pPr>
-      <w:r>
-        <w:rPr>
-          <w:i/>
-          <w:color w:val="FF0000"/>
-          <w:sz w:val="20"/>
-          <w:szCs w:val="20"/>
-          <w:lang w:val="gl-ES"/>
-        </w:rPr>
-        <w:t>&gt;</w:t>
-      </w:r>
-    </w:p>
-    <w:p>
-      <w:pPr>
         <w:pStyle w:val="Heading1"/>
         <w:numPr>
           <w:ilvl w:val="0"/>
@@ -3659,147 +3543,6 @@
     </w:p>
     <w:p>
       <w:pPr>
-        <w:pStyle w:val="Normal"/>
-        <w:ind w:hanging="0" w:left="0"/>
-        <w:jc w:val="both"/>
-        <w:rPr>
-          <w:i/>
-          <w:i/>
-          <w:color w:val="FF0000"/>
-          <w:sz w:val="20"/>
-          <w:szCs w:val="20"/>
-          <w:lang w:val="gl-ES"/>
-        </w:rPr>
-      </w:pPr>
-      <w:r>
-        <w:rPr>
-          <w:i/>
-          <w:color w:val="FF0000"/>
-          <w:sz w:val="20"/>
-          <w:szCs w:val="20"/>
-          <w:lang w:val="gl-ES"/>
-        </w:rPr>
-        <w:t>&lt;</w:t>
-      </w:r>
-    </w:p>
-    <w:p>
-      <w:pPr>
-        <w:pStyle w:val="Normal"/>
-        <w:ind w:firstLine="283" w:left="0"/>
-        <w:jc w:val="both"/>
-        <w:rPr>
-          <w:sz w:val="20"/>
-          <w:szCs w:val="20"/>
-          <w:lang w:val="gl-ES"/>
-        </w:rPr>
-      </w:pPr>
-      <w:r>
-        <w:rPr>
-          <w:i/>
-          <w:color w:val="FF0000"/>
-          <w:sz w:val="20"/>
-          <w:szCs w:val="20"/>
-          <w:lang w:val="gl-ES"/>
-        </w:rPr>
-        <w:t>Breve descrición do proxecto, explicando aqueles puntos máis importantes, significativos ou dignos de mención. Amosando a parte do código que desexe resaltar, ben pola súa dificultade ou por seren os puntos máis relevantes do  proxecto. Comentando as partes do proxecto que supuxeron unha maior dificultade.</w:t>
-      </w:r>
-    </w:p>
-    <w:p>
-      <w:pPr>
-        <w:pStyle w:val="Normal"/>
-        <w:ind w:firstLine="283" w:left="0"/>
-        <w:jc w:val="both"/>
-        <w:rPr>
-          <w:i/>
-          <w:i/>
-          <w:color w:val="FF0000"/>
-          <w:sz w:val="20"/>
-          <w:szCs w:val="20"/>
-          <w:lang w:val="gl-ES"/>
-        </w:rPr>
-      </w:pPr>
-      <w:r>
-        <w:rPr>
-          <w:i/>
-          <w:color w:val="FF0000"/>
-          <w:sz w:val="20"/>
-          <w:szCs w:val="20"/>
-          <w:lang w:val="gl-ES"/>
-        </w:rPr>
-        <w:t>Neste apartado pódese incluír a motivación persoal que lle levou a presentar dito proxecto.</w:t>
-      </w:r>
-    </w:p>
-    <w:p>
-      <w:pPr>
-        <w:pStyle w:val="Normal"/>
-        <w:ind w:firstLine="283" w:left="0"/>
-        <w:jc w:val="both"/>
-        <w:rPr>
-          <w:color w:val="FF0000"/>
-          <w:sz w:val="20"/>
-          <w:szCs w:val="20"/>
-          <w:lang w:val="gl-ES"/>
-        </w:rPr>
-      </w:pPr>
-      <w:r>
-        <w:rPr>
-          <w:color w:val="FF0000"/>
-          <w:sz w:val="20"/>
-          <w:szCs w:val="20"/>
-          <w:lang w:val="gl-ES"/>
-        </w:rPr>
-        <w:t>CA 5.2. Describiuse o proceso seguido para a identificación das necesidades das empresas do sector.</w:t>
-      </w:r>
-    </w:p>
-    <w:p>
-      <w:pPr>
-        <w:pStyle w:val="Normal"/>
-        <w:ind w:firstLine="283" w:left="0"/>
-        <w:jc w:val="both"/>
-        <w:rPr>
-          <w:color w:val="FF0000"/>
-          <w:sz w:val="20"/>
-          <w:szCs w:val="20"/>
-          <w:lang w:val="gl-ES"/>
-        </w:rPr>
-      </w:pPr>
-      <w:r>
-        <w:rPr>
-          <w:color w:val="FF0000"/>
-          <w:sz w:val="20"/>
-          <w:szCs w:val="20"/>
-          <w:lang w:val="gl-ES"/>
-        </w:rPr>
-        <w:t>CA 5.3. Describiuse a solución adoptada a partir da documentación xerada no proceso de deseño.</w:t>
-      </w:r>
-    </w:p>
-    <w:p>
-      <w:pPr>
-        <w:pStyle w:val="Normal"/>
-        <w:ind w:hanging="0" w:left="0"/>
-        <w:jc w:val="both"/>
-        <w:rPr>
-          <w:i/>
-          <w:i/>
-          <w:color w:val="FF0000"/>
-          <w:sz w:val="20"/>
-          <w:szCs w:val="20"/>
-          <w:lang w:val="gl-ES"/>
-        </w:rPr>
-      </w:pPr>
-      <w:r>
-        <w:rPr>
-          <w:i/>
-          <w:color w:val="FF0000"/>
-          <w:sz w:val="20"/>
-          <w:szCs w:val="20"/>
-          <w:lang w:val="gl-ES"/>
-        </w:rPr>
-        <w:t>&gt;</w:t>
-      </w:r>
-    </w:p>
-    <w:p>
-      <w:pPr>
         <w:pStyle w:val="Heading1"/>
         <w:numPr>
           <w:ilvl w:val="0"/>
@@ -4283,267 +4026,6 @@
           <w:szCs w:val="20"/>
         </w:rPr>
         <w:t>Será uno de los módulos con más peso en el proyecto, debido a que gran parte del trabajo se centrará en desarrollar la aplicación móvil que será clave para el éxito del proyecto. Se hará uso de muchos de los temas desarrollados en clase: conexión a APIs, navegación, componentes...</w:t>
-      </w:r>
-    </w:p>
-    <w:p>
-      <w:pPr>
-        <w:pStyle w:val="ListParagraph"/>
-        <w:ind w:hanging="0" w:left="0"/>
-        <w:jc w:val="both"/>
-        <w:rPr>
-          <w:i/>
-          <w:i/>
-          <w:color w:val="FF0000"/>
-          <w:sz w:val="20"/>
-          <w:szCs w:val="20"/>
-          <w:lang w:val="gl-ES"/>
-        </w:rPr>
-      </w:pPr>
-      <w:r>
-        <w:rPr>
-          <w:i/>
-          <w:color w:val="FF0000"/>
-          <w:sz w:val="20"/>
-          <w:szCs w:val="20"/>
-          <w:lang w:val="gl-ES"/>
-        </w:rPr>
-        <w:t>&lt;</w:t>
-      </w:r>
-    </w:p>
-    <w:p>
-      <w:pPr>
-        <w:pStyle w:val="ListParagraph"/>
-        <w:ind w:hanging="0" w:left="0"/>
-        <w:jc w:val="both"/>
-        <w:rPr>
-          <w:i/>
-          <w:i/>
-          <w:color w:val="FF0000"/>
-          <w:sz w:val="20"/>
-          <w:szCs w:val="20"/>
-          <w:lang w:val="gl-ES"/>
-        </w:rPr>
-      </w:pPr>
-      <w:r>
-        <w:rPr>
-          <w:i/>
-          <w:color w:val="FF0000"/>
-          <w:sz w:val="20"/>
-          <w:szCs w:val="20"/>
-          <w:lang w:val="gl-ES"/>
-        </w:rPr>
-        <w:t xml:space="preserve">Si na súa  concepción é moi  ambicioso,  podedes limitar o alcance do mesmo, circunscribíndoo a aquelo para o que si teredes tempo de realizar no prazo do proxecto. </w:t>
-      </w:r>
-    </w:p>
-    <w:p>
-      <w:pPr>
-        <w:pStyle w:val="ListParagraph"/>
-        <w:ind w:hanging="0" w:left="0"/>
-        <w:jc w:val="both"/>
-        <w:rPr>
-          <w:i/>
-          <w:i/>
-          <w:color w:val="FF0000"/>
-          <w:sz w:val="20"/>
-          <w:szCs w:val="20"/>
-          <w:lang w:val="gl-ES"/>
-        </w:rPr>
-      </w:pPr>
-      <w:r>
-        <w:rPr>
-          <w:i/>
-          <w:color w:val="FF0000"/>
-          <w:sz w:val="20"/>
-          <w:szCs w:val="20"/>
-          <w:lang w:val="gl-ES"/>
-        </w:rPr>
-      </w:r>
-    </w:p>
-    <w:p>
-      <w:pPr>
-        <w:pStyle w:val="ListParagraph"/>
-        <w:ind w:hanging="0" w:left="0"/>
-        <w:jc w:val="both"/>
-        <w:rPr>
-          <w:i/>
-          <w:i/>
-          <w:color w:val="FF0000"/>
-          <w:sz w:val="20"/>
-          <w:szCs w:val="20"/>
-          <w:lang w:val="gl-ES"/>
-        </w:rPr>
-      </w:pPr>
-      <w:r>
-        <w:rPr>
-          <w:i/>
-          <w:color w:val="FF0000"/>
-          <w:sz w:val="20"/>
-          <w:szCs w:val="20"/>
-          <w:lang w:val="gl-ES"/>
-        </w:rPr>
-        <w:t>Explicando que é o que  queda fóra do proxecto e o impacto que supón para o  mesmo.</w:t>
-      </w:r>
-    </w:p>
-    <w:p>
-      <w:pPr>
-        <w:pStyle w:val="ListParagraph"/>
-        <w:ind w:hanging="0" w:left="0"/>
-        <w:jc w:val="both"/>
-        <w:rPr>
-          <w:i/>
-          <w:i/>
-          <w:color w:val="FF0000"/>
-          <w:sz w:val="20"/>
-          <w:szCs w:val="20"/>
-          <w:lang w:val="gl-ES"/>
-        </w:rPr>
-      </w:pPr>
-      <w:r>
-        <w:rPr>
-          <w:i/>
-          <w:color w:val="FF0000"/>
-          <w:sz w:val="20"/>
-          <w:szCs w:val="20"/>
-          <w:lang w:val="gl-ES"/>
-        </w:rPr>
-      </w:r>
-    </w:p>
-    <w:p>
-      <w:pPr>
-        <w:pStyle w:val="ListParagraph"/>
-        <w:ind w:hanging="0" w:left="0"/>
-        <w:jc w:val="both"/>
-        <w:rPr>
-          <w:i/>
-          <w:i/>
-          <w:color w:val="FF0000"/>
-          <w:sz w:val="20"/>
-          <w:szCs w:val="20"/>
-          <w:lang w:val="gl-ES"/>
-        </w:rPr>
-      </w:pPr>
-      <w:r>
-        <w:rPr>
-          <w:i/>
-          <w:color w:val="FF0000"/>
-          <w:sz w:val="20"/>
-          <w:szCs w:val="20"/>
-          <w:lang w:val="gl-ES"/>
-        </w:rPr>
-        <w:t>Non se permitirá que esa limitación no alcance do proxecto condicione o seu éxito ou unha conclusión aceptable do proxecto.</w:t>
-      </w:r>
-    </w:p>
-    <w:p>
-      <w:pPr>
-        <w:pStyle w:val="ListParagraph"/>
-        <w:ind w:hanging="0" w:left="0"/>
-        <w:jc w:val="both"/>
-        <w:rPr>
-          <w:i/>
-          <w:i/>
-          <w:color w:val="FF0000"/>
-          <w:sz w:val="20"/>
-          <w:szCs w:val="20"/>
-          <w:lang w:val="gl-ES"/>
-        </w:rPr>
-      </w:pPr>
-      <w:r>
-        <w:rPr>
-          <w:i/>
-          <w:color w:val="FF0000"/>
-          <w:sz w:val="20"/>
-          <w:szCs w:val="20"/>
-          <w:lang w:val="gl-ES"/>
-        </w:rPr>
-      </w:r>
-    </w:p>
-    <w:p>
-      <w:pPr>
-        <w:pStyle w:val="ListParagraph"/>
-        <w:ind w:hanging="0" w:left="0"/>
-        <w:jc w:val="both"/>
-        <w:rPr>
-          <w:color w:val="FF0000"/>
-          <w:sz w:val="20"/>
-          <w:szCs w:val="20"/>
-          <w:lang w:val="gl-ES"/>
-        </w:rPr>
-      </w:pPr>
-      <w:r>
-        <w:rPr>
-          <w:color w:val="FF0000"/>
-          <w:sz w:val="20"/>
-          <w:szCs w:val="20"/>
-          <w:lang w:val="gl-ES"/>
-        </w:rPr>
-        <w:t>CA 2.3. Identificáronse as fases ou partes do proxecto, así como o seu contido.</w:t>
-      </w:r>
-    </w:p>
-    <w:p>
-      <w:pPr>
-        <w:pStyle w:val="ListParagraph"/>
-        <w:ind w:hanging="0" w:left="0"/>
-        <w:jc w:val="both"/>
-        <w:rPr>
-          <w:color w:val="FF0000"/>
-          <w:sz w:val="20"/>
-          <w:szCs w:val="20"/>
-          <w:lang w:val="gl-ES"/>
-        </w:rPr>
-      </w:pPr>
-      <w:r>
-        <w:rPr>
-          <w:color w:val="FF0000"/>
-          <w:sz w:val="20"/>
-          <w:szCs w:val="20"/>
-          <w:lang w:val="gl-ES"/>
-        </w:rPr>
-      </w:r>
-    </w:p>
-    <w:p>
-      <w:pPr>
-        <w:pStyle w:val="ListParagraph"/>
-        <w:ind w:hanging="0" w:left="0"/>
-        <w:jc w:val="both"/>
-        <w:rPr>
-          <w:sz w:val="20"/>
-          <w:szCs w:val="20"/>
-          <w:lang w:val="gl-ES"/>
-        </w:rPr>
-      </w:pPr>
-      <w:r>
-        <w:rPr>
-          <w:color w:val="FF0000"/>
-          <w:sz w:val="20"/>
-          <w:szCs w:val="20"/>
-          <w:lang w:val="gl-ES"/>
-        </w:rPr>
-        <w:t>CA 2.4. Identificouse o seu alcance.</w:t>
-      </w:r>
-    </w:p>
-    <w:p>
-      <w:pPr>
-        <w:pStyle w:val="ListParagraph"/>
-        <w:ind w:hanging="0" w:left="0"/>
-        <w:jc w:val="both"/>
-        <w:rPr>
-          <w:i/>
-          <w:i/>
-          <w:color w:val="FF0000"/>
-          <w:sz w:val="20"/>
-          <w:szCs w:val="20"/>
-          <w:lang w:val="gl-ES"/>
-        </w:rPr>
-      </w:pPr>
-      <w:r>
-        <w:rPr>
-          <w:i/>
-          <w:color w:val="FF0000"/>
-          <w:sz w:val="20"/>
-          <w:szCs w:val="20"/>
-          <w:lang w:val="gl-ES"/>
-        </w:rPr>
-        <w:t>&gt;</w:t>
       </w:r>
     </w:p>
     <w:p>
@@ -5327,8 +4809,11 @@
       </w:pPr>
       <w:r>
         <w:rPr>
-          <w:i/>
-          <w:color w:val="FF0000"/>
+          <w:b/>
+          <w:bCs/>
+          <w:i w:val="false"/>
+          <w:iCs w:val="false"/>
+          <w:color w:val="000000"/>
           <w:sz w:val="20"/>
           <w:szCs w:val="20"/>
           <w:lang w:val="gl-ES"/>
@@ -5379,10 +4864,14 @@
           </wp:anchor>
         </w:drawing>
       </w:r>
-    </w:p>
-    <w:p>
-      <w:pPr>
-        <w:pStyle w:val="Normal"/>
+      <w:r>
+        <w:br w:type="page"/>
+      </w:r>
+    </w:p>
+    <w:p>
+      <w:pPr>
+        <w:pStyle w:val="Normal"/>
+        <w:spacing w:before="0" w:after="120"/>
         <w:ind w:hanging="0" w:left="0"/>
         <w:jc w:val="both"/>
         <w:rPr>
@@ -5408,39 +4897,6 @@
           <w:szCs w:val="20"/>
           <w:lang w:val="gl-ES"/>
         </w:rPr>
-      </w:r>
-      <w:r>
-        <w:br w:type="page"/>
-      </w:r>
-    </w:p>
-    <w:p>
-      <w:pPr>
-        <w:pStyle w:val="Normal"/>
-        <w:ind w:hanging="0" w:left="0"/>
-        <w:jc w:val="both"/>
-        <w:rPr>
-          <w:b/>
-          <w:bCs/>
-          <w:i w:val="false"/>
-          <w:i w:val="false"/>
-          <w:iCs w:val="false"/>
-          <w:color w:val="000000"/>
-          <w:sz w:val="20"/>
-          <w:szCs w:val="20"/>
-          <w:lang w:val="gl-ES"/>
-        </w:rPr>
-      </w:pPr>
-      <w:r>
-        <w:rPr>
-          <w:b/>
-          <w:bCs/>
-          <w:i w:val="false"/>
-          <w:iCs w:val="false"/>
-          <w:color w:val="000000"/>
-          <w:sz w:val="20"/>
-          <w:szCs w:val="20"/>
-          <w:lang w:val="gl-ES"/>
-        </w:rPr>
         <w:t>Planificación de la base de datos</w:t>
       </w:r>
     </w:p>
@@ -5493,16 +4949,7 @@
         </w:rPr>
       </w:pPr>
       <w:r>
-        <w:rPr>
-          <w:b w:val="false"/>
-          <w:bCs w:val="false"/>
-          <w:i w:val="false"/>
-          <w:iCs w:val="false"/>
-          <w:color w:val="000000"/>
-          <w:sz w:val="20"/>
-          <w:szCs w:val="20"/>
-          <w:lang w:val="gl-ES"/>
-        </w:rPr>
+        <w:rPr/>
         <w:drawing>
           <wp:anchor behindDoc="0" distT="0" distB="0" distL="0" distR="0" simplePos="0" locked="0" layoutInCell="0" allowOverlap="1" relativeHeight="5">
             <wp:simplePos x="0" y="0"/>
@@ -5552,233 +4999,6 @@
     </w:p>
     <w:p>
       <w:pPr>
-        <w:pStyle w:val="Normal"/>
-        <w:ind w:hanging="0" w:left="0"/>
-        <w:jc w:val="both"/>
-        <w:rPr>
-          <w:i/>
-          <w:i/>
-          <w:color w:val="FF0000"/>
-          <w:sz w:val="20"/>
-          <w:szCs w:val="20"/>
-          <w:lang w:val="gl-ES"/>
-        </w:rPr>
-      </w:pPr>
-      <w:r>
-        <w:rPr>
-          <w:i/>
-          <w:color w:val="FF0000"/>
-          <w:sz w:val="20"/>
-          <w:szCs w:val="20"/>
-          <w:lang w:val="gl-ES"/>
-        </w:rPr>
-        <w:t>&lt;</w:t>
-      </w:r>
-    </w:p>
-    <w:p>
-      <w:pPr>
-        <w:pStyle w:val="Normal"/>
-        <w:ind w:hanging="0" w:left="0"/>
-        <w:jc w:val="both"/>
-        <w:rPr>
-          <w:i/>
-          <w:i/>
-          <w:color w:val="FF0000"/>
-          <w:sz w:val="20"/>
-          <w:szCs w:val="20"/>
-          <w:lang w:val="gl-ES"/>
-        </w:rPr>
-      </w:pPr>
-      <w:r>
-        <w:rPr>
-          <w:i/>
-          <w:color w:val="FF0000"/>
-          <w:sz w:val="20"/>
-          <w:szCs w:val="20"/>
-          <w:lang w:val="gl-ES"/>
-        </w:rPr>
-        <w:t xml:space="preserve">Débese incluír un detalle de tarefas e os seus tempos. </w:t>
-      </w:r>
-    </w:p>
-    <w:p>
-      <w:pPr>
-        <w:pStyle w:val="Normal"/>
-        <w:ind w:hanging="0" w:left="0"/>
-        <w:jc w:val="both"/>
-        <w:rPr>
-          <w:color w:val="FF0000"/>
-          <w:sz w:val="20"/>
-          <w:szCs w:val="20"/>
-          <w:lang w:val="gl-ES"/>
-        </w:rPr>
-      </w:pPr>
-      <w:r>
-        <w:rPr>
-          <w:color w:val="FF0000"/>
-          <w:sz w:val="20"/>
-          <w:szCs w:val="20"/>
-          <w:lang w:val="gl-ES"/>
-        </w:rPr>
-        <w:t>CA 3.1. Estableceuse a secuencia das actividades en función das necesidades de posta en práctica.</w:t>
-      </w:r>
-    </w:p>
-    <w:p>
-      <w:pPr>
-        <w:pStyle w:val="Normal"/>
-        <w:ind w:hanging="0" w:left="0"/>
-        <w:jc w:val="both"/>
-        <w:rPr>
-          <w:color w:val="FF0000"/>
-          <w:sz w:val="20"/>
-          <w:szCs w:val="20"/>
-          <w:lang w:val="gl-ES"/>
-        </w:rPr>
-      </w:pPr>
-      <w:r>
-        <w:rPr>
-          <w:color w:val="FF0000"/>
-          <w:sz w:val="20"/>
-          <w:szCs w:val="20"/>
-          <w:lang w:val="gl-ES"/>
-        </w:rPr>
-        <w:t>CA 3.2. Determináronse os recursos e a loxística necesarios para cada actividade.</w:t>
-      </w:r>
-    </w:p>
-    <w:p>
-      <w:pPr>
-        <w:pStyle w:val="Normal"/>
-        <w:ind w:hanging="0" w:left="0"/>
-        <w:jc w:val="both"/>
-        <w:rPr>
-          <w:color w:val="FF0000"/>
-          <w:sz w:val="20"/>
-          <w:szCs w:val="20"/>
-          <w:lang w:val="gl-ES"/>
-        </w:rPr>
-      </w:pPr>
-      <w:r>
-        <w:rPr>
-          <w:color w:val="FF0000"/>
-          <w:sz w:val="20"/>
-          <w:szCs w:val="20"/>
-          <w:lang w:val="gl-ES"/>
-        </w:rPr>
-        <w:t>CA 3.3. Identificáronse as necesidades de permisos e autorizacións para levar a cabo as actividades.</w:t>
-      </w:r>
-    </w:p>
-    <w:p>
-      <w:pPr>
-        <w:pStyle w:val="Normal"/>
-        <w:ind w:hanging="0" w:left="0"/>
-        <w:jc w:val="both"/>
-        <w:rPr>
-          <w:color w:val="FF0000"/>
-          <w:sz w:val="20"/>
-          <w:szCs w:val="20"/>
-          <w:lang w:val="gl-ES"/>
-        </w:rPr>
-      </w:pPr>
-      <w:r>
-        <w:rPr>
-          <w:color w:val="FF0000"/>
-          <w:sz w:val="20"/>
-          <w:szCs w:val="20"/>
-          <w:lang w:val="gl-ES"/>
-        </w:rPr>
-        <w:t>CA 3.4. Determináronse os procedementos de actuación ou execución das actividades.</w:t>
-      </w:r>
-    </w:p>
-    <w:p>
-      <w:pPr>
-        <w:pStyle w:val="Normal"/>
-        <w:ind w:hanging="0" w:left="0"/>
-        <w:jc w:val="both"/>
-        <w:rPr>
-          <w:color w:val="FF0000"/>
-          <w:sz w:val="20"/>
-          <w:szCs w:val="20"/>
-          <w:lang w:val="gl-ES"/>
-        </w:rPr>
-      </w:pPr>
-      <w:r>
-        <w:rPr>
-          <w:color w:val="FF0000"/>
-          <w:sz w:val="20"/>
-          <w:szCs w:val="20"/>
-          <w:lang w:val="gl-ES"/>
-        </w:rPr>
-        <w:t>CA 3.6. Planificáronse a asignación de recursos materiais e humanos, e os tempos de execución.</w:t>
-      </w:r>
-    </w:p>
-    <w:p>
-      <w:pPr>
-        <w:pStyle w:val="Normal"/>
-        <w:ind w:hanging="0" w:left="0"/>
-        <w:jc w:val="both"/>
-        <w:rPr>
-          <w:color w:val="FF0000"/>
-          <w:sz w:val="20"/>
-          <w:szCs w:val="20"/>
-          <w:lang w:val="gl-ES"/>
-        </w:rPr>
-      </w:pPr>
-      <w:r>
-        <w:rPr>
-          <w:color w:val="FF0000"/>
-          <w:sz w:val="20"/>
-          <w:szCs w:val="20"/>
-          <w:lang w:val="gl-ES"/>
-        </w:rPr>
-        <w:t>CA 5.4. Describíronse as actividades en que se divide a execución do proxecto.</w:t>
-      </w:r>
-    </w:p>
-    <w:p>
-      <w:pPr>
-        <w:pStyle w:val="Normal"/>
-        <w:ind w:hanging="0" w:left="0"/>
-        <w:jc w:val="both"/>
-        <w:rPr>
-          <w:color w:val="FF0000"/>
-          <w:sz w:val="20"/>
-          <w:szCs w:val="20"/>
-          <w:lang w:val="gl-ES"/>
-        </w:rPr>
-      </w:pPr>
-      <w:r>
-        <w:rPr>
-          <w:color w:val="FF0000"/>
-          <w:sz w:val="20"/>
-          <w:szCs w:val="20"/>
-          <w:lang w:val="gl-ES"/>
-        </w:rPr>
-        <w:t>CA 5.5. Xustificáronse as decisións tomadas de planificación da execución do proxecto.</w:t>
-      </w:r>
-    </w:p>
-    <w:p>
-      <w:pPr>
-        <w:pStyle w:val="Normal"/>
-        <w:ind w:hanging="0" w:left="0"/>
-        <w:jc w:val="both"/>
-        <w:rPr>
-          <w:color w:val="FF0000"/>
-          <w:sz w:val="20"/>
-          <w:szCs w:val="20"/>
-          <w:lang w:val="gl-ES"/>
-        </w:rPr>
-      </w:pPr>
-      <w:r>
-        <w:rPr>
-          <w:i/>
-          <w:color w:val="FF0000"/>
-          <w:sz w:val="20"/>
-          <w:szCs w:val="20"/>
-          <w:lang w:val="gl-ES"/>
-        </w:rPr>
-        <w:t>&gt;</w:t>
-      </w:r>
-    </w:p>
-    <w:p>
-      <w:pPr>
         <w:pStyle w:val="Heading1"/>
         <w:numPr>
           <w:ilvl w:val="0"/>
@@ -5808,119 +5028,251 @@
       <w:pPr>
         <w:pStyle w:val="Normal"/>
         <w:ind w:hanging="0" w:left="0"/>
-        <w:jc w:val="both"/>
-        <w:rPr>
-          <w:i/>
-          <w:i/>
-          <w:color w:val="FF0000"/>
-          <w:sz w:val="20"/>
-          <w:szCs w:val="20"/>
-          <w:lang w:val="gl-ES"/>
-        </w:rPr>
-      </w:pPr>
-      <w:r>
-        <w:rPr>
-          <w:i/>
-          <w:color w:val="FF0000"/>
-          <w:sz w:val="20"/>
-          <w:szCs w:val="20"/>
-          <w:lang w:val="gl-ES"/>
-        </w:rPr>
-        <w:t>&lt;</w:t>
+        <w:jc w:val="left"/>
+        <w:rPr>
+          <w:i w:val="false"/>
+          <w:i w:val="false"/>
+          <w:iCs w:val="false"/>
+          <w:color w:val="auto"/>
+          <w:sz w:val="20"/>
+          <w:szCs w:val="20"/>
+        </w:rPr>
+      </w:pPr>
+      <w:r>
+        <w:rPr>
+          <w:i w:val="false"/>
+          <w:iCs w:val="false"/>
+          <w:color w:val="auto"/>
+          <w:sz w:val="20"/>
+          <w:szCs w:val="20"/>
+        </w:rPr>
+        <w:t>Para llevar a cabo el proyecto, solo será necesario un equipo como único requisito de hardware.</w:t>
       </w:r>
     </w:p>
     <w:p>
       <w:pPr>
         <w:pStyle w:val="Normal"/>
         <w:ind w:hanging="0" w:left="0"/>
-        <w:jc w:val="both"/>
-        <w:rPr>
-          <w:i/>
-          <w:i/>
-          <w:color w:val="FF0000"/>
-          <w:sz w:val="20"/>
-          <w:szCs w:val="20"/>
-          <w:lang w:val="gl-ES"/>
-        </w:rPr>
-      </w:pPr>
-      <w:r>
-        <w:rPr>
-          <w:i/>
-          <w:color w:val="FF0000"/>
-          <w:sz w:val="20"/>
-          <w:szCs w:val="20"/>
-          <w:lang w:val="gl-ES"/>
-        </w:rPr>
-        <w:t>Equipos, software, recursos tecnolóxicos, etc.</w:t>
+        <w:jc w:val="left"/>
+        <w:rPr>
+          <w:i w:val="false"/>
+          <w:i w:val="false"/>
+          <w:iCs w:val="false"/>
+          <w:color w:val="auto"/>
+          <w:sz w:val="20"/>
+          <w:szCs w:val="20"/>
+        </w:rPr>
+      </w:pPr>
+      <w:r>
+        <w:rPr>
+          <w:i w:val="false"/>
+          <w:iCs w:val="false"/>
+          <w:color w:val="auto"/>
+          <w:sz w:val="20"/>
+          <w:szCs w:val="20"/>
+        </w:rPr>
+        <w:t>Respecto al software, con la única excepción del hosting, se hará uso únicamente de los siguientes programas de código libre:</w:t>
+      </w:r>
+    </w:p>
+    <w:p>
+      <w:pPr>
+        <w:pStyle w:val="Normal"/>
+        <w:numPr>
+          <w:ilvl w:val="0"/>
+          <w:numId w:val="3"/>
+        </w:numPr>
+        <w:jc w:val="left"/>
+        <w:rPr>
+          <w:b/>
+          <w:bCs/>
+          <w:i w:val="false"/>
+          <w:i w:val="false"/>
+          <w:iCs w:val="false"/>
+          <w:color w:val="auto"/>
+          <w:sz w:val="20"/>
+          <w:szCs w:val="20"/>
+        </w:rPr>
+      </w:pPr>
+      <w:r>
+        <w:rPr>
+          <w:b/>
+          <w:bCs/>
+          <w:i w:val="false"/>
+          <w:iCs w:val="false"/>
+          <w:color w:val="auto"/>
+          <w:sz w:val="20"/>
+          <w:szCs w:val="20"/>
+        </w:rPr>
+        <w:t>Android Studio</w:t>
+      </w:r>
+      <w:r>
+        <w:rPr>
+          <w:b w:val="false"/>
+          <w:bCs w:val="false"/>
+          <w:i w:val="false"/>
+          <w:iCs w:val="false"/>
+          <w:color w:val="auto"/>
+          <w:sz w:val="20"/>
+          <w:szCs w:val="20"/>
+        </w:rPr>
+        <w:t xml:space="preserve"> para el desarrollo de la aplicación móvil.</w:t>
+      </w:r>
+    </w:p>
+    <w:p>
+      <w:pPr>
+        <w:pStyle w:val="Normal"/>
+        <w:numPr>
+          <w:ilvl w:val="0"/>
+          <w:numId w:val="3"/>
+        </w:numPr>
+        <w:jc w:val="left"/>
+        <w:rPr>
+          <w:b/>
+          <w:bCs/>
+          <w:i w:val="false"/>
+          <w:i w:val="false"/>
+          <w:iCs w:val="false"/>
+          <w:color w:val="auto"/>
+          <w:sz w:val="20"/>
+          <w:szCs w:val="20"/>
+        </w:rPr>
+      </w:pPr>
+      <w:r>
+        <w:rPr>
+          <w:b/>
+          <w:bCs/>
+          <w:i w:val="false"/>
+          <w:iCs w:val="false"/>
+          <w:color w:val="auto"/>
+          <w:sz w:val="20"/>
+          <w:szCs w:val="20"/>
+        </w:rPr>
+        <w:t>Visual Studio</w:t>
+      </w:r>
+      <w:r>
+        <w:rPr>
+          <w:b w:val="false"/>
+          <w:bCs w:val="false"/>
+          <w:i w:val="false"/>
+          <w:iCs w:val="false"/>
+          <w:color w:val="auto"/>
+          <w:sz w:val="20"/>
+          <w:szCs w:val="20"/>
+        </w:rPr>
+        <w:t xml:space="preserve"> para el desarrollo de la API y el visualizador web.</w:t>
+      </w:r>
+    </w:p>
+    <w:p>
+      <w:pPr>
+        <w:pStyle w:val="Normal"/>
+        <w:numPr>
+          <w:ilvl w:val="0"/>
+          <w:numId w:val="3"/>
+        </w:numPr>
+        <w:jc w:val="left"/>
+        <w:rPr>
+          <w:b/>
+          <w:bCs/>
+          <w:i w:val="false"/>
+          <w:i w:val="false"/>
+          <w:iCs w:val="false"/>
+          <w:color w:val="auto"/>
+          <w:sz w:val="20"/>
+          <w:szCs w:val="20"/>
+        </w:rPr>
+      </w:pPr>
+      <w:r>
+        <w:rPr>
+          <w:b/>
+          <w:bCs/>
+          <w:i w:val="false"/>
+          <w:iCs w:val="false"/>
+          <w:color w:val="auto"/>
+          <w:sz w:val="20"/>
+          <w:szCs w:val="20"/>
+        </w:rPr>
+        <w:t>Docker</w:t>
+      </w:r>
+      <w:r>
+        <w:rPr>
+          <w:b w:val="false"/>
+          <w:bCs w:val="false"/>
+          <w:i w:val="false"/>
+          <w:iCs w:val="false"/>
+          <w:color w:val="auto"/>
+          <w:sz w:val="20"/>
+          <w:szCs w:val="20"/>
+        </w:rPr>
+        <w:t xml:space="preserve"> para asegurar el correcto mantenimiento de la API.</w:t>
+      </w:r>
+    </w:p>
+    <w:p>
+      <w:pPr>
+        <w:pStyle w:val="Normal"/>
+        <w:numPr>
+          <w:ilvl w:val="0"/>
+          <w:numId w:val="3"/>
+        </w:numPr>
+        <w:jc w:val="left"/>
+        <w:rPr>
+          <w:b/>
+          <w:bCs/>
+          <w:i w:val="false"/>
+          <w:i w:val="false"/>
+          <w:iCs w:val="false"/>
+          <w:color w:val="auto"/>
+          <w:sz w:val="20"/>
+          <w:szCs w:val="20"/>
+        </w:rPr>
+      </w:pPr>
+      <w:r>
+        <w:rPr>
+          <w:b/>
+          <w:bCs/>
+          <w:i w:val="false"/>
+          <w:iCs w:val="false"/>
+          <w:color w:val="auto"/>
+          <w:sz w:val="20"/>
+          <w:szCs w:val="20"/>
+        </w:rPr>
+        <w:t>MaríaDB y MongoDB</w:t>
+      </w:r>
+      <w:r>
+        <w:rPr>
+          <w:b w:val="false"/>
+          <w:bCs w:val="false"/>
+          <w:i w:val="false"/>
+          <w:iCs w:val="false"/>
+          <w:color w:val="auto"/>
+          <w:sz w:val="20"/>
+          <w:szCs w:val="20"/>
+        </w:rPr>
+        <w:t xml:space="preserve"> como bases de datos.</w:t>
       </w:r>
     </w:p>
     <w:p>
       <w:pPr>
         <w:pStyle w:val="Normal"/>
         <w:ind w:hanging="0" w:left="0"/>
-        <w:jc w:val="both"/>
-        <w:rPr>
-          <w:color w:val="FF0000"/>
-          <w:sz w:val="20"/>
-          <w:szCs w:val="20"/>
-          <w:lang w:val="gl-ES"/>
-        </w:rPr>
-      </w:pPr>
-      <w:r>
-        <w:rPr>
-          <w:color w:val="FF0000"/>
-          <w:sz w:val="20"/>
-          <w:szCs w:val="20"/>
-          <w:lang w:val="gl-ES"/>
-        </w:rPr>
-        <w:t>CA 3.6. Planificáronse a asignación de recursos materiais e humanos, e os tempos de execución.</w:t>
-      </w:r>
-    </w:p>
-    <w:p>
-      <w:pPr>
-        <w:pStyle w:val="Normal"/>
-        <w:ind w:hanging="0" w:left="0"/>
-        <w:jc w:val="both"/>
-        <w:rPr>
-          <w:color w:val="FF0000"/>
-          <w:sz w:val="20"/>
-          <w:szCs w:val="20"/>
-          <w:lang w:val="gl-ES"/>
-        </w:rPr>
-      </w:pPr>
-      <w:r>
-        <w:rPr>
-          <w:color w:val="FF0000"/>
-          <w:sz w:val="20"/>
-          <w:szCs w:val="20"/>
-          <w:lang w:val="gl-ES"/>
-        </w:rPr>
-        <w:t>CA 2.5. Prevíronse os recursos materiais e persoais necesarios para realizar o proxecto.</w:t>
-      </w:r>
-    </w:p>
-    <w:p>
-      <w:pPr>
-        <w:pStyle w:val="Normal"/>
-        <w:ind w:hanging="0" w:left="0"/>
-        <w:jc w:val="both"/>
-        <w:rPr>
-          <w:i/>
-          <w:i/>
-          <w:color w:val="FF0000"/>
-          <w:sz w:val="20"/>
-          <w:szCs w:val="20"/>
-          <w:lang w:val="gl-ES"/>
-        </w:rPr>
-      </w:pPr>
-      <w:r>
-        <w:rPr>
-          <w:i/>
-          <w:color w:val="FF0000"/>
-          <w:sz w:val="20"/>
-          <w:szCs w:val="20"/>
-          <w:lang w:val="gl-ES"/>
-        </w:rPr>
-        <w:t>&gt;</w:t>
+        <w:jc w:val="left"/>
+        <w:rPr>
+          <w:i w:val="false"/>
+          <w:i w:val="false"/>
+          <w:iCs w:val="false"/>
+          <w:color w:val="auto"/>
+          <w:sz w:val="20"/>
+          <w:szCs w:val="20"/>
+        </w:rPr>
+      </w:pPr>
+      <w:r>
+        <w:rPr>
+          <w:i w:val="false"/>
+          <w:iCs w:val="false"/>
+          <w:color w:val="auto"/>
+          <w:sz w:val="20"/>
+          <w:szCs w:val="20"/>
+        </w:rPr>
+        <w:t>Finalmente, como capital humano se hará uso de un único programador.</w:t>
       </w:r>
     </w:p>
     <w:p>
@@ -6019,7 +5371,27 @@
           <w:sz w:val="20"/>
           <w:szCs w:val="20"/>
         </w:rPr>
-        <w:t>»HOSTING«</w:t>
+        <w:t xml:space="preserve">Para el hosting, se va a hacer uso de la opción dada por </w:t>
+      </w:r>
+      <w:r>
+        <w:rPr>
+          <w:i/>
+          <w:iCs/>
+          <w:color w:val="000000"/>
+          <w:sz w:val="20"/>
+          <w:szCs w:val="20"/>
+        </w:rPr>
+        <w:t>Dinahosting</w:t>
+      </w:r>
+      <w:r>
+        <w:rPr>
+          <w:i w:val="false"/>
+          <w:iCs w:val="false"/>
+          <w:color w:val="000000"/>
+          <w:sz w:val="20"/>
+          <w:szCs w:val="20"/>
+        </w:rPr>
+        <w:t>, pues es una empresa gallega que ofrece alojamiento de webs de alta calidad, y con un precio muy razonable. La opción básica que ofrecen, mas que suficiente para los requisitos de nuestra API, cuesta 43,99€ después de añadirle el precio de adquirir un dominio para nuestra API.</w:t>
       </w:r>
     </w:p>
     <w:p>
@@ -6043,7 +5415,7 @@
           <w:sz w:val="20"/>
           <w:szCs w:val="20"/>
         </w:rPr>
-        <w:t>Respecto a las horas trabajadas, asumiremos un coste de 25€ la hora trabajada, tomando como referencia el salario base que se ofrece actualmente por entrar a trabajar en una gran consultora (18.000€). Así, con una sencilla multiplicación llegamos a la cifra de 1.375€, que se puede redondear a 1.500€ asumiendo la alta posibilidad de tener que realizar algún trabajo no previsto, como puede ser por ejemplo la redacción de este documento, que podría corresponderse con la documentación necesaria para cualquier proyecto serio.</w:t>
+        <w:t>Respecto a las horas trabajadas, asumiremos un coste de 25€ la hora trabajada, tomando como referencia el salario base que se ofrece actualmente por entrar a trabajar en una gran consultora como junior (18.000€). Así, con una sencilla multiplicación llegamos a la cifra de 1.375€, que se puede redondear a 1.500€ asumiendo la alta posibilidad de tener que realizar algún trabajo no previsto, como puede ser por ejemplo la redacción de este documento, que podría corresponderse con la documentación necesaria para cualquier proyecto serio.</w:t>
       </w:r>
     </w:p>
     <w:p>
@@ -6067,118 +5439,7 @@
           <w:sz w:val="20"/>
           <w:szCs w:val="20"/>
         </w:rPr>
-        <w:t>»SUMA«</w:t>
-      </w:r>
-    </w:p>
-    <w:p>
-      <w:pPr>
-        <w:pStyle w:val="Normal"/>
-        <w:ind w:firstLine="142" w:left="0"/>
-        <w:jc w:val="both"/>
-        <w:rPr>
-          <w:i/>
-          <w:i/>
-          <w:color w:val="FF0000"/>
-          <w:sz w:val="20"/>
-          <w:szCs w:val="20"/>
-          <w:lang w:val="gl-ES"/>
-        </w:rPr>
-      </w:pPr>
-      <w:r>
-        <w:rPr>
-          <w:i/>
-          <w:color w:val="FF0000"/>
-          <w:sz w:val="20"/>
-          <w:szCs w:val="20"/>
-          <w:lang w:val="gl-ES"/>
-        </w:rPr>
-        <w:t xml:space="preserve">&lt; </w:t>
-      </w:r>
-    </w:p>
-    <w:p>
-      <w:pPr>
-        <w:pStyle w:val="Normal"/>
-        <w:ind w:firstLine="142" w:left="0"/>
-        <w:jc w:val="both"/>
-        <w:rPr>
-          <w:color w:val="FF0000"/>
-          <w:sz w:val="20"/>
-          <w:szCs w:val="20"/>
-          <w:lang w:val="gl-ES"/>
-        </w:rPr>
-      </w:pPr>
-      <w:r>
-        <w:rPr>
-          <w:color w:val="FF0000"/>
-          <w:sz w:val="20"/>
-          <w:szCs w:val="20"/>
-          <w:lang w:val="gl-ES"/>
-        </w:rPr>
-        <w:t>CA 3.7. Fíxose a valoración económica que dea resposta ás condicións da execución.</w:t>
-      </w:r>
-    </w:p>
-    <w:p>
-      <w:pPr>
-        <w:pStyle w:val="Normal"/>
-        <w:ind w:firstLine="142" w:left="0"/>
-        <w:jc w:val="both"/>
-        <w:rPr>
-          <w:color w:val="FF0000"/>
-          <w:sz w:val="20"/>
-          <w:szCs w:val="20"/>
-          <w:lang w:val="gl-ES"/>
-        </w:rPr>
-      </w:pPr>
-      <w:r>
-        <w:rPr>
-          <w:color w:val="FF0000"/>
-          <w:sz w:val="20"/>
-          <w:szCs w:val="20"/>
-          <w:lang w:val="gl-ES"/>
-        </w:rPr>
-        <w:t>CA 2.6. Realizouse o orzamento correspondente.</w:t>
-      </w:r>
-    </w:p>
-    <w:p>
-      <w:pPr>
-        <w:pStyle w:val="Normal"/>
-        <w:ind w:firstLine="142" w:left="0"/>
-        <w:jc w:val="both"/>
-        <w:rPr>
-          <w:i/>
-          <w:i/>
-          <w:color w:val="FF0000"/>
-          <w:sz w:val="20"/>
-          <w:szCs w:val="20"/>
-          <w:lang w:val="gl-ES"/>
-        </w:rPr>
-      </w:pPr>
-      <w:r>
-        <w:rPr>
-          <w:i/>
-          <w:color w:val="FF0000"/>
-          <w:sz w:val="20"/>
-          <w:szCs w:val="20"/>
-          <w:lang w:val="gl-ES"/>
-        </w:rPr>
-        <w:t>&gt;</w:t>
-      </w:r>
-    </w:p>
-    <w:p>
-      <w:pPr>
-        <w:pStyle w:val="Normal"/>
-        <w:ind w:hanging="0" w:left="0"/>
-        <w:rPr>
-          <w:i/>
-          <w:i/>
-          <w:color w:val="FF0000"/>
-        </w:rPr>
-      </w:pPr>
-      <w:r>
-        <w:rPr>
-          <w:i/>
-          <w:color w:val="FF0000"/>
-        </w:rPr>
+        <w:t>Así, el coste total del proyecto asciende a 1543,99€.</w:t>
       </w:r>
     </w:p>
     <w:p>
@@ -6256,62 +5517,7 @@
     <w:p>
       <w:pPr>
         <w:pStyle w:val="Normal"/>
-        <w:ind w:firstLine="567" w:left="0"/>
-        <w:rPr>
-          <w:b/>
-          <w:bCs/>
-          <w:color w:val="FF3333"/>
-        </w:rPr>
-      </w:pPr>
-      <w:r>
-        <w:rPr>
-          <w:b/>
-          <w:bCs/>
-          <w:color w:val="FF3333"/>
-        </w:rPr>
-      </w:r>
-    </w:p>
-    <w:p>
-      <w:pPr>
-        <w:pStyle w:val="Normal"/>
-        <w:ind w:firstLine="567" w:left="0"/>
-        <w:jc w:val="both"/>
-        <w:rPr>
-          <w:b/>
-          <w:bCs/>
-          <w:color w:val="auto"/>
-        </w:rPr>
-      </w:pPr>
-      <w:r>
-        <w:rPr>
-          <w:b/>
-          <w:bCs/>
-          <w:color w:val="auto"/>
-        </w:rPr>
-      </w:r>
-    </w:p>
-    <w:p>
-      <w:pPr>
-        <w:pStyle w:val="Normal"/>
         <w:ind w:hanging="0" w:left="0"/>
-        <w:jc w:val="both"/>
-        <w:rPr/>
-      </w:pPr>
-      <w:r>
-        <w:rPr>
-          <w:color w:val="FF3333"/>
-          <w:sz w:val="20"/>
-          <w:szCs w:val="20"/>
-          <w:lang w:val="gl-ES"/>
-        </w:rPr>
-        <w:t>O alumnado realizará finalmente, unha demostración do funcionamento do proxecto.</w:t>
-      </w:r>
-    </w:p>
-    <w:p>
-      <w:pPr>
-        <w:pStyle w:val="Normal"/>
-        <w:ind w:hanging="0" w:left="0"/>
-        <w:jc w:val="both"/>
         <w:rPr>
           <w:b/>
           <w:bCs/>
@@ -6661,6 +5867,143 @@
   <w:abstractNum w:abstractNumId="3">
     <w:lvl w:ilvl="0">
       <w:start w:val="1"/>
+      <w:numFmt w:val="bullet"/>
+      <w:lvlText w:val=""/>
+      <w:lvlJc w:val="left"/>
+      <w:pPr>
+        <w:tabs>
+          <w:tab w:val="num" w:pos="720"/>
+        </w:tabs>
+        <w:ind w:left="720" w:hanging="360"/>
+      </w:pPr>
+      <w:rPr>
+        <w:rFonts w:ascii="Symbol" w:hAnsi="Symbol" w:cs="Symbol" w:hint="default"/>
+      </w:rPr>
+    </w:lvl>
+    <w:lvl w:ilvl="1">
+      <w:start w:val="1"/>
+      <w:numFmt w:val="bullet"/>
+      <w:lvlText w:val="◦"/>
+      <w:lvlJc w:val="left"/>
+      <w:pPr>
+        <w:tabs>
+          <w:tab w:val="num" w:pos="1080"/>
+        </w:tabs>
+        <w:ind w:left="1080" w:hanging="360"/>
+      </w:pPr>
+      <w:rPr>
+        <w:rFonts w:ascii="OpenSymbol" w:hAnsi="OpenSymbol" w:cs="OpenSymbol" w:hint="default"/>
+      </w:rPr>
+    </w:lvl>
+    <w:lvl w:ilvl="2">
+      <w:start w:val="1"/>
+      <w:numFmt w:val="bullet"/>
+      <w:lvlText w:val="▪"/>
+      <w:lvlJc w:val="left"/>
+      <w:pPr>
+        <w:tabs>
+          <w:tab w:val="num" w:pos="1440"/>
+        </w:tabs>
+        <w:ind w:left="1440" w:hanging="360"/>
+      </w:pPr>
+      <w:rPr>
+        <w:rFonts w:ascii="OpenSymbol" w:hAnsi="OpenSymbol" w:cs="OpenSymbol" w:hint="default"/>
+      </w:rPr>
+    </w:lvl>
+    <w:lvl w:ilvl="3">
+      <w:start w:val="1"/>
+      <w:numFmt w:val="bullet"/>
+      <w:lvlText w:val=""/>
+      <w:lvlJc w:val="left"/>
+      <w:pPr>
+        <w:tabs>
+          <w:tab w:val="num" w:pos="1800"/>
+        </w:tabs>
+        <w:ind w:left="1800" w:hanging="360"/>
+      </w:pPr>
+      <w:rPr>
+        <w:rFonts w:ascii="Symbol" w:hAnsi="Symbol" w:cs="Symbol" w:hint="default"/>
+      </w:rPr>
+    </w:lvl>
+    <w:lvl w:ilvl="4">
+      <w:start w:val="1"/>
+      <w:numFmt w:val="bullet"/>
+      <w:lvlText w:val="◦"/>
+      <w:lvlJc w:val="left"/>
+      <w:pPr>
+        <w:tabs>
+          <w:tab w:val="num" w:pos="2160"/>
+        </w:tabs>
+        <w:ind w:left="2160" w:hanging="360"/>
+      </w:pPr>
+      <w:rPr>
+        <w:rFonts w:ascii="OpenSymbol" w:hAnsi="OpenSymbol" w:cs="OpenSymbol" w:hint="default"/>
+      </w:rPr>
+    </w:lvl>
+    <w:lvl w:ilvl="5">
+      <w:start w:val="1"/>
+      <w:numFmt w:val="bullet"/>
+      <w:lvlText w:val="▪"/>
+      <w:lvlJc w:val="left"/>
+      <w:pPr>
+        <w:tabs>
+          <w:tab w:val="num" w:pos="2520"/>
+        </w:tabs>
+        <w:ind w:left="2520" w:hanging="360"/>
+      </w:pPr>
+      <w:rPr>
+        <w:rFonts w:ascii="OpenSymbol" w:hAnsi="OpenSymbol" w:cs="OpenSymbol" w:hint="default"/>
+      </w:rPr>
+    </w:lvl>
+    <w:lvl w:ilvl="6">
+      <w:start w:val="1"/>
+      <w:numFmt w:val="bullet"/>
+      <w:lvlText w:val=""/>
+      <w:lvlJc w:val="left"/>
+      <w:pPr>
+        <w:tabs>
+          <w:tab w:val="num" w:pos="2880"/>
+        </w:tabs>
+        <w:ind w:left="2880" w:hanging="360"/>
+      </w:pPr>
+      <w:rPr>
+        <w:rFonts w:ascii="Symbol" w:hAnsi="Symbol" w:cs="Symbol" w:hint="default"/>
+      </w:rPr>
+    </w:lvl>
+    <w:lvl w:ilvl="7">
+      <w:start w:val="1"/>
+      <w:numFmt w:val="bullet"/>
+      <w:lvlText w:val="◦"/>
+      <w:lvlJc w:val="left"/>
+      <w:pPr>
+        <w:tabs>
+          <w:tab w:val="num" w:pos="3240"/>
+        </w:tabs>
+        <w:ind w:left="3240" w:hanging="360"/>
+      </w:pPr>
+      <w:rPr>
+        <w:rFonts w:ascii="OpenSymbol" w:hAnsi="OpenSymbol" w:cs="OpenSymbol" w:hint="default"/>
+      </w:rPr>
+    </w:lvl>
+    <w:lvl w:ilvl="8">
+      <w:start w:val="1"/>
+      <w:numFmt w:val="bullet"/>
+      <w:lvlText w:val="▪"/>
+      <w:lvlJc w:val="left"/>
+      <w:pPr>
+        <w:tabs>
+          <w:tab w:val="num" w:pos="3600"/>
+        </w:tabs>
+        <w:ind w:left="3600" w:hanging="360"/>
+      </w:pPr>
+      <w:rPr>
+        <w:rFonts w:ascii="OpenSymbol" w:hAnsi="OpenSymbol" w:cs="OpenSymbol" w:hint="default"/>
+      </w:rPr>
+    </w:lvl>
+  </w:abstractNum>
+  <w:abstractNum w:abstractNumId="4">
+    <w:lvl w:ilvl="0">
+      <w:start w:val="1"/>
       <w:numFmt w:val="none"/>
       <w:suff w:val="nothing"/>
       <w:lvlText w:val=""/>
@@ -6785,6 +6128,9 @@
   </w:num>
   <w:num w:numId="3">
     <w:abstractNumId w:val="3"/>
+  </w:num>
+  <w:num w:numId="4">
+    <w:abstractNumId w:val="4"/>
   </w:num>
 </w:numbering>
 </file>
@@ -7638,6 +6984,13 @@
     <w:qFormat/>
     <w:rPr/>
   </w:style>
+  <w:style w:type="character" w:styleId="Bolos">
+    <w:name w:val="Bolos"/>
+    <w:qFormat/>
+    <w:rPr>
+      <w:rFonts w:ascii="OpenSymbol" w:hAnsi="OpenSymbol" w:eastAsia="OpenSymbol" w:cs="OpenSymbol"/>
+    </w:rPr>
+  </w:style>
   <w:style w:type="paragraph" w:styleId="Ttulo">
     <w:name w:val="Título"/>
     <w:basedOn w:val="Normal"/>

</xml_diff>

<commit_message>
Correciones menores en la memoria
</commit_message>
<xml_diff>
--- a/Documentos/Memoria.docx
+++ b/Documentos/Memoria.docx
@@ -944,7 +944,7 @@
             <w:pPr>
               <w:pStyle w:val="Normal"/>
               <w:suppressAutoHyphens w:val="false"/>
-              <w:overflowPunct w:val="false"/>
+              <w:overflowPunct w:val="true"/>
               <w:spacing w:before="0" w:after="0"/>
               <w:ind w:hanging="0" w:left="0"/>
               <w:rPr>
@@ -1964,6 +1964,187 @@
         </w:rPr>
       </w:r>
     </w:p>
+    <w:tbl>
+      <w:tblPr>
+        <w:tblW w:w="8931" w:type="dxa"/>
+        <w:jc w:val="left"/>
+        <w:tblInd w:w="-5" w:type="dxa"/>
+        <w:tblLayout w:type="fixed"/>
+        <w:tblCellMar>
+          <w:top w:w="0" w:type="dxa"/>
+          <w:left w:w="93" w:type="dxa"/>
+          <w:bottom w:w="0" w:type="dxa"/>
+          <w:right w:w="108" w:type="dxa"/>
+        </w:tblCellMar>
+        <w:tblLook w:firstRow="1" w:noVBand="1" w:lastRow="0" w:firstColumn="1" w:lastColumn="0" w:noHBand="0" w:val="04a0"/>
+      </w:tblPr>
+      <w:tblGrid>
+        <w:gridCol w:w="1291"/>
+        <w:gridCol w:w="1257"/>
+        <w:gridCol w:w="6383"/>
+      </w:tblGrid>
+      <w:tr>
+        <w:trPr/>
+        <w:tc>
+          <w:tcPr>
+            <w:tcW w:w="1291" w:type="dxa"/>
+            <w:tcBorders>
+              <w:top w:val="single" w:sz="4" w:space="0" w:color="365F91"/>
+              <w:left w:val="single" w:sz="4" w:space="0" w:color="365F91"/>
+              <w:bottom w:val="single" w:sz="4" w:space="0" w:color="365F91"/>
+            </w:tcBorders>
+          </w:tcPr>
+          <w:p>
+            <w:pPr>
+              <w:pStyle w:val="Normal"/>
+              <w:widowControl w:val="false"/>
+              <w:spacing w:before="0" w:after="0"/>
+              <w:ind w:firstLine="283" w:left="52" w:right="-20"/>
+              <w:jc w:val="center"/>
+              <w:rPr>
+                <w:rFonts w:cs="Arial"/>
+                <w:b/>
+                <w:bCs/>
+                <w:color w:val="365F91"/>
+                <w:spacing w:val="1"/>
+                <w:w w:val="81"/>
+                <w:szCs w:val="16"/>
+                <w:lang w:val="gl-ES"/>
+              </w:rPr>
+            </w:pPr>
+            <w:r>
+              <w:rPr>
+                <w:rFonts w:cs="Arial"/>
+                <w:b/>
+                <w:bCs/>
+                <w:color w:val="365F91"/>
+                <w:spacing w:val="1"/>
+                <w:w w:val="81"/>
+                <w:szCs w:val="16"/>
+                <w:lang w:val="gl-ES"/>
+              </w:rPr>
+              <w:t>2</w:t>
+            </w:r>
+          </w:p>
+        </w:tc>
+        <w:tc>
+          <w:tcPr>
+            <w:tcW w:w="1257" w:type="dxa"/>
+            <w:tcBorders>
+              <w:top w:val="single" w:sz="4" w:space="0" w:color="365F91"/>
+              <w:left w:val="single" w:sz="4" w:space="0" w:color="365F91"/>
+              <w:bottom w:val="single" w:sz="4" w:space="0" w:color="365F91"/>
+            </w:tcBorders>
+          </w:tcPr>
+          <w:p>
+            <w:pPr>
+              <w:pStyle w:val="Normal"/>
+              <w:widowControl w:val="false"/>
+              <w:spacing w:before="0" w:after="0"/>
+              <w:ind w:hanging="0" w:left="52" w:right="-20"/>
+              <w:jc w:val="center"/>
+              <w:rPr>
+                <w:rFonts w:cs="Arial"/>
+                <w:b/>
+                <w:bCs/>
+                <w:spacing w:val="1"/>
+                <w:w w:val="81"/>
+                <w:szCs w:val="16"/>
+                <w:lang w:val="gl-ES"/>
+              </w:rPr>
+            </w:pPr>
+            <w:r>
+              <w:rPr>
+                <w:rFonts w:cs="Arial"/>
+                <w:b/>
+                <w:bCs/>
+                <w:spacing w:val="1"/>
+                <w:w w:val="81"/>
+                <w:szCs w:val="16"/>
+                <w:lang w:val="gl-ES"/>
+              </w:rPr>
+              <w:t>11</w:t>
+            </w:r>
+            <w:r>
+              <w:rPr>
+                <w:rFonts w:cs="Arial"/>
+                <w:b/>
+                <w:bCs/>
+                <w:spacing w:val="1"/>
+                <w:w w:val="81"/>
+                <w:szCs w:val="16"/>
+                <w:lang w:val="gl-ES"/>
+              </w:rPr>
+              <w:t>/0</w:t>
+            </w:r>
+            <w:r>
+              <w:rPr>
+                <w:rFonts w:cs="Arial"/>
+                <w:b/>
+                <w:bCs/>
+                <w:spacing w:val="1"/>
+                <w:w w:val="81"/>
+                <w:szCs w:val="16"/>
+                <w:lang w:val="gl-ES"/>
+              </w:rPr>
+              <w:t>4</w:t>
+            </w:r>
+            <w:r>
+              <w:rPr>
+                <w:rFonts w:cs="Arial"/>
+                <w:b/>
+                <w:bCs/>
+                <w:spacing w:val="1"/>
+                <w:w w:val="81"/>
+                <w:szCs w:val="16"/>
+                <w:lang w:val="gl-ES"/>
+              </w:rPr>
+              <w:t>/26</w:t>
+            </w:r>
+          </w:p>
+        </w:tc>
+        <w:tc>
+          <w:tcPr>
+            <w:tcW w:w="6383" w:type="dxa"/>
+            <w:tcBorders>
+              <w:top w:val="single" w:sz="4" w:space="0" w:color="365F91"/>
+              <w:left w:val="single" w:sz="4" w:space="0" w:color="365F91"/>
+              <w:bottom w:val="single" w:sz="4" w:space="0" w:color="365F91"/>
+              <w:right w:val="single" w:sz="4" w:space="0" w:color="365F91"/>
+            </w:tcBorders>
+          </w:tcPr>
+          <w:p>
+            <w:pPr>
+              <w:pStyle w:val="Normal"/>
+              <w:widowControl w:val="false"/>
+              <w:spacing w:before="0" w:after="0"/>
+              <w:ind w:firstLine="283" w:left="52" w:right="-20"/>
+              <w:jc w:val="center"/>
+              <w:rPr>
+                <w:rFonts w:cs="Arial"/>
+                <w:b/>
+                <w:bCs/>
+                <w:spacing w:val="1"/>
+                <w:w w:val="81"/>
+                <w:szCs w:val="16"/>
+                <w:lang w:val="gl-ES"/>
+              </w:rPr>
+            </w:pPr>
+            <w:r>
+              <w:rPr>
+                <w:rFonts w:cs="Arial"/>
+                <w:b/>
+                <w:bCs/>
+                <w:spacing w:val="1"/>
+                <w:w w:val="81"/>
+                <w:szCs w:val="16"/>
+                <w:lang w:val="gl-ES"/>
+              </w:rPr>
+            </w:r>
+          </w:p>
+        </w:tc>
+      </w:tr>
+    </w:tbl>
     <w:p>
       <w:pPr>
         <w:pStyle w:val="Normal"/>
@@ -2638,7 +2819,7 @@
         <w:pStyle w:val="Normal"/>
         <w:widowControl/>
         <w:suppressAutoHyphens w:val="true"/>
-        <w:overflowPunct w:val="true"/>
+        <w:overflowPunct w:val="false"/>
         <w:bidi w:val="0"/>
         <w:spacing w:before="0" w:after="120"/>
         <w:ind w:firstLine="283" w:left="907"/>
@@ -4809,11 +4990,8 @@
       </w:pPr>
       <w:r>
         <w:rPr>
-          <w:b/>
-          <w:bCs/>
-          <w:i w:val="false"/>
-          <w:iCs w:val="false"/>
-          <w:color w:val="000000"/>
+          <w:i/>
+          <w:color w:val="FF0000"/>
           <w:sz w:val="20"/>
           <w:szCs w:val="20"/>
           <w:lang w:val="gl-ES"/>
@@ -4949,7 +5127,16 @@
         </w:rPr>
       </w:pPr>
       <w:r>
-        <w:rPr/>
+        <w:rPr>
+          <w:b w:val="false"/>
+          <w:bCs w:val="false"/>
+          <w:i w:val="false"/>
+          <w:iCs w:val="false"/>
+          <w:color w:val="000000"/>
+          <w:sz w:val="20"/>
+          <w:szCs w:val="20"/>
+          <w:lang w:val="gl-ES"/>
+        </w:rPr>
         <w:drawing>
           <wp:anchor behindDoc="0" distT="0" distB="0" distL="0" distR="0" simplePos="0" locked="0" layoutInCell="0" allowOverlap="1" relativeHeight="5">
             <wp:simplePos x="0" y="0"/>
@@ -6537,7 +6724,7 @@
     <w:pPr>
       <w:widowControl/>
       <w:suppressAutoHyphens w:val="true"/>
-      <w:overflowPunct w:val="true"/>
+      <w:overflowPunct w:val="false"/>
       <w:bidi w:val="0"/>
       <w:spacing w:before="0" w:after="120"/>
       <w:ind w:firstLine="283" w:left="907"/>
@@ -7465,7 +7652,7 @@
         <w:tab w:val="clear" w:pos="907"/>
       </w:tabs>
       <w:suppressAutoHyphens w:val="false"/>
-      <w:overflowPunct w:val="false"/>
+      <w:overflowPunct w:val="true"/>
       <w:spacing w:lineRule="auto" w:line="259" w:before="240" w:after="0"/>
       <w:outlineLvl w:val="9"/>
     </w:pPr>
@@ -7488,7 +7675,7 @@
     <w:rsid w:val="003d528a"/>
     <w:pPr>
       <w:suppressAutoHyphens w:val="false"/>
-      <w:overflowPunct w:val="false"/>
+      <w:overflowPunct w:val="true"/>
       <w:spacing w:lineRule="auto" w:line="259" w:before="0" w:after="100"/>
       <w:ind w:hanging="0" w:left="220"/>
     </w:pPr>
@@ -7510,7 +7697,7 @@
     <w:rsid w:val="003d528a"/>
     <w:pPr>
       <w:suppressAutoHyphens w:val="false"/>
-      <w:overflowPunct w:val="false"/>
+      <w:overflowPunct w:val="true"/>
       <w:spacing w:lineRule="auto" w:line="259" w:before="0" w:after="100"/>
       <w:ind w:hanging="0" w:left="440"/>
     </w:pPr>
@@ -7538,6 +7725,19 @@
       <w:rFonts w:ascii="Tahoma" w:hAnsi="Tahoma" w:cs="Tahoma"/>
       <w:sz w:val="16"/>
       <w:szCs w:val="16"/>
+    </w:rPr>
+  </w:style>
+  <w:style w:type="paragraph" w:styleId="Ttulodelatabla">
+    <w:name w:val="Título de la tabla"/>
+    <w:basedOn w:val="Contenidodelatabla"/>
+    <w:qFormat/>
+    <w:pPr>
+      <w:suppressLineNumbers/>
+      <w:jc w:val="center"/>
+    </w:pPr>
+    <w:rPr>
+      <w:b/>
+      <w:bCs/>
     </w:rPr>
   </w:style>
   <w:style w:type="numbering" w:styleId="NoList" w:default="1">

</xml_diff>

<commit_message>
Actualizada la memoria del proyecto
</commit_message>
<xml_diff>
--- a/Documentos/Memoria.docx
+++ b/Documentos/Memoria.docx
@@ -944,7 +944,7 @@
             <w:pPr>
               <w:pStyle w:val="Normal"/>
               <w:suppressAutoHyphens w:val="false"/>
-              <w:overflowPunct w:val="true"/>
+              <w:overflowPunct w:val="false"/>
               <w:spacing w:before="0" w:after="0"/>
               <w:ind w:hanging="0" w:left="0"/>
               <w:rPr>
@@ -1641,6 +1641,42 @@
     <w:p>
       <w:pPr>
         <w:pStyle w:val="Normal"/>
+        <w:ind w:hanging="0" w:left="3540"/>
+        <w:rPr>
+          <w:rFonts w:ascii="Arial" w:hAnsi="Arial" w:eastAsia="Arial" w:cs="Arial"/>
+          <w:sz w:val="16"/>
+          <w:szCs w:val="16"/>
+        </w:rPr>
+      </w:pPr>
+      <w:r>
+        <w:rPr>
+          <w:rFonts w:eastAsia="Arial" w:cs="Arial" w:ascii="Arial" w:hAnsi="Arial"/>
+          <w:sz w:val="16"/>
+          <w:szCs w:val="16"/>
+        </w:rPr>
+      </w:r>
+    </w:p>
+    <w:p>
+      <w:pPr>
+        <w:pStyle w:val="Normal"/>
+        <w:ind w:hanging="0" w:left="3540"/>
+        <w:rPr>
+          <w:rFonts w:ascii="Arial" w:hAnsi="Arial" w:eastAsia="Arial" w:cs="Arial"/>
+          <w:sz w:val="16"/>
+          <w:szCs w:val="16"/>
+        </w:rPr>
+      </w:pPr>
+      <w:r>
+        <w:rPr>
+          <w:rFonts w:eastAsia="Arial" w:cs="Arial" w:ascii="Arial" w:hAnsi="Arial"/>
+          <w:sz w:val="16"/>
+          <w:szCs w:val="16"/>
+        </w:rPr>
+      </w:r>
+    </w:p>
+    <w:p>
+      <w:pPr>
+        <w:pStyle w:val="Normal"/>
         <w:widowControl w:val="false"/>
         <w:spacing w:before="360" w:after="120"/>
         <w:ind w:hanging="0" w:left="0" w:right="-23"/>
@@ -2063,9 +2099,27 @@
                 <w:szCs w:val="16"/>
                 <w:lang w:val="gl-ES"/>
               </w:rPr>
-              <w:t>11</w:t>
+              <w:t>11/04/26</w:t>
             </w:r>
-            <w:r>
+          </w:p>
+        </w:tc>
+        <w:tc>
+          <w:tcPr>
+            <w:tcW w:w="6383" w:type="dxa"/>
+            <w:tcBorders>
+              <w:top w:val="single" w:sz="4" w:space="0" w:color="365F91"/>
+              <w:left w:val="single" w:sz="4" w:space="0" w:color="365F91"/>
+              <w:bottom w:val="single" w:sz="4" w:space="0" w:color="365F91"/>
+              <w:right w:val="single" w:sz="4" w:space="0" w:color="365F91"/>
+            </w:tcBorders>
+          </w:tcPr>
+          <w:p>
+            <w:pPr>
+              <w:pStyle w:val="Normal"/>
+              <w:widowControl w:val="false"/>
+              <w:spacing w:before="0" w:after="0"/>
+              <w:ind w:firstLine="283" w:left="52" w:right="-20"/>
+              <w:jc w:val="center"/>
               <w:rPr>
                 <w:rFonts w:cs="Arial"/>
                 <w:b/>
@@ -2075,8 +2129,7 @@
                 <w:szCs w:val="16"/>
                 <w:lang w:val="gl-ES"/>
               </w:rPr>
-              <w:t>/0</w:t>
-            </w:r>
+            </w:pPr>
             <w:r>
               <w:rPr>
                 <w:rFonts w:cs="Arial"/>
@@ -2087,7 +2140,147 @@
                 <w:szCs w:val="16"/>
                 <w:lang w:val="gl-ES"/>
               </w:rPr>
-              <w:t>4</w:t>
+            </w:r>
+          </w:p>
+        </w:tc>
+      </w:tr>
+    </w:tbl>
+    <w:tbl>
+      <w:tblPr>
+        <w:tblW w:w="8931" w:type="dxa"/>
+        <w:jc w:val="left"/>
+        <w:tblInd w:w="-5" w:type="dxa"/>
+        <w:tblLayout w:type="fixed"/>
+        <w:tblCellMar>
+          <w:top w:w="0" w:type="dxa"/>
+          <w:left w:w="93" w:type="dxa"/>
+          <w:bottom w:w="0" w:type="dxa"/>
+          <w:right w:w="108" w:type="dxa"/>
+        </w:tblCellMar>
+        <w:tblLook w:firstRow="1" w:noVBand="1" w:lastRow="0" w:firstColumn="1" w:lastColumn="0" w:noHBand="0" w:val="04a0"/>
+      </w:tblPr>
+      <w:tblGrid>
+        <w:gridCol w:w="1291"/>
+        <w:gridCol w:w="1257"/>
+        <w:gridCol w:w="6383"/>
+      </w:tblGrid>
+      <w:tr>
+        <w:trPr/>
+        <w:tc>
+          <w:tcPr>
+            <w:tcW w:w="1291" w:type="dxa"/>
+            <w:tcBorders>
+              <w:top w:val="single" w:sz="4" w:space="0" w:color="365F91"/>
+              <w:left w:val="single" w:sz="4" w:space="0" w:color="365F91"/>
+              <w:bottom w:val="single" w:sz="4" w:space="0" w:color="365F91"/>
+            </w:tcBorders>
+          </w:tcPr>
+          <w:p>
+            <w:pPr>
+              <w:pStyle w:val="Normal"/>
+              <w:widowControl w:val="false"/>
+              <w:spacing w:before="0" w:after="0"/>
+              <w:ind w:firstLine="283" w:left="52" w:right="-20"/>
+              <w:jc w:val="center"/>
+              <w:rPr>
+                <w:rFonts w:cs="Arial"/>
+                <w:b/>
+                <w:bCs/>
+                <w:color w:val="365F91"/>
+                <w:spacing w:val="1"/>
+                <w:w w:val="81"/>
+                <w:szCs w:val="16"/>
+                <w:lang w:val="gl-ES"/>
+              </w:rPr>
+            </w:pPr>
+            <w:r>
+              <w:rPr>
+                <w:rFonts w:cs="Arial"/>
+                <w:b/>
+                <w:bCs/>
+                <w:color w:val="365F91"/>
+                <w:spacing w:val="1"/>
+                <w:w w:val="81"/>
+                <w:szCs w:val="16"/>
+                <w:lang w:val="gl-ES"/>
+              </w:rPr>
+              <w:t>3</w:t>
+            </w:r>
+          </w:p>
+        </w:tc>
+        <w:tc>
+          <w:tcPr>
+            <w:tcW w:w="1257" w:type="dxa"/>
+            <w:tcBorders>
+              <w:top w:val="single" w:sz="4" w:space="0" w:color="365F91"/>
+              <w:left w:val="single" w:sz="4" w:space="0" w:color="365F91"/>
+              <w:bottom w:val="single" w:sz="4" w:space="0" w:color="365F91"/>
+            </w:tcBorders>
+          </w:tcPr>
+          <w:p>
+            <w:pPr>
+              <w:pStyle w:val="Normal"/>
+              <w:widowControl w:val="false"/>
+              <w:spacing w:before="0" w:after="0"/>
+              <w:ind w:hanging="0" w:left="52" w:right="-20"/>
+              <w:jc w:val="center"/>
+              <w:rPr>
+                <w:rFonts w:cs="Arial"/>
+                <w:b/>
+                <w:bCs/>
+                <w:spacing w:val="1"/>
+                <w:w w:val="81"/>
+                <w:szCs w:val="16"/>
+                <w:lang w:val="gl-ES"/>
+              </w:rPr>
+            </w:pPr>
+            <w:r>
+              <w:rPr>
+                <w:rFonts w:cs="Arial"/>
+                <w:b/>
+                <w:bCs/>
+                <w:spacing w:val="1"/>
+                <w:w w:val="81"/>
+                <w:szCs w:val="16"/>
+                <w:lang w:val="gl-ES"/>
+              </w:rPr>
+              <w:t>1</w:t>
+            </w:r>
+            <w:r>
+              <w:rPr>
+                <w:rFonts w:cs="Arial"/>
+                <w:b/>
+                <w:bCs/>
+                <w:spacing w:val="1"/>
+                <w:w w:val="81"/>
+                <w:szCs w:val="16"/>
+                <w:lang w:val="gl-ES"/>
+              </w:rPr>
+              <w:t>3</w:t>
+            </w:r>
+            <w:r>
+              <w:rPr>
+                <w:rFonts w:cs="Arial"/>
+                <w:b/>
+                <w:bCs/>
+                <w:spacing w:val="1"/>
+                <w:w w:val="81"/>
+                <w:szCs w:val="16"/>
+                <w:lang w:val="gl-ES"/>
+              </w:rPr>
+              <w:t>/0</w:t>
+            </w:r>
+            <w:r>
+              <w:rPr>
+                <w:rFonts w:cs="Arial"/>
+                <w:b/>
+                <w:bCs/>
+                <w:spacing w:val="1"/>
+                <w:w w:val="81"/>
+                <w:szCs w:val="16"/>
+                <w:lang w:val="gl-ES"/>
+              </w:rPr>
+              <w:t>5</w:t>
             </w:r>
             <w:r>
               <w:rPr>
@@ -2248,37 +2441,18 @@
             </w:r>
             <w:r>
               <w:rPr>
-                <w:webHidden/>
-              </w:rPr>
-              <w:fldChar w:fldCharType="begin"/>
-            </w:r>
-            <w:r>
-              <w:rPr>
-                <w:webHidden/>
-              </w:rPr>
-              <w:instrText xml:space="preserve">PAGEREF _Toc65582858 \h</w:instrText>
-            </w:r>
-            <w:r>
-              <w:rPr>
-                <w:webHidden/>
-              </w:rPr>
-              <w:fldChar w:fldCharType="separate"/>
-            </w:r>
-            <w:r>
-              <w:rPr>
                 <w:rStyle w:val="Enlacedelndice"/>
                 <w:vanish w:val="false"/>
               </w:rPr>
               <w:tab/>
-              <w:t>3</w:t>
-            </w:r>
-            <w:r>
-              <w:rPr>
-                <w:webHidden/>
-              </w:rPr>
-              <w:fldChar w:fldCharType="end"/>
             </w:r>
           </w:hyperlink>
+          <w:r>
+            <w:rPr>
+              <w:vanish w:val="false"/>
+            </w:rPr>
+            <w:t>3</w:t>
+          </w:r>
         </w:p>
         <w:p>
           <w:pPr>
@@ -2398,6 +2572,13 @@
             </w:r>
             <w:r>
               <w:rPr>
+                <w:rStyle w:val="Enlacedelndice"/>
+                <w:vanish w:val="false"/>
+              </w:rPr>
+              <w:tab/>
+            </w:r>
+            <w:r>
+              <w:rPr>
                 <w:webHidden/>
               </w:rPr>
               <w:fldChar w:fldCharType="begin"/>
@@ -2419,8 +2600,7 @@
                 <w:rStyle w:val="Enlacedelndice"/>
                 <w:vanish w:val="false"/>
               </w:rPr>
-              <w:tab/>
-              <w:t>4</w:t>
+              <w:t>7</w:t>
             </w:r>
             <w:r>
               <w:rPr>
@@ -2473,6 +2653,13 @@
             </w:r>
             <w:r>
               <w:rPr>
+                <w:rStyle w:val="Enlacedelndice"/>
+                <w:vanish w:val="false"/>
+              </w:rPr>
+              <w:tab/>
+            </w:r>
+            <w:r>
+              <w:rPr>
                 <w:webHidden/>
               </w:rPr>
               <w:fldChar w:fldCharType="begin"/>
@@ -2494,8 +2681,7 @@
                 <w:rStyle w:val="Enlacedelndice"/>
                 <w:vanish w:val="false"/>
               </w:rPr>
-              <w:tab/>
-              <w:t>4</w:t>
+              <w:t>8</w:t>
             </w:r>
             <w:r>
               <w:rPr>
@@ -2548,37 +2734,25 @@
             </w:r>
             <w:r>
               <w:rPr>
-                <w:webHidden/>
-              </w:rPr>
-              <w:fldChar w:fldCharType="begin"/>
+                <w:rStyle w:val="Enlacedelndice"/>
+                <w:vanish w:val="false"/>
+              </w:rPr>
+              <w:tab/>
             </w:r>
             <w:r>
               <w:rPr>
-                <w:webHidden/>
-              </w:rPr>
-              <w:instrText xml:space="preserve">PAGEREF _Toc65582862 \h</w:instrText>
-            </w:r>
-            <w:r>
-              <w:rPr>
-                <w:webHidden/>
-              </w:rPr>
-              <w:fldChar w:fldCharType="separate"/>
-            </w:r>
-            <w:r>
-              <w:rPr>
                 <w:rStyle w:val="Enlacedelndice"/>
                 <w:vanish w:val="false"/>
               </w:rPr>
-              <w:tab/>
-              <w:t>4</w:t>
-            </w:r>
-            <w:r>
-              <w:rPr>
-                <w:webHidden/>
-              </w:rPr>
-              <w:fldChar w:fldCharType="end"/>
+              <w:t>1</w:t>
             </w:r>
           </w:hyperlink>
+          <w:r>
+            <w:rPr>
+              <w:vanish w:val="false"/>
+            </w:rPr>
+            <w:t>1</w:t>
+          </w:r>
         </w:p>
         <w:p>
           <w:pPr>
@@ -2623,37 +2797,25 @@
             </w:r>
             <w:r>
               <w:rPr>
-                <w:webHidden/>
-              </w:rPr>
-              <w:fldChar w:fldCharType="begin"/>
+                <w:rStyle w:val="Enlacedelndice"/>
+                <w:vanish w:val="false"/>
+              </w:rPr>
+              <w:tab/>
             </w:r>
             <w:r>
               <w:rPr>
-                <w:webHidden/>
-              </w:rPr>
-              <w:instrText xml:space="preserve">PAGEREF _Toc65582863 \h</w:instrText>
-            </w:r>
-            <w:r>
-              <w:rPr>
-                <w:webHidden/>
-              </w:rPr>
-              <w:fldChar w:fldCharType="separate"/>
-            </w:r>
-            <w:r>
-              <w:rPr>
                 <w:rStyle w:val="Enlacedelndice"/>
                 <w:vanish w:val="false"/>
               </w:rPr>
-              <w:tab/>
-              <w:t>5</w:t>
-            </w:r>
-            <w:r>
-              <w:rPr>
-                <w:webHidden/>
-              </w:rPr>
-              <w:fldChar w:fldCharType="end"/>
+              <w:t>1</w:t>
             </w:r>
           </w:hyperlink>
+          <w:r>
+            <w:rPr>
+              <w:vanish w:val="false"/>
+            </w:rPr>
+            <w:t>1</w:t>
+          </w:r>
         </w:p>
         <w:p>
           <w:pPr>
@@ -2698,37 +2860,25 @@
             </w:r>
             <w:r>
               <w:rPr>
-                <w:webHidden/>
-              </w:rPr>
-              <w:fldChar w:fldCharType="begin"/>
+                <w:rStyle w:val="Enlacedelndice"/>
+                <w:vanish w:val="false"/>
+              </w:rPr>
+              <w:tab/>
             </w:r>
             <w:r>
               <w:rPr>
-                <w:webHidden/>
-              </w:rPr>
-              <w:instrText xml:space="preserve">PAGEREF _Toc65582864 \h</w:instrText>
-            </w:r>
-            <w:r>
-              <w:rPr>
-                <w:webHidden/>
-              </w:rPr>
-              <w:fldChar w:fldCharType="separate"/>
-            </w:r>
-            <w:r>
-              <w:rPr>
                 <w:rStyle w:val="Enlacedelndice"/>
                 <w:vanish w:val="false"/>
               </w:rPr>
-              <w:tab/>
-              <w:t>5</w:t>
-            </w:r>
-            <w:r>
-              <w:rPr>
-                <w:webHidden/>
-              </w:rPr>
-              <w:fldChar w:fldCharType="end"/>
+              <w:t>1</w:t>
             </w:r>
           </w:hyperlink>
+          <w:r>
+            <w:rPr>
+              <w:vanish w:val="false"/>
+            </w:rPr>
+            <w:t>2</w:t>
+          </w:r>
         </w:p>
         <w:p>
           <w:pPr>
@@ -2773,40 +2923,27 @@
             </w:r>
             <w:r>
               <w:rPr>
-                <w:webHidden/>
-              </w:rPr>
-              <w:fldChar w:fldCharType="begin"/>
+                <w:rStyle w:val="Enlacedelndice"/>
+                <w:vanish w:val="false"/>
+              </w:rPr>
+              <w:tab/>
             </w:r>
             <w:r>
               <w:rPr>
-                <w:webHidden/>
-              </w:rPr>
-              <w:instrText xml:space="preserve">PAGEREF _Toc65582865 \h</w:instrText>
-            </w:r>
-            <w:r>
-              <w:rPr>
-                <w:webHidden/>
-              </w:rPr>
-              <w:fldChar w:fldCharType="separate"/>
-            </w:r>
-            <w:r>
-              <w:rPr>
                 <w:rStyle w:val="Enlacedelndice"/>
                 <w:vanish w:val="false"/>
               </w:rPr>
-              <w:tab/>
-              <w:t>5</w:t>
-            </w:r>
-            <w:r>
-              <w:rPr>
-                <w:webHidden/>
-              </w:rPr>
-              <w:fldChar w:fldCharType="end"/>
+              <w:t>1</w:t>
             </w:r>
           </w:hyperlink>
           <w:r>
             <w:rPr>
-              <w:rStyle w:val="Enlacedelndice"/>
+              <w:vanish w:val="false"/>
+            </w:rPr>
+            <w:t>2</w:t>
+          </w:r>
+          <w:r>
+            <w:rPr>
               <w:vanish w:val="false"/>
             </w:rPr>
             <w:fldChar w:fldCharType="end"/>
@@ -2819,7 +2956,7 @@
         <w:pStyle w:val="Normal"/>
         <w:widowControl/>
         <w:suppressAutoHyphens w:val="true"/>
-        <w:overflowPunct w:val="false"/>
+        <w:overflowPunct w:val="true"/>
         <w:bidi w:val="0"/>
         <w:spacing w:before="0" w:after="120"/>
         <w:ind w:firstLine="283" w:left="907"/>
@@ -3667,6 +3804,31 @@
           <w:sz w:val="20"/>
           <w:szCs w:val="20"/>
         </w:rPr>
+        <w:t xml:space="preserve">Todo esto es lo que estimo necesario para que el proyecto pueda cumplir de forma satisfactoria con el objetivo marcado de facilitar la participación en las actividades relacionadas a </w:t>
+      </w:r>
+      <w:r>
+        <w:rPr>
+          <w:b w:val="false"/>
+          <w:bCs w:val="false"/>
+          <w:i/>
+          <w:iCs/>
+          <w:color w:val="auto"/>
+          <w:sz w:val="20"/>
+          <w:szCs w:val="20"/>
+        </w:rPr>
+        <w:t>D&amp;D</w:t>
+      </w:r>
+      <w:r>
+        <w:rPr>
+          <w:b w:val="false"/>
+          <w:bCs w:val="false"/>
+          <w:i w:val="false"/>
+          <w:iCs w:val="false"/>
+          <w:color w:val="auto"/>
+          <w:sz w:val="20"/>
+          <w:szCs w:val="20"/>
+        </w:rPr>
+        <w:t>. Todas estas necesidades están sacadas tras mis propios años de experiencia, pues la frustración de que como jugador no dispongo de una herramienta de estas características es la motivación principal tras la decisión de orientar el proyecto en esa dirección.</w:t>
       </w:r>
     </w:p>
     <w:p>
@@ -3695,31 +3857,1709 @@
           <w:sz w:val="20"/>
           <w:szCs w:val="20"/>
         </w:rPr>
-        <w:t xml:space="preserve">Todo esto es lo que estimo necesario para que el proyecto pueda cumplir de forma satisfactoria con el objetivo marcado de facilitar la participación en las actividades relacionadas a </w:t>
-      </w:r>
-      <w:r>
-        <w:rPr>
-          <w:b w:val="false"/>
-          <w:bCs w:val="false"/>
-          <w:i/>
-          <w:iCs/>
-          <w:color w:val="auto"/>
-          <w:sz w:val="20"/>
-          <w:szCs w:val="20"/>
-        </w:rPr>
-        <w:t>D&amp;D</w:t>
-      </w:r>
-      <w:r>
-        <w:rPr>
-          <w:b w:val="false"/>
-          <w:bCs w:val="false"/>
-          <w:i w:val="false"/>
-          <w:iCs w:val="false"/>
-          <w:color w:val="auto"/>
-          <w:sz w:val="20"/>
-          <w:szCs w:val="20"/>
-        </w:rPr>
-        <w:t>. Todas estas necesidades están sacadas tras mis propios años de experiencia, pues la frustración de que como jugador no dispongo de una herramienta de estas características es la motivación principal tras la decisión de orientar el proyecto en esa dirección.</w:t>
+        <w:t>A la hora de destacar apartados dif</w:t>
+      </w:r>
+      <w:r>
+        <w:rPr>
+          <w:b w:val="false"/>
+          <w:bCs w:val="false"/>
+          <w:i w:val="false"/>
+          <w:iCs w:val="false"/>
+          <w:color w:val="auto"/>
+          <w:sz w:val="20"/>
+          <w:szCs w:val="20"/>
+        </w:rPr>
+        <w:t>í</w:t>
+      </w:r>
+      <w:r>
+        <w:rPr>
+          <w:b w:val="false"/>
+          <w:bCs w:val="false"/>
+          <w:i w:val="false"/>
+          <w:iCs w:val="false"/>
+          <w:color w:val="auto"/>
+          <w:sz w:val="20"/>
+          <w:szCs w:val="20"/>
+        </w:rPr>
+        <w:t xml:space="preserve">ciles de implementar en el aspecto técnico, </w:t>
+      </w:r>
+      <w:r>
+        <w:rPr>
+          <w:b w:val="false"/>
+          <w:bCs w:val="false"/>
+          <w:i w:val="false"/>
+          <w:iCs w:val="false"/>
+          <w:color w:val="auto"/>
+          <w:sz w:val="20"/>
+          <w:szCs w:val="20"/>
+        </w:rPr>
+        <w:t>cabe resaltar la subida de imágenes desde un teléfono hasta el servidor, así como poner dichas imágenes disponibles para que se puedan ver desde los demás dispositivos.</w:t>
+      </w:r>
+    </w:p>
+    <w:p>
+      <w:pPr>
+        <w:pStyle w:val="Normal"/>
+        <w:ind w:firstLine="283" w:left="0"/>
+        <w:jc w:val="left"/>
+        <w:rPr>
+          <w:b w:val="false"/>
+          <w:bCs w:val="false"/>
+          <w:i w:val="false"/>
+          <w:i w:val="false"/>
+          <w:iCs w:val="false"/>
+          <w:color w:val="auto"/>
+          <w:sz w:val="20"/>
+          <w:szCs w:val="20"/>
+        </w:rPr>
+      </w:pPr>
+      <w:r>
+        <w:rPr>
+          <w:b w:val="false"/>
+          <w:bCs w:val="false"/>
+          <w:i w:val="false"/>
+          <w:iCs w:val="false"/>
+          <w:color w:val="auto"/>
+          <w:sz w:val="20"/>
+          <w:szCs w:val="20"/>
+        </w:rPr>
+        <w:t>Para lograrlo, primero se debe implementar la selección de imágenes en la APP Android, lo cual se logra de la siguiente manera:</w:t>
+      </w:r>
+    </w:p>
+    <w:p>
+      <w:pPr>
+        <w:pStyle w:val="Normal"/>
+        <w:ind w:firstLine="283" w:left="0"/>
+        <w:jc w:val="left"/>
+        <w:rPr>
+          <w:b w:val="false"/>
+          <w:bCs w:val="false"/>
+          <w:i w:val="false"/>
+          <w:i w:val="false"/>
+          <w:iCs w:val="false"/>
+          <w:color w:val="auto"/>
+          <w:sz w:val="20"/>
+          <w:szCs w:val="20"/>
+        </w:rPr>
+      </w:pPr>
+      <w:r>
+        <w:rPr/>
+        <w:drawing>
+          <wp:anchor behindDoc="0" distT="0" distB="0" distL="0" distR="0" simplePos="0" locked="0" layoutInCell="0" allowOverlap="1" relativeHeight="27">
+            <wp:simplePos x="0" y="0"/>
+            <wp:positionH relativeFrom="column">
+              <wp:align>center</wp:align>
+            </wp:positionH>
+            <wp:positionV relativeFrom="paragraph">
+              <wp:posOffset>635</wp:posOffset>
+            </wp:positionV>
+            <wp:extent cx="6163310" cy="3429635"/>
+            <wp:effectExtent l="0" t="0" r="0" b="0"/>
+            <wp:wrapSquare wrapText="largest"/>
+            <wp:docPr id="1" name="Imagen26" descr=""/>
+            <wp:cNvGraphicFramePr>
+              <a:graphicFrameLocks xmlns:a="http://schemas.openxmlformats.org/drawingml/2006/main" noChangeAspect="1"/>
+            </wp:cNvGraphicFramePr>
+            <a:graphic xmlns:a="http://schemas.openxmlformats.org/drawingml/2006/main">
+              <a:graphicData uri="http://schemas.openxmlformats.org/drawingml/2006/picture">
+                <pic:pic xmlns:pic="http://schemas.openxmlformats.org/drawingml/2006/picture">
+                  <pic:nvPicPr>
+                    <pic:cNvPr id="1" name="Imagen26" descr=""/>
+                    <pic:cNvPicPr>
+                      <a:picLocks noChangeAspect="1" noChangeArrowheads="1"/>
+                    </pic:cNvPicPr>
+                  </pic:nvPicPr>
+                  <pic:blipFill>
+                    <a:blip r:embed="rId3"/>
+                    <a:stretch>
+                      <a:fillRect/>
+                    </a:stretch>
+                  </pic:blipFill>
+                  <pic:spPr bwMode="auto">
+                    <a:xfrm>
+                      <a:off x="0" y="0"/>
+                      <a:ext cx="6163310" cy="3429635"/>
+                    </a:xfrm>
+                    <a:prstGeom prst="rect">
+                      <a:avLst/>
+                    </a:prstGeom>
+                  </pic:spPr>
+                </pic:pic>
+              </a:graphicData>
+            </a:graphic>
+          </wp:anchor>
+        </w:drawing>
+        <w:drawing>
+          <wp:anchor behindDoc="0" distT="0" distB="0" distL="0" distR="0" simplePos="0" locked="0" layoutInCell="0" allowOverlap="1" relativeHeight="28">
+            <wp:simplePos x="0" y="0"/>
+            <wp:positionH relativeFrom="column">
+              <wp:posOffset>277495</wp:posOffset>
+            </wp:positionH>
+            <wp:positionV relativeFrom="paragraph">
+              <wp:posOffset>3565525</wp:posOffset>
+            </wp:positionV>
+            <wp:extent cx="5648960" cy="3276600"/>
+            <wp:effectExtent l="0" t="0" r="0" b="0"/>
+            <wp:wrapSquare wrapText="largest"/>
+            <wp:docPr id="2" name="Imagen27" descr=""/>
+            <wp:cNvGraphicFramePr>
+              <a:graphicFrameLocks xmlns:a="http://schemas.openxmlformats.org/drawingml/2006/main" noChangeAspect="1"/>
+            </wp:cNvGraphicFramePr>
+            <a:graphic xmlns:a="http://schemas.openxmlformats.org/drawingml/2006/main">
+              <a:graphicData uri="http://schemas.openxmlformats.org/drawingml/2006/picture">
+                <pic:pic xmlns:pic="http://schemas.openxmlformats.org/drawingml/2006/picture">
+                  <pic:nvPicPr>
+                    <pic:cNvPr id="2" name="Imagen27" descr=""/>
+                    <pic:cNvPicPr>
+                      <a:picLocks noChangeAspect="1" noChangeArrowheads="1"/>
+                    </pic:cNvPicPr>
+                  </pic:nvPicPr>
+                  <pic:blipFill>
+                    <a:blip r:embed="rId4"/>
+                    <a:stretch>
+                      <a:fillRect/>
+                    </a:stretch>
+                  </pic:blipFill>
+                  <pic:spPr bwMode="auto">
+                    <a:xfrm>
+                      <a:off x="0" y="0"/>
+                      <a:ext cx="5648960" cy="3276600"/>
+                    </a:xfrm>
+                    <a:prstGeom prst="rect">
+                      <a:avLst/>
+                    </a:prstGeom>
+                  </pic:spPr>
+                </pic:pic>
+              </a:graphicData>
+            </a:graphic>
+          </wp:anchor>
+        </w:drawing>
+      </w:r>
+    </w:p>
+    <w:p>
+      <w:pPr>
+        <w:pStyle w:val="Normal"/>
+        <w:ind w:firstLine="283" w:left="0"/>
+        <w:jc w:val="left"/>
+        <w:rPr>
+          <w:b w:val="false"/>
+          <w:bCs w:val="false"/>
+          <w:i w:val="false"/>
+          <w:i w:val="false"/>
+          <w:iCs w:val="false"/>
+          <w:color w:val="auto"/>
+          <w:sz w:val="20"/>
+          <w:szCs w:val="20"/>
+        </w:rPr>
+      </w:pPr>
+      <w:r>
+        <w:rPr>
+          <w:b w:val="false"/>
+          <w:bCs w:val="false"/>
+          <w:i w:val="false"/>
+          <w:iCs w:val="false"/>
+          <w:color w:val="auto"/>
+          <w:sz w:val="20"/>
+          <w:szCs w:val="20"/>
+        </w:rPr>
+        <w:t xml:space="preserve">Después, será necesario realizar una correcta conexión con la API, siendo la parte más crucial del proceso la correcta asociación de una URL de imagen con los datos de la BBDD. Para esto, se hace esperar al usuario hasta que la API recibe de forma correcta la imagen y responde con la URL desde la que se puede acceder a la imagen </w:t>
+      </w:r>
+      <w:r>
+        <w:rPr>
+          <w:b w:val="false"/>
+          <w:bCs w:val="false"/>
+          <w:i w:val="false"/>
+          <w:iCs w:val="false"/>
+          <w:color w:val="auto"/>
+          <w:sz w:val="20"/>
+          <w:szCs w:val="20"/>
+        </w:rPr>
+        <w:t>subida</w:t>
+      </w:r>
+      <w:r>
+        <w:rPr>
+          <w:b w:val="false"/>
+          <w:bCs w:val="false"/>
+          <w:i w:val="false"/>
+          <w:iCs w:val="false"/>
+          <w:color w:val="auto"/>
+          <w:sz w:val="20"/>
+          <w:szCs w:val="20"/>
+        </w:rPr>
+        <w:t>.</w:t>
+      </w:r>
+    </w:p>
+    <w:p>
+      <w:pPr>
+        <w:pStyle w:val="Normal"/>
+        <w:ind w:firstLine="283" w:left="0"/>
+        <w:jc w:val="left"/>
+        <w:rPr>
+          <w:b w:val="false"/>
+          <w:bCs w:val="false"/>
+          <w:i w:val="false"/>
+          <w:i w:val="false"/>
+          <w:iCs w:val="false"/>
+          <w:color w:val="auto"/>
+          <w:sz w:val="20"/>
+          <w:szCs w:val="20"/>
+        </w:rPr>
+      </w:pPr>
+      <w:r>
+        <w:rPr/>
+        <w:drawing>
+          <wp:anchor behindDoc="0" distT="0" distB="0" distL="0" distR="0" simplePos="0" locked="0" layoutInCell="0" allowOverlap="1" relativeHeight="29">
+            <wp:simplePos x="0" y="0"/>
+            <wp:positionH relativeFrom="column">
+              <wp:align>center</wp:align>
+            </wp:positionH>
+            <wp:positionV relativeFrom="paragraph">
+              <wp:posOffset>635</wp:posOffset>
+            </wp:positionV>
+            <wp:extent cx="4801235" cy="8039735"/>
+            <wp:effectExtent l="0" t="0" r="0" b="0"/>
+            <wp:wrapSquare wrapText="largest"/>
+            <wp:docPr id="3" name="Imagen28" descr=""/>
+            <wp:cNvGraphicFramePr>
+              <a:graphicFrameLocks xmlns:a="http://schemas.openxmlformats.org/drawingml/2006/main" noChangeAspect="1"/>
+            </wp:cNvGraphicFramePr>
+            <a:graphic xmlns:a="http://schemas.openxmlformats.org/drawingml/2006/main">
+              <a:graphicData uri="http://schemas.openxmlformats.org/drawingml/2006/picture">
+                <pic:pic xmlns:pic="http://schemas.openxmlformats.org/drawingml/2006/picture">
+                  <pic:nvPicPr>
+                    <pic:cNvPr id="3" name="Imagen28" descr=""/>
+                    <pic:cNvPicPr>
+                      <a:picLocks noChangeAspect="1" noChangeArrowheads="1"/>
+                    </pic:cNvPicPr>
+                  </pic:nvPicPr>
+                  <pic:blipFill>
+                    <a:blip r:embed="rId5"/>
+                    <a:stretch>
+                      <a:fillRect/>
+                    </a:stretch>
+                  </pic:blipFill>
+                  <pic:spPr bwMode="auto">
+                    <a:xfrm>
+                      <a:off x="0" y="0"/>
+                      <a:ext cx="4801235" cy="8039735"/>
+                    </a:xfrm>
+                    <a:prstGeom prst="rect">
+                      <a:avLst/>
+                    </a:prstGeom>
+                  </pic:spPr>
+                </pic:pic>
+              </a:graphicData>
+            </a:graphic>
+          </wp:anchor>
+        </w:drawing>
+      </w:r>
+    </w:p>
+    <w:p>
+      <w:pPr>
+        <w:pStyle w:val="Normal"/>
+        <w:ind w:firstLine="283" w:left="0"/>
+        <w:jc w:val="left"/>
+        <w:rPr>
+          <w:b w:val="false"/>
+          <w:bCs w:val="false"/>
+          <w:i w:val="false"/>
+          <w:i w:val="false"/>
+          <w:iCs w:val="false"/>
+          <w:color w:val="auto"/>
+          <w:sz w:val="20"/>
+          <w:szCs w:val="20"/>
+        </w:rPr>
+      </w:pPr>
+      <w:r>
+        <w:rPr/>
+      </w:r>
+    </w:p>
+    <w:p>
+      <w:pPr>
+        <w:pStyle w:val="Normal"/>
+        <w:ind w:firstLine="283" w:left="0"/>
+        <w:jc w:val="left"/>
+        <w:rPr>
+          <w:b w:val="false"/>
+          <w:bCs w:val="false"/>
+          <w:i w:val="false"/>
+          <w:i w:val="false"/>
+          <w:iCs w:val="false"/>
+          <w:color w:val="auto"/>
+          <w:sz w:val="20"/>
+          <w:szCs w:val="20"/>
+        </w:rPr>
+      </w:pPr>
+      <w:r>
+        <w:rPr/>
+      </w:r>
+    </w:p>
+    <w:p>
+      <w:pPr>
+        <w:pStyle w:val="Normal"/>
+        <w:ind w:firstLine="283" w:left="0"/>
+        <w:jc w:val="left"/>
+        <w:rPr>
+          <w:b w:val="false"/>
+          <w:bCs w:val="false"/>
+          <w:i w:val="false"/>
+          <w:i w:val="false"/>
+          <w:iCs w:val="false"/>
+          <w:color w:val="auto"/>
+          <w:sz w:val="20"/>
+          <w:szCs w:val="20"/>
+        </w:rPr>
+      </w:pPr>
+      <w:r>
+        <w:rPr/>
+      </w:r>
+    </w:p>
+    <w:p>
+      <w:pPr>
+        <w:pStyle w:val="Normal"/>
+        <w:ind w:firstLine="283" w:left="0"/>
+        <w:jc w:val="left"/>
+        <w:rPr>
+          <w:b w:val="false"/>
+          <w:bCs w:val="false"/>
+          <w:i w:val="false"/>
+          <w:i w:val="false"/>
+          <w:iCs w:val="false"/>
+          <w:color w:val="auto"/>
+          <w:sz w:val="20"/>
+          <w:szCs w:val="20"/>
+        </w:rPr>
+      </w:pPr>
+      <w:r>
+        <w:rPr/>
+      </w:r>
+    </w:p>
+    <w:p>
+      <w:pPr>
+        <w:pStyle w:val="Normal"/>
+        <w:ind w:firstLine="283" w:left="0"/>
+        <w:jc w:val="left"/>
+        <w:rPr>
+          <w:b w:val="false"/>
+          <w:bCs w:val="false"/>
+          <w:i w:val="false"/>
+          <w:i w:val="false"/>
+          <w:iCs w:val="false"/>
+          <w:color w:val="auto"/>
+          <w:sz w:val="20"/>
+          <w:szCs w:val="20"/>
+        </w:rPr>
+      </w:pPr>
+      <w:r>
+        <w:rPr/>
+      </w:r>
+    </w:p>
+    <w:p>
+      <w:pPr>
+        <w:pStyle w:val="Normal"/>
+        <w:ind w:firstLine="283" w:left="0"/>
+        <w:jc w:val="left"/>
+        <w:rPr>
+          <w:b w:val="false"/>
+          <w:bCs w:val="false"/>
+          <w:i w:val="false"/>
+          <w:i w:val="false"/>
+          <w:iCs w:val="false"/>
+          <w:color w:val="auto"/>
+          <w:sz w:val="20"/>
+          <w:szCs w:val="20"/>
+        </w:rPr>
+      </w:pPr>
+      <w:r>
+        <w:rPr/>
+      </w:r>
+    </w:p>
+    <w:p>
+      <w:pPr>
+        <w:pStyle w:val="Normal"/>
+        <w:ind w:firstLine="283" w:left="0"/>
+        <w:jc w:val="left"/>
+        <w:rPr>
+          <w:b w:val="false"/>
+          <w:bCs w:val="false"/>
+          <w:i w:val="false"/>
+          <w:i w:val="false"/>
+          <w:iCs w:val="false"/>
+          <w:color w:val="auto"/>
+          <w:sz w:val="20"/>
+          <w:szCs w:val="20"/>
+        </w:rPr>
+      </w:pPr>
+      <w:r>
+        <w:rPr/>
+      </w:r>
+    </w:p>
+    <w:p>
+      <w:pPr>
+        <w:pStyle w:val="Normal"/>
+        <w:ind w:firstLine="283" w:left="0"/>
+        <w:jc w:val="left"/>
+        <w:rPr>
+          <w:b w:val="false"/>
+          <w:bCs w:val="false"/>
+          <w:i w:val="false"/>
+          <w:i w:val="false"/>
+          <w:iCs w:val="false"/>
+          <w:color w:val="auto"/>
+          <w:sz w:val="20"/>
+          <w:szCs w:val="20"/>
+        </w:rPr>
+      </w:pPr>
+      <w:r>
+        <w:rPr/>
+      </w:r>
+    </w:p>
+    <w:p>
+      <w:pPr>
+        <w:pStyle w:val="Normal"/>
+        <w:ind w:firstLine="283" w:left="0"/>
+        <w:jc w:val="left"/>
+        <w:rPr>
+          <w:b w:val="false"/>
+          <w:bCs w:val="false"/>
+          <w:i w:val="false"/>
+          <w:i w:val="false"/>
+          <w:iCs w:val="false"/>
+          <w:color w:val="auto"/>
+          <w:sz w:val="20"/>
+          <w:szCs w:val="20"/>
+        </w:rPr>
+      </w:pPr>
+      <w:r>
+        <w:rPr/>
+      </w:r>
+    </w:p>
+    <w:p>
+      <w:pPr>
+        <w:pStyle w:val="Normal"/>
+        <w:ind w:firstLine="283" w:left="0"/>
+        <w:jc w:val="left"/>
+        <w:rPr>
+          <w:b w:val="false"/>
+          <w:bCs w:val="false"/>
+          <w:i w:val="false"/>
+          <w:i w:val="false"/>
+          <w:iCs w:val="false"/>
+          <w:color w:val="auto"/>
+          <w:sz w:val="20"/>
+          <w:szCs w:val="20"/>
+        </w:rPr>
+      </w:pPr>
+      <w:r>
+        <w:rPr/>
+      </w:r>
+    </w:p>
+    <w:p>
+      <w:pPr>
+        <w:pStyle w:val="Normal"/>
+        <w:ind w:firstLine="283" w:left="0"/>
+        <w:jc w:val="left"/>
+        <w:rPr>
+          <w:b w:val="false"/>
+          <w:bCs w:val="false"/>
+          <w:i w:val="false"/>
+          <w:i w:val="false"/>
+          <w:iCs w:val="false"/>
+          <w:color w:val="auto"/>
+          <w:sz w:val="20"/>
+          <w:szCs w:val="20"/>
+        </w:rPr>
+      </w:pPr>
+      <w:r>
+        <w:rPr/>
+      </w:r>
+    </w:p>
+    <w:p>
+      <w:pPr>
+        <w:pStyle w:val="Normal"/>
+        <w:ind w:firstLine="283" w:left="0"/>
+        <w:jc w:val="left"/>
+        <w:rPr>
+          <w:b w:val="false"/>
+          <w:bCs w:val="false"/>
+          <w:i w:val="false"/>
+          <w:i w:val="false"/>
+          <w:iCs w:val="false"/>
+          <w:color w:val="auto"/>
+          <w:sz w:val="20"/>
+          <w:szCs w:val="20"/>
+        </w:rPr>
+      </w:pPr>
+      <w:r>
+        <w:rPr/>
+      </w:r>
+    </w:p>
+    <w:p>
+      <w:pPr>
+        <w:pStyle w:val="Normal"/>
+        <w:ind w:firstLine="283" w:left="0"/>
+        <w:jc w:val="left"/>
+        <w:rPr>
+          <w:b w:val="false"/>
+          <w:bCs w:val="false"/>
+          <w:i w:val="false"/>
+          <w:i w:val="false"/>
+          <w:iCs w:val="false"/>
+          <w:color w:val="auto"/>
+          <w:sz w:val="20"/>
+          <w:szCs w:val="20"/>
+        </w:rPr>
+      </w:pPr>
+      <w:r>
+        <w:rPr/>
+      </w:r>
+    </w:p>
+    <w:p>
+      <w:pPr>
+        <w:pStyle w:val="Normal"/>
+        <w:ind w:firstLine="283" w:left="0"/>
+        <w:jc w:val="left"/>
+        <w:rPr>
+          <w:b w:val="false"/>
+          <w:bCs w:val="false"/>
+          <w:i w:val="false"/>
+          <w:i w:val="false"/>
+          <w:iCs w:val="false"/>
+          <w:color w:val="auto"/>
+          <w:sz w:val="20"/>
+          <w:szCs w:val="20"/>
+        </w:rPr>
+      </w:pPr>
+      <w:r>
+        <w:rPr/>
+      </w:r>
+    </w:p>
+    <w:p>
+      <w:pPr>
+        <w:pStyle w:val="Normal"/>
+        <w:ind w:firstLine="283" w:left="0"/>
+        <w:jc w:val="left"/>
+        <w:rPr>
+          <w:b w:val="false"/>
+          <w:bCs w:val="false"/>
+          <w:i w:val="false"/>
+          <w:i w:val="false"/>
+          <w:iCs w:val="false"/>
+          <w:color w:val="auto"/>
+          <w:sz w:val="20"/>
+          <w:szCs w:val="20"/>
+        </w:rPr>
+      </w:pPr>
+      <w:r>
+        <w:rPr/>
+      </w:r>
+    </w:p>
+    <w:p>
+      <w:pPr>
+        <w:pStyle w:val="Normal"/>
+        <w:ind w:firstLine="283" w:left="0"/>
+        <w:jc w:val="left"/>
+        <w:rPr>
+          <w:b w:val="false"/>
+          <w:bCs w:val="false"/>
+          <w:i w:val="false"/>
+          <w:i w:val="false"/>
+          <w:iCs w:val="false"/>
+          <w:color w:val="auto"/>
+          <w:sz w:val="20"/>
+          <w:szCs w:val="20"/>
+        </w:rPr>
+      </w:pPr>
+      <w:r>
+        <w:rPr/>
+      </w:r>
+    </w:p>
+    <w:p>
+      <w:pPr>
+        <w:pStyle w:val="Normal"/>
+        <w:ind w:firstLine="283" w:left="0"/>
+        <w:jc w:val="left"/>
+        <w:rPr>
+          <w:b w:val="false"/>
+          <w:bCs w:val="false"/>
+          <w:i w:val="false"/>
+          <w:i w:val="false"/>
+          <w:iCs w:val="false"/>
+          <w:color w:val="auto"/>
+          <w:sz w:val="20"/>
+          <w:szCs w:val="20"/>
+        </w:rPr>
+      </w:pPr>
+      <w:r>
+        <w:rPr/>
+      </w:r>
+    </w:p>
+    <w:p>
+      <w:pPr>
+        <w:pStyle w:val="Normal"/>
+        <w:ind w:firstLine="283" w:left="0"/>
+        <w:jc w:val="left"/>
+        <w:rPr>
+          <w:b w:val="false"/>
+          <w:bCs w:val="false"/>
+          <w:i w:val="false"/>
+          <w:i w:val="false"/>
+          <w:iCs w:val="false"/>
+          <w:color w:val="auto"/>
+          <w:sz w:val="20"/>
+          <w:szCs w:val="20"/>
+        </w:rPr>
+      </w:pPr>
+      <w:r>
+        <w:rPr/>
+      </w:r>
+    </w:p>
+    <w:p>
+      <w:pPr>
+        <w:pStyle w:val="Normal"/>
+        <w:ind w:firstLine="283" w:left="0"/>
+        <w:jc w:val="left"/>
+        <w:rPr>
+          <w:b w:val="false"/>
+          <w:bCs w:val="false"/>
+          <w:i w:val="false"/>
+          <w:i w:val="false"/>
+          <w:iCs w:val="false"/>
+          <w:color w:val="auto"/>
+          <w:sz w:val="20"/>
+          <w:szCs w:val="20"/>
+        </w:rPr>
+      </w:pPr>
+      <w:r>
+        <w:rPr/>
+      </w:r>
+    </w:p>
+    <w:p>
+      <w:pPr>
+        <w:pStyle w:val="Normal"/>
+        <w:ind w:firstLine="283" w:left="0"/>
+        <w:jc w:val="left"/>
+        <w:rPr>
+          <w:b w:val="false"/>
+          <w:bCs w:val="false"/>
+          <w:i w:val="false"/>
+          <w:i w:val="false"/>
+          <w:iCs w:val="false"/>
+          <w:color w:val="auto"/>
+          <w:sz w:val="20"/>
+          <w:szCs w:val="20"/>
+        </w:rPr>
+      </w:pPr>
+      <w:r>
+        <w:rPr/>
+      </w:r>
+    </w:p>
+    <w:p>
+      <w:pPr>
+        <w:pStyle w:val="Normal"/>
+        <w:ind w:firstLine="283" w:left="0"/>
+        <w:jc w:val="left"/>
+        <w:rPr>
+          <w:b w:val="false"/>
+          <w:bCs w:val="false"/>
+          <w:i w:val="false"/>
+          <w:i w:val="false"/>
+          <w:iCs w:val="false"/>
+          <w:color w:val="auto"/>
+          <w:sz w:val="20"/>
+          <w:szCs w:val="20"/>
+        </w:rPr>
+      </w:pPr>
+      <w:r>
+        <w:rPr/>
+      </w:r>
+    </w:p>
+    <w:p>
+      <w:pPr>
+        <w:pStyle w:val="Normal"/>
+        <w:ind w:firstLine="283" w:left="0"/>
+        <w:jc w:val="left"/>
+        <w:rPr>
+          <w:b w:val="false"/>
+          <w:bCs w:val="false"/>
+          <w:i w:val="false"/>
+          <w:i w:val="false"/>
+          <w:iCs w:val="false"/>
+          <w:color w:val="auto"/>
+          <w:sz w:val="20"/>
+          <w:szCs w:val="20"/>
+        </w:rPr>
+      </w:pPr>
+      <w:r>
+        <w:rPr/>
+      </w:r>
+    </w:p>
+    <w:p>
+      <w:pPr>
+        <w:pStyle w:val="Normal"/>
+        <w:ind w:firstLine="283" w:left="0"/>
+        <w:jc w:val="left"/>
+        <w:rPr>
+          <w:b w:val="false"/>
+          <w:bCs w:val="false"/>
+          <w:i w:val="false"/>
+          <w:i w:val="false"/>
+          <w:iCs w:val="false"/>
+          <w:color w:val="auto"/>
+          <w:sz w:val="20"/>
+          <w:szCs w:val="20"/>
+        </w:rPr>
+      </w:pPr>
+      <w:r>
+        <w:rPr/>
+      </w:r>
+    </w:p>
+    <w:p>
+      <w:pPr>
+        <w:pStyle w:val="Normal"/>
+        <w:ind w:firstLine="283" w:left="0"/>
+        <w:jc w:val="left"/>
+        <w:rPr>
+          <w:b w:val="false"/>
+          <w:bCs w:val="false"/>
+          <w:i w:val="false"/>
+          <w:i w:val="false"/>
+          <w:iCs w:val="false"/>
+          <w:color w:val="auto"/>
+          <w:sz w:val="20"/>
+          <w:szCs w:val="20"/>
+        </w:rPr>
+      </w:pPr>
+      <w:r>
+        <w:rPr/>
+      </w:r>
+    </w:p>
+    <w:p>
+      <w:pPr>
+        <w:pStyle w:val="Normal"/>
+        <w:ind w:firstLine="283" w:left="0"/>
+        <w:jc w:val="left"/>
+        <w:rPr>
+          <w:b w:val="false"/>
+          <w:bCs w:val="false"/>
+          <w:i w:val="false"/>
+          <w:i w:val="false"/>
+          <w:iCs w:val="false"/>
+          <w:color w:val="auto"/>
+          <w:sz w:val="20"/>
+          <w:szCs w:val="20"/>
+        </w:rPr>
+      </w:pPr>
+      <w:r>
+        <w:rPr/>
+      </w:r>
+    </w:p>
+    <w:p>
+      <w:pPr>
+        <w:pStyle w:val="Normal"/>
+        <w:ind w:firstLine="283" w:left="0"/>
+        <w:jc w:val="left"/>
+        <w:rPr>
+          <w:b w:val="false"/>
+          <w:bCs w:val="false"/>
+          <w:i w:val="false"/>
+          <w:i w:val="false"/>
+          <w:iCs w:val="false"/>
+          <w:color w:val="auto"/>
+          <w:sz w:val="20"/>
+          <w:szCs w:val="20"/>
+        </w:rPr>
+      </w:pPr>
+      <w:r>
+        <w:rPr/>
+      </w:r>
+    </w:p>
+    <w:p>
+      <w:pPr>
+        <w:pStyle w:val="Normal"/>
+        <w:ind w:firstLine="283" w:left="0"/>
+        <w:jc w:val="left"/>
+        <w:rPr>
+          <w:b w:val="false"/>
+          <w:bCs w:val="false"/>
+          <w:i w:val="false"/>
+          <w:i w:val="false"/>
+          <w:iCs w:val="false"/>
+          <w:color w:val="auto"/>
+          <w:sz w:val="20"/>
+          <w:szCs w:val="20"/>
+        </w:rPr>
+      </w:pPr>
+      <w:r>
+        <w:rPr/>
+      </w:r>
+    </w:p>
+    <w:p>
+      <w:pPr>
+        <w:pStyle w:val="Normal"/>
+        <w:ind w:firstLine="283" w:left="0"/>
+        <w:jc w:val="left"/>
+        <w:rPr>
+          <w:b w:val="false"/>
+          <w:bCs w:val="false"/>
+          <w:i w:val="false"/>
+          <w:i w:val="false"/>
+          <w:iCs w:val="false"/>
+          <w:color w:val="auto"/>
+          <w:sz w:val="20"/>
+          <w:szCs w:val="20"/>
+        </w:rPr>
+      </w:pPr>
+      <w:r>
+        <w:rPr/>
+      </w:r>
+    </w:p>
+    <w:p>
+      <w:pPr>
+        <w:pStyle w:val="Normal"/>
+        <w:ind w:firstLine="283" w:left="0"/>
+        <w:jc w:val="left"/>
+        <w:rPr>
+          <w:b w:val="false"/>
+          <w:bCs w:val="false"/>
+          <w:i w:val="false"/>
+          <w:i w:val="false"/>
+          <w:iCs w:val="false"/>
+          <w:color w:val="auto"/>
+          <w:sz w:val="20"/>
+          <w:szCs w:val="20"/>
+        </w:rPr>
+      </w:pPr>
+      <w:r>
+        <w:rPr/>
+      </w:r>
+    </w:p>
+    <w:p>
+      <w:pPr>
+        <w:pStyle w:val="Normal"/>
+        <w:ind w:firstLine="283" w:left="0"/>
+        <w:jc w:val="left"/>
+        <w:rPr>
+          <w:b w:val="false"/>
+          <w:bCs w:val="false"/>
+          <w:i w:val="false"/>
+          <w:i w:val="false"/>
+          <w:iCs w:val="false"/>
+          <w:color w:val="auto"/>
+          <w:sz w:val="20"/>
+          <w:szCs w:val="20"/>
+        </w:rPr>
+      </w:pPr>
+      <w:r>
+        <w:rPr/>
+      </w:r>
+    </w:p>
+    <w:p>
+      <w:pPr>
+        <w:pStyle w:val="Normal"/>
+        <w:ind w:firstLine="283" w:left="0"/>
+        <w:jc w:val="left"/>
+        <w:rPr>
+          <w:b w:val="false"/>
+          <w:bCs w:val="false"/>
+          <w:i w:val="false"/>
+          <w:i w:val="false"/>
+          <w:iCs w:val="false"/>
+          <w:color w:val="auto"/>
+          <w:sz w:val="20"/>
+          <w:szCs w:val="20"/>
+        </w:rPr>
+      </w:pPr>
+      <w:r>
+        <w:rPr/>
+      </w:r>
+    </w:p>
+    <w:p>
+      <w:pPr>
+        <w:pStyle w:val="Normal"/>
+        <w:ind w:firstLine="283" w:left="0"/>
+        <w:jc w:val="left"/>
+        <w:rPr>
+          <w:b w:val="false"/>
+          <w:bCs w:val="false"/>
+          <w:i w:val="false"/>
+          <w:i w:val="false"/>
+          <w:iCs w:val="false"/>
+          <w:color w:val="auto"/>
+          <w:sz w:val="20"/>
+          <w:szCs w:val="20"/>
+        </w:rPr>
+      </w:pPr>
+      <w:r>
+        <w:rPr/>
+      </w:r>
+    </w:p>
+    <w:p>
+      <w:pPr>
+        <w:pStyle w:val="Normal"/>
+        <w:ind w:firstLine="283" w:left="0"/>
+        <w:jc w:val="left"/>
+        <w:rPr>
+          <w:b w:val="false"/>
+          <w:bCs w:val="false"/>
+          <w:i w:val="false"/>
+          <w:i w:val="false"/>
+          <w:iCs w:val="false"/>
+          <w:color w:val="auto"/>
+          <w:sz w:val="20"/>
+          <w:szCs w:val="20"/>
+        </w:rPr>
+      </w:pPr>
+      <w:r>
+        <w:rPr/>
+      </w:r>
+    </w:p>
+    <w:p>
+      <w:pPr>
+        <w:pStyle w:val="Normal"/>
+        <w:ind w:firstLine="283" w:left="0"/>
+        <w:jc w:val="left"/>
+        <w:rPr>
+          <w:b w:val="false"/>
+          <w:bCs w:val="false"/>
+          <w:i w:val="false"/>
+          <w:i w:val="false"/>
+          <w:iCs w:val="false"/>
+          <w:color w:val="auto"/>
+          <w:sz w:val="20"/>
+          <w:szCs w:val="20"/>
+        </w:rPr>
+      </w:pPr>
+      <w:r>
+        <w:rPr/>
+      </w:r>
+    </w:p>
+    <w:p>
+      <w:pPr>
+        <w:pStyle w:val="Normal"/>
+        <w:ind w:firstLine="283" w:left="0"/>
+        <w:jc w:val="left"/>
+        <w:rPr>
+          <w:b w:val="false"/>
+          <w:bCs w:val="false"/>
+          <w:i w:val="false"/>
+          <w:i w:val="false"/>
+          <w:iCs w:val="false"/>
+          <w:color w:val="auto"/>
+          <w:sz w:val="20"/>
+          <w:szCs w:val="20"/>
+        </w:rPr>
+      </w:pPr>
+      <w:r>
+        <w:rPr/>
+      </w:r>
+    </w:p>
+    <w:p>
+      <w:pPr>
+        <w:pStyle w:val="Normal"/>
+        <w:ind w:firstLine="283" w:left="0"/>
+        <w:jc w:val="left"/>
+        <w:rPr>
+          <w:b w:val="false"/>
+          <w:bCs w:val="false"/>
+          <w:i w:val="false"/>
+          <w:i w:val="false"/>
+          <w:iCs w:val="false"/>
+          <w:color w:val="auto"/>
+          <w:sz w:val="20"/>
+          <w:szCs w:val="20"/>
+        </w:rPr>
+      </w:pPr>
+      <w:r>
+        <w:rPr/>
+      </w:r>
+    </w:p>
+    <w:p>
+      <w:pPr>
+        <w:pStyle w:val="Normal"/>
+        <w:ind w:firstLine="283" w:left="0"/>
+        <w:jc w:val="left"/>
+        <w:rPr>
+          <w:b w:val="false"/>
+          <w:bCs w:val="false"/>
+          <w:i w:val="false"/>
+          <w:i w:val="false"/>
+          <w:iCs w:val="false"/>
+          <w:color w:val="auto"/>
+          <w:sz w:val="20"/>
+          <w:szCs w:val="20"/>
+        </w:rPr>
+      </w:pPr>
+      <w:r>
+        <w:rPr/>
+        <w:drawing>
+          <wp:anchor behindDoc="0" distT="0" distB="0" distL="0" distR="0" simplePos="0" locked="0" layoutInCell="0" allowOverlap="1" relativeHeight="30">
+            <wp:simplePos x="0" y="0"/>
+            <wp:positionH relativeFrom="column">
+              <wp:align>center</wp:align>
+            </wp:positionH>
+            <wp:positionV relativeFrom="paragraph">
+              <wp:posOffset>635</wp:posOffset>
+            </wp:positionV>
+            <wp:extent cx="6299835" cy="2601595"/>
+            <wp:effectExtent l="0" t="0" r="0" b="0"/>
+            <wp:wrapSquare wrapText="largest"/>
+            <wp:docPr id="4" name="Imagen29" descr=""/>
+            <wp:cNvGraphicFramePr>
+              <a:graphicFrameLocks xmlns:a="http://schemas.openxmlformats.org/drawingml/2006/main" noChangeAspect="1"/>
+            </wp:cNvGraphicFramePr>
+            <a:graphic xmlns:a="http://schemas.openxmlformats.org/drawingml/2006/main">
+              <a:graphicData uri="http://schemas.openxmlformats.org/drawingml/2006/picture">
+                <pic:pic xmlns:pic="http://schemas.openxmlformats.org/drawingml/2006/picture">
+                  <pic:nvPicPr>
+                    <pic:cNvPr id="4" name="Imagen29" descr=""/>
+                    <pic:cNvPicPr>
+                      <a:picLocks noChangeAspect="1" noChangeArrowheads="1"/>
+                    </pic:cNvPicPr>
+                  </pic:nvPicPr>
+                  <pic:blipFill>
+                    <a:blip r:embed="rId6"/>
+                    <a:stretch>
+                      <a:fillRect/>
+                    </a:stretch>
+                  </pic:blipFill>
+                  <pic:spPr bwMode="auto">
+                    <a:xfrm>
+                      <a:off x="0" y="0"/>
+                      <a:ext cx="6299835" cy="2601595"/>
+                    </a:xfrm>
+                    <a:prstGeom prst="rect">
+                      <a:avLst/>
+                    </a:prstGeom>
+                  </pic:spPr>
+                </pic:pic>
+              </a:graphicData>
+            </a:graphic>
+          </wp:anchor>
+        </w:drawing>
+        <w:drawing>
+          <wp:anchor behindDoc="0" distT="0" distB="0" distL="0" distR="0" simplePos="0" locked="0" layoutInCell="0" allowOverlap="1" relativeHeight="31">
+            <wp:simplePos x="0" y="0"/>
+            <wp:positionH relativeFrom="column">
+              <wp:posOffset>344170</wp:posOffset>
+            </wp:positionH>
+            <wp:positionV relativeFrom="paragraph">
+              <wp:posOffset>2709545</wp:posOffset>
+            </wp:positionV>
+            <wp:extent cx="5610860" cy="962025"/>
+            <wp:effectExtent l="0" t="0" r="0" b="0"/>
+            <wp:wrapSquare wrapText="largest"/>
+            <wp:docPr id="5" name="Imagen30" descr=""/>
+            <wp:cNvGraphicFramePr>
+              <a:graphicFrameLocks xmlns:a="http://schemas.openxmlformats.org/drawingml/2006/main" noChangeAspect="1"/>
+            </wp:cNvGraphicFramePr>
+            <a:graphic xmlns:a="http://schemas.openxmlformats.org/drawingml/2006/main">
+              <a:graphicData uri="http://schemas.openxmlformats.org/drawingml/2006/picture">
+                <pic:pic xmlns:pic="http://schemas.openxmlformats.org/drawingml/2006/picture">
+                  <pic:nvPicPr>
+                    <pic:cNvPr id="5" name="Imagen30" descr=""/>
+                    <pic:cNvPicPr>
+                      <a:picLocks noChangeAspect="1" noChangeArrowheads="1"/>
+                    </pic:cNvPicPr>
+                  </pic:nvPicPr>
+                  <pic:blipFill>
+                    <a:blip r:embed="rId7"/>
+                    <a:stretch>
+                      <a:fillRect/>
+                    </a:stretch>
+                  </pic:blipFill>
+                  <pic:spPr bwMode="auto">
+                    <a:xfrm>
+                      <a:off x="0" y="0"/>
+                      <a:ext cx="5610860" cy="962025"/>
+                    </a:xfrm>
+                    <a:prstGeom prst="rect">
+                      <a:avLst/>
+                    </a:prstGeom>
+                  </pic:spPr>
+                </pic:pic>
+              </a:graphicData>
+            </a:graphic>
+          </wp:anchor>
+        </w:drawing>
+      </w:r>
+    </w:p>
+    <w:p>
+      <w:pPr>
+        <w:pStyle w:val="Normal"/>
+        <w:ind w:firstLine="283" w:left="0"/>
+        <w:jc w:val="left"/>
+        <w:rPr>
+          <w:b w:val="false"/>
+          <w:bCs w:val="false"/>
+          <w:i w:val="false"/>
+          <w:i w:val="false"/>
+          <w:iCs w:val="false"/>
+          <w:color w:val="auto"/>
+          <w:sz w:val="20"/>
+          <w:szCs w:val="20"/>
+        </w:rPr>
+      </w:pPr>
+      <w:r>
+        <w:rPr/>
+      </w:r>
+    </w:p>
+    <w:p>
+      <w:pPr>
+        <w:pStyle w:val="Normal"/>
+        <w:ind w:firstLine="283" w:left="0"/>
+        <w:jc w:val="left"/>
+        <w:rPr>
+          <w:b w:val="false"/>
+          <w:bCs w:val="false"/>
+          <w:i w:val="false"/>
+          <w:i w:val="false"/>
+          <w:iCs w:val="false"/>
+          <w:color w:val="auto"/>
+          <w:sz w:val="20"/>
+          <w:szCs w:val="20"/>
+        </w:rPr>
+      </w:pPr>
+      <w:r>
+        <w:rPr/>
+      </w:r>
+    </w:p>
+    <w:p>
+      <w:pPr>
+        <w:pStyle w:val="Normal"/>
+        <w:ind w:firstLine="283" w:left="0"/>
+        <w:jc w:val="left"/>
+        <w:rPr>
+          <w:b w:val="false"/>
+          <w:bCs w:val="false"/>
+          <w:i w:val="false"/>
+          <w:i w:val="false"/>
+          <w:iCs w:val="false"/>
+          <w:color w:val="auto"/>
+          <w:sz w:val="20"/>
+          <w:szCs w:val="20"/>
+        </w:rPr>
+      </w:pPr>
+      <w:r>
+        <w:rPr/>
+      </w:r>
+    </w:p>
+    <w:p>
+      <w:pPr>
+        <w:pStyle w:val="Normal"/>
+        <w:ind w:firstLine="283" w:left="0"/>
+        <w:jc w:val="left"/>
+        <w:rPr>
+          <w:b w:val="false"/>
+          <w:bCs w:val="false"/>
+          <w:i w:val="false"/>
+          <w:i w:val="false"/>
+          <w:iCs w:val="false"/>
+          <w:color w:val="auto"/>
+          <w:sz w:val="20"/>
+          <w:szCs w:val="20"/>
+        </w:rPr>
+      </w:pPr>
+      <w:r>
+        <w:rPr/>
+      </w:r>
+    </w:p>
+    <w:p>
+      <w:pPr>
+        <w:pStyle w:val="Normal"/>
+        <w:ind w:firstLine="283" w:left="0"/>
+        <w:jc w:val="left"/>
+        <w:rPr>
+          <w:b w:val="false"/>
+          <w:bCs w:val="false"/>
+          <w:i w:val="false"/>
+          <w:i w:val="false"/>
+          <w:iCs w:val="false"/>
+          <w:color w:val="auto"/>
+          <w:sz w:val="20"/>
+          <w:szCs w:val="20"/>
+        </w:rPr>
+      </w:pPr>
+      <w:r>
+        <w:rPr/>
+        <w:drawing>
+          <wp:anchor behindDoc="0" distT="0" distB="0" distL="0" distR="0" simplePos="0" locked="0" layoutInCell="0" allowOverlap="1" relativeHeight="32">
+            <wp:simplePos x="0" y="0"/>
+            <wp:positionH relativeFrom="column">
+              <wp:align>center</wp:align>
+            </wp:positionH>
+            <wp:positionV relativeFrom="paragraph">
+              <wp:posOffset>635</wp:posOffset>
+            </wp:positionV>
+            <wp:extent cx="6299835" cy="3016885"/>
+            <wp:effectExtent l="0" t="0" r="0" b="0"/>
+            <wp:wrapSquare wrapText="largest"/>
+            <wp:docPr id="6" name="Imagen31" descr=""/>
+            <wp:cNvGraphicFramePr>
+              <a:graphicFrameLocks xmlns:a="http://schemas.openxmlformats.org/drawingml/2006/main" noChangeAspect="1"/>
+            </wp:cNvGraphicFramePr>
+            <a:graphic xmlns:a="http://schemas.openxmlformats.org/drawingml/2006/main">
+              <a:graphicData uri="http://schemas.openxmlformats.org/drawingml/2006/picture">
+                <pic:pic xmlns:pic="http://schemas.openxmlformats.org/drawingml/2006/picture">
+                  <pic:nvPicPr>
+                    <pic:cNvPr id="6" name="Imagen31" descr=""/>
+                    <pic:cNvPicPr>
+                      <a:picLocks noChangeAspect="1" noChangeArrowheads="1"/>
+                    </pic:cNvPicPr>
+                  </pic:nvPicPr>
+                  <pic:blipFill>
+                    <a:blip r:embed="rId8"/>
+                    <a:stretch>
+                      <a:fillRect/>
+                    </a:stretch>
+                  </pic:blipFill>
+                  <pic:spPr bwMode="auto">
+                    <a:xfrm>
+                      <a:off x="0" y="0"/>
+                      <a:ext cx="6299835" cy="3016885"/>
+                    </a:xfrm>
+                    <a:prstGeom prst="rect">
+                      <a:avLst/>
+                    </a:prstGeom>
+                  </pic:spPr>
+                </pic:pic>
+              </a:graphicData>
+            </a:graphic>
+          </wp:anchor>
+        </w:drawing>
+      </w:r>
+    </w:p>
+    <w:p>
+      <w:pPr>
+        <w:pStyle w:val="Normal"/>
+        <w:ind w:firstLine="283" w:left="0"/>
+        <w:jc w:val="left"/>
+        <w:rPr>
+          <w:b w:val="false"/>
+          <w:bCs w:val="false"/>
+          <w:i w:val="false"/>
+          <w:i w:val="false"/>
+          <w:iCs w:val="false"/>
+          <w:color w:val="auto"/>
+          <w:sz w:val="20"/>
+          <w:szCs w:val="20"/>
+        </w:rPr>
+      </w:pPr>
+      <w:r>
+        <w:rPr>
+          <w:b w:val="false"/>
+          <w:bCs w:val="false"/>
+          <w:i w:val="false"/>
+          <w:iCs w:val="false"/>
+          <w:color w:val="auto"/>
+          <w:sz w:val="20"/>
+          <w:szCs w:val="20"/>
+        </w:rPr>
+        <w:t>Finalmente, usando SpringBoot creamos un endpoint que sirva las imágenes que ya tenemos subidas.</w:t>
+      </w:r>
+    </w:p>
+    <w:p>
+      <w:pPr>
+        <w:pStyle w:val="Normal"/>
+        <w:ind w:firstLine="283" w:left="0"/>
+        <w:jc w:val="left"/>
+        <w:rPr>
+          <w:b w:val="false"/>
+          <w:bCs w:val="false"/>
+          <w:i w:val="false"/>
+          <w:i w:val="false"/>
+          <w:iCs w:val="false"/>
+          <w:color w:val="auto"/>
+          <w:sz w:val="20"/>
+          <w:szCs w:val="20"/>
+        </w:rPr>
+      </w:pPr>
+      <w:r>
+        <w:rPr/>
+        <w:drawing>
+          <wp:anchor behindDoc="0" distT="0" distB="0" distL="0" distR="0" simplePos="0" locked="0" layoutInCell="0" allowOverlap="1" relativeHeight="33">
+            <wp:simplePos x="0" y="0"/>
+            <wp:positionH relativeFrom="column">
+              <wp:posOffset>292100</wp:posOffset>
+            </wp:positionH>
+            <wp:positionV relativeFrom="paragraph">
+              <wp:posOffset>13335</wp:posOffset>
+            </wp:positionV>
+            <wp:extent cx="5906135" cy="3686175"/>
+            <wp:effectExtent l="0" t="0" r="0" b="0"/>
+            <wp:wrapSquare wrapText="largest"/>
+            <wp:docPr id="7" name="Imagen32" descr=""/>
+            <wp:cNvGraphicFramePr>
+              <a:graphicFrameLocks xmlns:a="http://schemas.openxmlformats.org/drawingml/2006/main" noChangeAspect="1"/>
+            </wp:cNvGraphicFramePr>
+            <a:graphic xmlns:a="http://schemas.openxmlformats.org/drawingml/2006/main">
+              <a:graphicData uri="http://schemas.openxmlformats.org/drawingml/2006/picture">
+                <pic:pic xmlns:pic="http://schemas.openxmlformats.org/drawingml/2006/picture">
+                  <pic:nvPicPr>
+                    <pic:cNvPr id="7" name="Imagen32" descr=""/>
+                    <pic:cNvPicPr>
+                      <a:picLocks noChangeAspect="1" noChangeArrowheads="1"/>
+                    </pic:cNvPicPr>
+                  </pic:nvPicPr>
+                  <pic:blipFill>
+                    <a:blip r:embed="rId9"/>
+                    <a:stretch>
+                      <a:fillRect/>
+                    </a:stretch>
+                  </pic:blipFill>
+                  <pic:spPr bwMode="auto">
+                    <a:xfrm>
+                      <a:off x="0" y="0"/>
+                      <a:ext cx="5906135" cy="3686175"/>
+                    </a:xfrm>
+                    <a:prstGeom prst="rect">
+                      <a:avLst/>
+                    </a:prstGeom>
+                  </pic:spPr>
+                </pic:pic>
+              </a:graphicData>
+            </a:graphic>
+          </wp:anchor>
+        </w:drawing>
+      </w:r>
+    </w:p>
+    <w:p>
+      <w:pPr>
+        <w:pStyle w:val="Normal"/>
+        <w:ind w:firstLine="283" w:left="0"/>
+        <w:jc w:val="left"/>
+        <w:rPr>
+          <w:b w:val="false"/>
+          <w:bCs w:val="false"/>
+          <w:i w:val="false"/>
+          <w:i w:val="false"/>
+          <w:iCs w:val="false"/>
+          <w:color w:val="auto"/>
+          <w:sz w:val="20"/>
+          <w:szCs w:val="20"/>
+        </w:rPr>
+      </w:pPr>
+      <w:r>
+        <w:rPr/>
+      </w:r>
+    </w:p>
+    <w:p>
+      <w:pPr>
+        <w:pStyle w:val="Normal"/>
+        <w:ind w:firstLine="283" w:left="0"/>
+        <w:jc w:val="left"/>
+        <w:rPr>
+          <w:b w:val="false"/>
+          <w:bCs w:val="false"/>
+          <w:i w:val="false"/>
+          <w:i w:val="false"/>
+          <w:iCs w:val="false"/>
+          <w:color w:val="auto"/>
+          <w:sz w:val="20"/>
+          <w:szCs w:val="20"/>
+        </w:rPr>
+      </w:pPr>
+      <w:r>
+        <w:rPr/>
+      </w:r>
+    </w:p>
+    <w:p>
+      <w:pPr>
+        <w:pStyle w:val="Normal"/>
+        <w:ind w:firstLine="283" w:left="0"/>
+        <w:jc w:val="left"/>
+        <w:rPr>
+          <w:b w:val="false"/>
+          <w:bCs w:val="false"/>
+          <w:i w:val="false"/>
+          <w:i w:val="false"/>
+          <w:iCs w:val="false"/>
+          <w:color w:val="auto"/>
+          <w:sz w:val="20"/>
+          <w:szCs w:val="20"/>
+        </w:rPr>
+      </w:pPr>
+      <w:r>
+        <w:rPr/>
+      </w:r>
+    </w:p>
+    <w:p>
+      <w:pPr>
+        <w:pStyle w:val="Normal"/>
+        <w:ind w:firstLine="283" w:left="0"/>
+        <w:jc w:val="left"/>
+        <w:rPr>
+          <w:b w:val="false"/>
+          <w:bCs w:val="false"/>
+          <w:i w:val="false"/>
+          <w:i w:val="false"/>
+          <w:iCs w:val="false"/>
+          <w:color w:val="auto"/>
+          <w:sz w:val="20"/>
+          <w:szCs w:val="20"/>
+        </w:rPr>
+      </w:pPr>
+      <w:r>
+        <w:rPr/>
+      </w:r>
+    </w:p>
+    <w:p>
+      <w:pPr>
+        <w:pStyle w:val="Normal"/>
+        <w:ind w:firstLine="283" w:left="0"/>
+        <w:jc w:val="left"/>
+        <w:rPr>
+          <w:b w:val="false"/>
+          <w:bCs w:val="false"/>
+          <w:i w:val="false"/>
+          <w:i w:val="false"/>
+          <w:iCs w:val="false"/>
+          <w:color w:val="auto"/>
+          <w:sz w:val="20"/>
+          <w:szCs w:val="20"/>
+        </w:rPr>
+      </w:pPr>
+      <w:r>
+        <w:rPr/>
+      </w:r>
+    </w:p>
+    <w:p>
+      <w:pPr>
+        <w:pStyle w:val="Normal"/>
+        <w:ind w:firstLine="283" w:left="0"/>
+        <w:jc w:val="left"/>
+        <w:rPr>
+          <w:b w:val="false"/>
+          <w:bCs w:val="false"/>
+          <w:i w:val="false"/>
+          <w:i w:val="false"/>
+          <w:iCs w:val="false"/>
+          <w:color w:val="auto"/>
+          <w:sz w:val="20"/>
+          <w:szCs w:val="20"/>
+        </w:rPr>
+      </w:pPr>
+      <w:r>
+        <w:rPr/>
+      </w:r>
+    </w:p>
+    <w:p>
+      <w:pPr>
+        <w:pStyle w:val="Normal"/>
+        <w:ind w:firstLine="283" w:left="0"/>
+        <w:jc w:val="left"/>
+        <w:rPr>
+          <w:b w:val="false"/>
+          <w:bCs w:val="false"/>
+          <w:i w:val="false"/>
+          <w:i w:val="false"/>
+          <w:iCs w:val="false"/>
+          <w:color w:val="auto"/>
+          <w:sz w:val="20"/>
+          <w:szCs w:val="20"/>
+        </w:rPr>
+      </w:pPr>
+      <w:r>
+        <w:rPr/>
+      </w:r>
+    </w:p>
+    <w:p>
+      <w:pPr>
+        <w:pStyle w:val="Normal"/>
+        <w:ind w:firstLine="283" w:left="0"/>
+        <w:jc w:val="left"/>
+        <w:rPr>
+          <w:b w:val="false"/>
+          <w:bCs w:val="false"/>
+          <w:i w:val="false"/>
+          <w:i w:val="false"/>
+          <w:iCs w:val="false"/>
+          <w:color w:val="auto"/>
+          <w:sz w:val="20"/>
+          <w:szCs w:val="20"/>
+        </w:rPr>
+      </w:pPr>
+      <w:r>
+        <w:rPr/>
+      </w:r>
+    </w:p>
+    <w:p>
+      <w:pPr>
+        <w:pStyle w:val="Normal"/>
+        <w:ind w:firstLine="283" w:left="0"/>
+        <w:jc w:val="left"/>
+        <w:rPr>
+          <w:b w:val="false"/>
+          <w:bCs w:val="false"/>
+          <w:i w:val="false"/>
+          <w:i w:val="false"/>
+          <w:iCs w:val="false"/>
+          <w:color w:val="auto"/>
+          <w:sz w:val="20"/>
+          <w:szCs w:val="20"/>
+        </w:rPr>
+      </w:pPr>
+      <w:r>
+        <w:rPr/>
+      </w:r>
+    </w:p>
+    <w:p>
+      <w:pPr>
+        <w:pStyle w:val="Normal"/>
+        <w:ind w:firstLine="283" w:left="0"/>
+        <w:jc w:val="left"/>
+        <w:rPr>
+          <w:b w:val="false"/>
+          <w:bCs w:val="false"/>
+          <w:i w:val="false"/>
+          <w:i w:val="false"/>
+          <w:iCs w:val="false"/>
+          <w:color w:val="auto"/>
+          <w:sz w:val="20"/>
+          <w:szCs w:val="20"/>
+        </w:rPr>
+      </w:pPr>
+      <w:r>
+        <w:rPr/>
+      </w:r>
+    </w:p>
+    <w:p>
+      <w:pPr>
+        <w:pStyle w:val="Normal"/>
+        <w:ind w:firstLine="283" w:left="0"/>
+        <w:jc w:val="left"/>
+        <w:rPr>
+          <w:b w:val="false"/>
+          <w:bCs w:val="false"/>
+          <w:i w:val="false"/>
+          <w:i w:val="false"/>
+          <w:iCs w:val="false"/>
+          <w:color w:val="auto"/>
+          <w:sz w:val="20"/>
+          <w:szCs w:val="20"/>
+        </w:rPr>
+      </w:pPr>
+      <w:r>
+        <w:rPr/>
+      </w:r>
+    </w:p>
+    <w:p>
+      <w:pPr>
+        <w:pStyle w:val="Normal"/>
+        <w:ind w:firstLine="283" w:left="0"/>
+        <w:jc w:val="left"/>
+        <w:rPr>
+          <w:b w:val="false"/>
+          <w:bCs w:val="false"/>
+          <w:i w:val="false"/>
+          <w:i w:val="false"/>
+          <w:iCs w:val="false"/>
+          <w:color w:val="auto"/>
+          <w:sz w:val="20"/>
+          <w:szCs w:val="20"/>
+        </w:rPr>
+      </w:pPr>
+      <w:r>
+        <w:rPr/>
+      </w:r>
+    </w:p>
+    <w:p>
+      <w:pPr>
+        <w:pStyle w:val="Normal"/>
+        <w:ind w:firstLine="283" w:left="0"/>
+        <w:jc w:val="left"/>
+        <w:rPr>
+          <w:b w:val="false"/>
+          <w:bCs w:val="false"/>
+          <w:i w:val="false"/>
+          <w:i w:val="false"/>
+          <w:iCs w:val="false"/>
+          <w:color w:val="auto"/>
+          <w:sz w:val="20"/>
+          <w:szCs w:val="20"/>
+        </w:rPr>
+      </w:pPr>
+      <w:r>
+        <w:rPr/>
+      </w:r>
+    </w:p>
+    <w:p>
+      <w:pPr>
+        <w:pStyle w:val="Normal"/>
+        <w:ind w:firstLine="283" w:left="0"/>
+        <w:jc w:val="left"/>
+        <w:rPr>
+          <w:b w:val="false"/>
+          <w:bCs w:val="false"/>
+          <w:i w:val="false"/>
+          <w:i w:val="false"/>
+          <w:iCs w:val="false"/>
+          <w:color w:val="auto"/>
+          <w:sz w:val="20"/>
+          <w:szCs w:val="20"/>
+        </w:rPr>
+      </w:pPr>
+      <w:r>
+        <w:rPr/>
+      </w:r>
+    </w:p>
+    <w:p>
+      <w:pPr>
+        <w:pStyle w:val="Normal"/>
+        <w:ind w:firstLine="283" w:left="0"/>
+        <w:jc w:val="left"/>
+        <w:rPr>
+          <w:b w:val="false"/>
+          <w:bCs w:val="false"/>
+          <w:i w:val="false"/>
+          <w:i w:val="false"/>
+          <w:iCs w:val="false"/>
+          <w:color w:val="auto"/>
+          <w:sz w:val="20"/>
+          <w:szCs w:val="20"/>
+        </w:rPr>
+      </w:pPr>
+      <w:r>
+        <w:rPr/>
+      </w:r>
+    </w:p>
+    <w:p>
+      <w:pPr>
+        <w:pStyle w:val="Normal"/>
+        <w:ind w:firstLine="283" w:left="0"/>
+        <w:jc w:val="left"/>
+        <w:rPr>
+          <w:b w:val="false"/>
+          <w:bCs w:val="false"/>
+          <w:i w:val="false"/>
+          <w:i w:val="false"/>
+          <w:iCs w:val="false"/>
+          <w:color w:val="auto"/>
+          <w:sz w:val="20"/>
+          <w:szCs w:val="20"/>
+        </w:rPr>
+      </w:pPr>
+      <w:r>
+        <w:rPr/>
+      </w:r>
+    </w:p>
+    <w:p>
+      <w:pPr>
+        <w:pStyle w:val="Normal"/>
+        <w:ind w:firstLine="283" w:left="0"/>
+        <w:jc w:val="left"/>
+        <w:rPr>
+          <w:b w:val="false"/>
+          <w:bCs w:val="false"/>
+          <w:i w:val="false"/>
+          <w:i w:val="false"/>
+          <w:iCs w:val="false"/>
+          <w:color w:val="auto"/>
+          <w:sz w:val="20"/>
+          <w:szCs w:val="20"/>
+        </w:rPr>
+      </w:pPr>
+      <w:r>
+        <w:rPr/>
       </w:r>
     </w:p>
     <w:p>
@@ -4568,7 +6408,7 @@
             <wp:extent cx="5723890" cy="3203575"/>
             <wp:effectExtent l="0" t="0" r="0" b="0"/>
             <wp:wrapSquare wrapText="largest"/>
-            <wp:docPr id="1" name="Imagen1" descr=""/>
+            <wp:docPr id="8" name="Imagen1" descr=""/>
             <wp:cNvGraphicFramePr>
               <a:graphicFrameLocks xmlns:a="http://schemas.openxmlformats.org/drawingml/2006/main" noChangeAspect="1"/>
             </wp:cNvGraphicFramePr>
@@ -4576,13 +6416,13 @@
               <a:graphicData uri="http://schemas.openxmlformats.org/drawingml/2006/picture">
                 <pic:pic xmlns:pic="http://schemas.openxmlformats.org/drawingml/2006/picture">
                   <pic:nvPicPr>
-                    <pic:cNvPr id="1" name="Imagen1" descr=""/>
+                    <pic:cNvPr id="8" name="Imagen1" descr=""/>
                     <pic:cNvPicPr>
                       <a:picLocks noChangeAspect="1" noChangeArrowheads="1"/>
                     </pic:cNvPicPr>
                   </pic:nvPicPr>
                   <pic:blipFill>
-                    <a:blip r:embed="rId3"/>
+                    <a:blip r:embed="rId10"/>
                     <a:stretch>
                       <a:fillRect/>
                     </a:stretch>
@@ -4701,7 +6541,7 @@
             <wp:extent cx="4200525" cy="2124075"/>
             <wp:effectExtent l="0" t="0" r="0" b="0"/>
             <wp:wrapSquare wrapText="largest"/>
-            <wp:docPr id="2" name="Imagen2" descr=""/>
+            <wp:docPr id="9" name="Imagen2" descr=""/>
             <wp:cNvGraphicFramePr>
               <a:graphicFrameLocks xmlns:a="http://schemas.openxmlformats.org/drawingml/2006/main" noChangeAspect="1"/>
             </wp:cNvGraphicFramePr>
@@ -4709,13 +6549,13 @@
               <a:graphicData uri="http://schemas.openxmlformats.org/drawingml/2006/picture">
                 <pic:pic xmlns:pic="http://schemas.openxmlformats.org/drawingml/2006/picture">
                   <pic:nvPicPr>
-                    <pic:cNvPr id="2" name="Imagen2" descr=""/>
+                    <pic:cNvPr id="9" name="Imagen2" descr=""/>
                     <pic:cNvPicPr>
                       <a:picLocks noChangeAspect="1" noChangeArrowheads="1"/>
                     </pic:cNvPicPr>
                   </pic:nvPicPr>
                   <pic:blipFill>
-                    <a:blip r:embed="rId4"/>
+                    <a:blip r:embed="rId11"/>
                     <a:stretch>
                       <a:fillRect/>
                     </a:stretch>
@@ -5008,7 +6848,7 @@
             <wp:extent cx="6299835" cy="6443980"/>
             <wp:effectExtent l="0" t="0" r="0" b="0"/>
             <wp:wrapSquare wrapText="largest"/>
-            <wp:docPr id="3" name="Imagen3" descr=""/>
+            <wp:docPr id="10" name="Imagen3" descr=""/>
             <wp:cNvGraphicFramePr>
               <a:graphicFrameLocks xmlns:a="http://schemas.openxmlformats.org/drawingml/2006/main" noChangeAspect="1"/>
             </wp:cNvGraphicFramePr>
@@ -5016,13 +6856,13 @@
               <a:graphicData uri="http://schemas.openxmlformats.org/drawingml/2006/picture">
                 <pic:pic xmlns:pic="http://schemas.openxmlformats.org/drawingml/2006/picture">
                   <pic:nvPicPr>
-                    <pic:cNvPr id="3" name="Imagen3" descr=""/>
+                    <pic:cNvPr id="10" name="Imagen3" descr=""/>
                     <pic:cNvPicPr>
                       <a:picLocks noChangeAspect="1" noChangeArrowheads="1"/>
                     </pic:cNvPicPr>
                   </pic:nvPicPr>
                   <pic:blipFill>
-                    <a:blip r:embed="rId5"/>
+                    <a:blip r:embed="rId12"/>
                     <a:stretch>
                       <a:fillRect/>
                     </a:stretch>
@@ -5149,7 +6989,7 @@
             <wp:extent cx="6299835" cy="2526665"/>
             <wp:effectExtent l="0" t="0" r="0" b="0"/>
             <wp:wrapSquare wrapText="largest"/>
-            <wp:docPr id="4" name="Imagen4" descr=""/>
+            <wp:docPr id="11" name="Imagen4" descr=""/>
             <wp:cNvGraphicFramePr>
               <a:graphicFrameLocks xmlns:a="http://schemas.openxmlformats.org/drawingml/2006/main" noChangeAspect="1"/>
             </wp:cNvGraphicFramePr>
@@ -5157,13 +6997,13 @@
               <a:graphicData uri="http://schemas.openxmlformats.org/drawingml/2006/picture">
                 <pic:pic xmlns:pic="http://schemas.openxmlformats.org/drawingml/2006/picture">
                   <pic:nvPicPr>
-                    <pic:cNvPr id="4" name="Imagen4" descr=""/>
+                    <pic:cNvPr id="11" name="Imagen4" descr=""/>
                     <pic:cNvPicPr>
                       <a:picLocks noChangeAspect="1" noChangeArrowheads="1"/>
                     </pic:cNvPicPr>
                   </pic:nvPicPr>
                   <pic:blipFill>
-                    <a:blip r:embed="rId6"/>
+                    <a:blip r:embed="rId13"/>
                     <a:stretch>
                       <a:fillRect/>
                     </a:stretch>
@@ -5737,11 +7577,1701 @@
         </w:rPr>
         <w:tab/>
       </w:r>
+      <w:r>
+        <w:rPr>
+          <w:b w:val="false"/>
+          <w:bCs w:val="false"/>
+          <w:color w:val="auto"/>
+        </w:rPr>
+        <w:t>La ejecución de la aplicación se lleva a cabo de 3 maneras distintas: Primero, la API debe de estar levantada para que todo el ecosistema de la aplicación pueda funcionar. La correcta ejecución de esta puede comprobarse tanto por la consola de Visual Studio como mediante el uso de herramientas que permitan hacer peticiones HTTP.</w:t>
+      </w:r>
+    </w:p>
+    <w:p>
+      <w:pPr>
+        <w:pStyle w:val="Normal"/>
+        <w:spacing w:before="0" w:after="120"/>
+        <w:ind w:hanging="0" w:left="0"/>
+        <w:jc w:val="both"/>
+        <w:rPr>
+          <w:i/>
+          <w:i/>
+          <w:iCs/>
+        </w:rPr>
+      </w:pPr>
+      <w:r>
+        <w:drawing>
+          <wp:anchor behindDoc="0" distT="0" distB="0" distL="0" distR="0" simplePos="0" locked="0" layoutInCell="0" allowOverlap="1" relativeHeight="6">
+            <wp:simplePos x="0" y="0"/>
+            <wp:positionH relativeFrom="column">
+              <wp:align>center</wp:align>
+            </wp:positionH>
+            <wp:positionV relativeFrom="paragraph">
+              <wp:posOffset>635</wp:posOffset>
+            </wp:positionV>
+            <wp:extent cx="6299835" cy="1043305"/>
+            <wp:effectExtent l="0" t="0" r="0" b="0"/>
+            <wp:wrapSquare wrapText="largest"/>
+            <wp:docPr id="12" name="Imagen5" descr=""/>
+            <wp:cNvGraphicFramePr>
+              <a:graphicFrameLocks xmlns:a="http://schemas.openxmlformats.org/drawingml/2006/main" noChangeAspect="1"/>
+            </wp:cNvGraphicFramePr>
+            <a:graphic xmlns:a="http://schemas.openxmlformats.org/drawingml/2006/main">
+              <a:graphicData uri="http://schemas.openxmlformats.org/drawingml/2006/picture">
+                <pic:pic xmlns:pic="http://schemas.openxmlformats.org/drawingml/2006/picture">
+                  <pic:nvPicPr>
+                    <pic:cNvPr id="12" name="Imagen5" descr=""/>
+                    <pic:cNvPicPr>
+                      <a:picLocks noChangeAspect="1" noChangeArrowheads="1"/>
+                    </pic:cNvPicPr>
+                  </pic:nvPicPr>
+                  <pic:blipFill>
+                    <a:blip r:embed="rId14"/>
+                    <a:stretch>
+                      <a:fillRect/>
+                    </a:stretch>
+                  </pic:blipFill>
+                  <pic:spPr bwMode="auto">
+                    <a:xfrm>
+                      <a:off x="0" y="0"/>
+                      <a:ext cx="6299835" cy="1043305"/>
+                    </a:xfrm>
+                    <a:prstGeom prst="rect">
+                      <a:avLst/>
+                    </a:prstGeom>
+                  </pic:spPr>
+                </pic:pic>
+              </a:graphicData>
+            </a:graphic>
+          </wp:anchor>
+        </w:drawing>
+      </w:r>
+      <w:r>
+        <w:rPr>
+          <w:b w:val="false"/>
+          <w:bCs w:val="false"/>
+          <w:i/>
+          <w:iCs/>
+          <w:color w:val="auto"/>
+        </w:rPr>
+        <w:t>La API iniciandose.</w:t>
+      </w:r>
+    </w:p>
+    <w:p>
+      <w:pPr>
+        <w:pStyle w:val="Normal"/>
+        <w:spacing w:before="0" w:after="120"/>
+        <w:ind w:hanging="0" w:left="0"/>
+        <w:jc w:val="both"/>
+        <w:rPr>
+          <w:color w:val="auto"/>
+        </w:rPr>
+      </w:pPr>
+      <w:r>
+        <w:rPr/>
+        <w:drawing>
+          <wp:anchor behindDoc="0" distT="0" distB="0" distL="0" distR="0" simplePos="0" locked="0" layoutInCell="0" allowOverlap="1" relativeHeight="7">
+            <wp:simplePos x="0" y="0"/>
+            <wp:positionH relativeFrom="column">
+              <wp:posOffset>34925</wp:posOffset>
+            </wp:positionH>
+            <wp:positionV relativeFrom="paragraph">
+              <wp:posOffset>-17780</wp:posOffset>
+            </wp:positionV>
+            <wp:extent cx="1657350" cy="409575"/>
+            <wp:effectExtent l="0" t="0" r="0" b="0"/>
+            <wp:wrapSquare wrapText="largest"/>
+            <wp:docPr id="13" name="Imagen6" descr=""/>
+            <wp:cNvGraphicFramePr>
+              <a:graphicFrameLocks xmlns:a="http://schemas.openxmlformats.org/drawingml/2006/main" noChangeAspect="1"/>
+            </wp:cNvGraphicFramePr>
+            <a:graphic xmlns:a="http://schemas.openxmlformats.org/drawingml/2006/main">
+              <a:graphicData uri="http://schemas.openxmlformats.org/drawingml/2006/picture">
+                <pic:pic xmlns:pic="http://schemas.openxmlformats.org/drawingml/2006/picture">
+                  <pic:nvPicPr>
+                    <pic:cNvPr id="13" name="Imagen6" descr=""/>
+                    <pic:cNvPicPr>
+                      <a:picLocks noChangeAspect="1" noChangeArrowheads="1"/>
+                    </pic:cNvPicPr>
+                  </pic:nvPicPr>
+                  <pic:blipFill>
+                    <a:blip r:embed="rId15"/>
+                    <a:stretch>
+                      <a:fillRect/>
+                    </a:stretch>
+                  </pic:blipFill>
+                  <pic:spPr bwMode="auto">
+                    <a:xfrm>
+                      <a:off x="0" y="0"/>
+                      <a:ext cx="1657350" cy="409575"/>
+                    </a:xfrm>
+                    <a:prstGeom prst="rect">
+                      <a:avLst/>
+                    </a:prstGeom>
+                  </pic:spPr>
+                </pic:pic>
+              </a:graphicData>
+            </a:graphic>
+          </wp:anchor>
+        </w:drawing>
+      </w:r>
+    </w:p>
+    <w:p>
+      <w:pPr>
+        <w:pStyle w:val="Normal"/>
+        <w:spacing w:before="0" w:after="120"/>
+        <w:ind w:hanging="0" w:left="0"/>
+        <w:jc w:val="both"/>
+        <w:rPr>
+          <w:color w:val="auto"/>
+        </w:rPr>
+      </w:pPr>
+      <w:r>
+        <w:rPr/>
+      </w:r>
+    </w:p>
+    <w:p>
+      <w:pPr>
+        <w:pStyle w:val="Normal"/>
+        <w:spacing w:before="0" w:after="120"/>
+        <w:ind w:hanging="0" w:left="0"/>
+        <w:jc w:val="both"/>
+        <w:rPr>
+          <w:b w:val="false"/>
+          <w:bCs w:val="false"/>
+          <w:i/>
+          <w:i/>
+          <w:iCs/>
+        </w:rPr>
+      </w:pPr>
+      <w:r>
+        <w:rPr>
+          <w:b w:val="false"/>
+          <w:bCs w:val="false"/>
+          <w:i/>
+          <w:iCs/>
+          <w:color w:val="auto"/>
+        </w:rPr>
+        <w:t>Si se levanta de forma correcta, la consola de comando mostrará el siguiente mensaje.</w:t>
+      </w:r>
+    </w:p>
+    <w:p>
+      <w:pPr>
+        <w:pStyle w:val="Normal"/>
+        <w:spacing w:before="0" w:after="120"/>
+        <w:ind w:hanging="0" w:left="0"/>
+        <w:jc w:val="both"/>
+        <w:rPr>
+          <w:color w:val="auto"/>
+        </w:rPr>
+      </w:pPr>
+      <w:r>
+        <w:rPr/>
+        <w:drawing>
+          <wp:anchor behindDoc="0" distT="0" distB="0" distL="0" distR="0" simplePos="0" locked="0" layoutInCell="0" allowOverlap="1" relativeHeight="8">
+            <wp:simplePos x="0" y="0"/>
+            <wp:positionH relativeFrom="column">
+              <wp:align>center</wp:align>
+            </wp:positionH>
+            <wp:positionV relativeFrom="paragraph">
+              <wp:posOffset>635</wp:posOffset>
+            </wp:positionV>
+            <wp:extent cx="4347845" cy="1459865"/>
+            <wp:effectExtent l="0" t="0" r="0" b="0"/>
+            <wp:wrapSquare wrapText="largest"/>
+            <wp:docPr id="14" name="Imagen7" descr=""/>
+            <wp:cNvGraphicFramePr>
+              <a:graphicFrameLocks xmlns:a="http://schemas.openxmlformats.org/drawingml/2006/main" noChangeAspect="1"/>
+            </wp:cNvGraphicFramePr>
+            <a:graphic xmlns:a="http://schemas.openxmlformats.org/drawingml/2006/main">
+              <a:graphicData uri="http://schemas.openxmlformats.org/drawingml/2006/picture">
+                <pic:pic xmlns:pic="http://schemas.openxmlformats.org/drawingml/2006/picture">
+                  <pic:nvPicPr>
+                    <pic:cNvPr id="14" name="Imagen7" descr=""/>
+                    <pic:cNvPicPr>
+                      <a:picLocks noChangeAspect="1" noChangeArrowheads="1"/>
+                    </pic:cNvPicPr>
+                  </pic:nvPicPr>
+                  <pic:blipFill>
+                    <a:blip r:embed="rId16"/>
+                    <a:stretch>
+                      <a:fillRect/>
+                    </a:stretch>
+                  </pic:blipFill>
+                  <pic:spPr bwMode="auto">
+                    <a:xfrm>
+                      <a:off x="0" y="0"/>
+                      <a:ext cx="4347845" cy="1459865"/>
+                    </a:xfrm>
+                    <a:prstGeom prst="rect">
+                      <a:avLst/>
+                    </a:prstGeom>
+                  </pic:spPr>
+                </pic:pic>
+              </a:graphicData>
+            </a:graphic>
+          </wp:anchor>
+        </w:drawing>
+      </w:r>
+    </w:p>
+    <w:p>
+      <w:pPr>
+        <w:pStyle w:val="Normal"/>
+        <w:spacing w:before="0" w:after="120"/>
+        <w:ind w:hanging="0" w:left="0"/>
+        <w:jc w:val="both"/>
+        <w:rPr>
+          <w:color w:val="auto"/>
+        </w:rPr>
+      </w:pPr>
+      <w:r>
+        <w:rPr/>
+      </w:r>
+    </w:p>
+    <w:p>
+      <w:pPr>
+        <w:pStyle w:val="Normal"/>
+        <w:spacing w:before="0" w:after="120"/>
+        <w:ind w:hanging="0" w:left="0"/>
+        <w:jc w:val="both"/>
+        <w:rPr>
+          <w:color w:val="auto"/>
+        </w:rPr>
+      </w:pPr>
+      <w:r>
+        <w:rPr/>
+      </w:r>
+    </w:p>
+    <w:p>
+      <w:pPr>
+        <w:pStyle w:val="Normal"/>
+        <w:spacing w:before="0" w:after="120"/>
+        <w:ind w:hanging="0" w:left="0"/>
+        <w:jc w:val="both"/>
+        <w:rPr>
+          <w:color w:val="auto"/>
+        </w:rPr>
+      </w:pPr>
+      <w:r>
+        <w:rPr/>
+      </w:r>
+    </w:p>
+    <w:p>
+      <w:pPr>
+        <w:pStyle w:val="Normal"/>
+        <w:spacing w:before="0" w:after="120"/>
+        <w:ind w:hanging="0" w:left="0"/>
+        <w:jc w:val="both"/>
+        <w:rPr>
+          <w:color w:val="auto"/>
+        </w:rPr>
+      </w:pPr>
+      <w:r>
+        <w:rPr/>
+      </w:r>
+    </w:p>
+    <w:p>
+      <w:pPr>
+        <w:pStyle w:val="Normal"/>
+        <w:spacing w:before="0" w:after="120"/>
+        <w:ind w:hanging="0" w:left="0"/>
+        <w:jc w:val="both"/>
+        <w:rPr>
+          <w:color w:val="auto"/>
+        </w:rPr>
+      </w:pPr>
+      <w:r>
+        <w:rPr/>
+      </w:r>
+    </w:p>
+    <w:p>
+      <w:pPr>
+        <w:pStyle w:val="Normal"/>
+        <w:spacing w:before="0" w:after="120"/>
+        <w:ind w:hanging="0" w:left="0"/>
+        <w:jc w:val="both"/>
+        <w:rPr>
+          <w:color w:val="auto"/>
+        </w:rPr>
+      </w:pPr>
+      <w:r>
+        <w:rPr/>
+      </w:r>
+    </w:p>
+    <w:p>
+      <w:pPr>
+        <w:pStyle w:val="Normal"/>
+        <w:spacing w:before="0" w:after="120"/>
+        <w:ind w:hanging="0" w:left="0"/>
+        <w:jc w:val="both"/>
+        <w:rPr>
+          <w:i/>
+          <w:i/>
+          <w:iCs/>
+        </w:rPr>
+      </w:pPr>
+      <w:r>
+        <w:rPr>
+          <w:b w:val="false"/>
+          <w:bCs w:val="false"/>
+          <w:i/>
+          <w:iCs/>
+          <w:color w:val="auto"/>
+        </w:rPr>
+        <w:t>Al hacerle una petición, esta responde como se esperaría.</w:t>
+      </w:r>
+    </w:p>
+    <w:p>
+      <w:pPr>
+        <w:pStyle w:val="Normal"/>
+        <w:spacing w:before="0" w:after="120"/>
+        <w:ind w:hanging="0" w:left="0"/>
+        <w:jc w:val="both"/>
+        <w:rPr>
+          <w:color w:val="auto"/>
+        </w:rPr>
+      </w:pPr>
+      <w:r>
+        <w:rPr>
+          <w:b w:val="false"/>
+          <w:bCs w:val="false"/>
+          <w:color w:val="auto"/>
+        </w:rPr>
+        <w:t xml:space="preserve">Por otra parte, tenemos el visor web, que se puede ejecutar mediante el comando </w:t>
+      </w:r>
+      <w:r>
+        <w:rPr>
+          <w:b w:val="false"/>
+          <w:bCs w:val="false"/>
+          <w:i/>
+          <w:iCs/>
+          <w:color w:val="auto"/>
+        </w:rPr>
+        <w:t>flutter run</w:t>
+      </w:r>
+      <w:r>
+        <w:rPr>
+          <w:b w:val="false"/>
+          <w:bCs w:val="false"/>
+          <w:i w:val="false"/>
+          <w:iCs w:val="false"/>
+          <w:color w:val="auto"/>
+        </w:rPr>
+        <w:t xml:space="preserve"> en la consola de comandos.</w:t>
+      </w:r>
+    </w:p>
+    <w:p>
+      <w:pPr>
+        <w:pStyle w:val="Normal"/>
+        <w:spacing w:before="0" w:after="120"/>
+        <w:ind w:hanging="0" w:left="0"/>
+        <w:jc w:val="both"/>
+        <w:rPr>
+          <w:color w:val="auto"/>
+        </w:rPr>
+      </w:pPr>
+      <w:r>
+        <w:drawing>
+          <wp:anchor behindDoc="0" distT="0" distB="0" distL="0" distR="0" simplePos="0" locked="0" layoutInCell="0" allowOverlap="1" relativeHeight="26">
+            <wp:simplePos x="0" y="0"/>
+            <wp:positionH relativeFrom="column">
+              <wp:posOffset>40640</wp:posOffset>
+            </wp:positionH>
+            <wp:positionV relativeFrom="paragraph">
+              <wp:posOffset>635</wp:posOffset>
+            </wp:positionV>
+            <wp:extent cx="4560570" cy="1852930"/>
+            <wp:effectExtent l="0" t="0" r="0" b="0"/>
+            <wp:wrapSquare wrapText="largest"/>
+            <wp:docPr id="15" name="Imagen25" descr=""/>
+            <wp:cNvGraphicFramePr>
+              <a:graphicFrameLocks xmlns:a="http://schemas.openxmlformats.org/drawingml/2006/main" noChangeAspect="1"/>
+            </wp:cNvGraphicFramePr>
+            <a:graphic xmlns:a="http://schemas.openxmlformats.org/drawingml/2006/main">
+              <a:graphicData uri="http://schemas.openxmlformats.org/drawingml/2006/picture">
+                <pic:pic xmlns:pic="http://schemas.openxmlformats.org/drawingml/2006/picture">
+                  <pic:nvPicPr>
+                    <pic:cNvPr id="15" name="Imagen25" descr=""/>
+                    <pic:cNvPicPr>
+                      <a:picLocks noChangeAspect="1" noChangeArrowheads="1"/>
+                    </pic:cNvPicPr>
+                  </pic:nvPicPr>
+                  <pic:blipFill>
+                    <a:blip r:embed="rId17"/>
+                    <a:stretch>
+                      <a:fillRect/>
+                    </a:stretch>
+                  </pic:blipFill>
+                  <pic:spPr bwMode="auto">
+                    <a:xfrm>
+                      <a:off x="0" y="0"/>
+                      <a:ext cx="4560570" cy="1852930"/>
+                    </a:xfrm>
+                    <a:prstGeom prst="rect">
+                      <a:avLst/>
+                    </a:prstGeom>
+                  </pic:spPr>
+                </pic:pic>
+              </a:graphicData>
+            </a:graphic>
+          </wp:anchor>
+        </w:drawing>
+      </w:r>
+      <w:r>
+        <w:rPr>
+          <w:b w:val="false"/>
+          <w:bCs w:val="false"/>
+          <w:i w:val="false"/>
+          <w:iCs w:val="false"/>
+          <w:color w:val="auto"/>
+        </w:rPr>
+        <w:br/>
+        <w:br/>
+        <w:br/>
+        <w:br/>
+        <w:br/>
+        <w:br/>
+        <w:br/>
+        <w:br/>
+        <w:br/>
+        <w:br/>
+        <w:br/>
+        <w:br/>
+        <w:br/>
+        <w:br/>
+      </w:r>
+      <w:r>
+        <w:rPr>
+          <w:b w:val="false"/>
+          <w:bCs w:val="false"/>
+          <w:i/>
+          <w:iCs/>
+          <w:color w:val="auto"/>
+        </w:rPr>
+        <w:t>Muestra de los logs generados en la consola tras el uso de la APP móvil.</w:t>
+      </w:r>
+    </w:p>
+    <w:p>
+      <w:pPr>
+        <w:pStyle w:val="Normal"/>
+        <w:spacing w:before="0" w:after="120"/>
+        <w:ind w:hanging="0" w:left="0"/>
+        <w:jc w:val="both"/>
+        <w:rPr>
+          <w:color w:val="auto"/>
+        </w:rPr>
+      </w:pPr>
+      <w:r>
+        <w:rPr/>
+        <w:drawing>
+          <wp:anchor behindDoc="0" distT="0" distB="0" distL="0" distR="0" simplePos="0" locked="0" layoutInCell="0" allowOverlap="1" relativeHeight="9">
+            <wp:simplePos x="0" y="0"/>
+            <wp:positionH relativeFrom="column">
+              <wp:align>center</wp:align>
+            </wp:positionH>
+            <wp:positionV relativeFrom="paragraph">
+              <wp:posOffset>635</wp:posOffset>
+            </wp:positionV>
+            <wp:extent cx="6299835" cy="5073650"/>
+            <wp:effectExtent l="0" t="0" r="0" b="0"/>
+            <wp:wrapSquare wrapText="largest"/>
+            <wp:docPr id="16" name="Imagen8" descr=""/>
+            <wp:cNvGraphicFramePr>
+              <a:graphicFrameLocks xmlns:a="http://schemas.openxmlformats.org/drawingml/2006/main" noChangeAspect="1"/>
+            </wp:cNvGraphicFramePr>
+            <a:graphic xmlns:a="http://schemas.openxmlformats.org/drawingml/2006/main">
+              <a:graphicData uri="http://schemas.openxmlformats.org/drawingml/2006/picture">
+                <pic:pic xmlns:pic="http://schemas.openxmlformats.org/drawingml/2006/picture">
+                  <pic:nvPicPr>
+                    <pic:cNvPr id="16" name="Imagen8" descr=""/>
+                    <pic:cNvPicPr>
+                      <a:picLocks noChangeAspect="1" noChangeArrowheads="1"/>
+                    </pic:cNvPicPr>
+                  </pic:nvPicPr>
+                  <pic:blipFill>
+                    <a:blip r:embed="rId18"/>
+                    <a:stretch>
+                      <a:fillRect/>
+                    </a:stretch>
+                  </pic:blipFill>
+                  <pic:spPr bwMode="auto">
+                    <a:xfrm>
+                      <a:off x="0" y="0"/>
+                      <a:ext cx="6299835" cy="5073650"/>
+                    </a:xfrm>
+                    <a:prstGeom prst="rect">
+                      <a:avLst/>
+                    </a:prstGeom>
+                  </pic:spPr>
+                </pic:pic>
+              </a:graphicData>
+            </a:graphic>
+          </wp:anchor>
+        </w:drawing>
+      </w:r>
+    </w:p>
+    <w:p>
+      <w:pPr>
+        <w:pStyle w:val="Normal"/>
+        <w:spacing w:before="0" w:after="120"/>
+        <w:ind w:hanging="0" w:left="0"/>
+        <w:jc w:val="both"/>
+        <w:rPr>
+          <w:color w:val="auto"/>
+        </w:rPr>
+      </w:pPr>
+      <w:r>
+        <w:rPr>
+          <w:b w:val="false"/>
+          <w:bCs w:val="false"/>
+          <w:i w:val="false"/>
+          <w:iCs w:val="false"/>
+          <w:color w:val="auto"/>
+        </w:rPr>
+        <w:t>Una vez realizada la ejecución, se cargará el emulador de Chrome que simula a la app desplegada.</w:t>
+      </w:r>
+    </w:p>
+    <w:p>
+      <w:pPr>
+        <w:pStyle w:val="Normal"/>
+        <w:spacing w:before="0" w:after="120"/>
+        <w:ind w:hanging="0" w:left="0"/>
+        <w:jc w:val="both"/>
+        <w:rPr>
+          <w:color w:val="auto"/>
+        </w:rPr>
+      </w:pPr>
+      <w:r>
+        <w:rPr/>
+        <w:drawing>
+          <wp:anchor behindDoc="0" distT="0" distB="0" distL="0" distR="0" simplePos="0" locked="0" layoutInCell="0" allowOverlap="1" relativeHeight="10">
+            <wp:simplePos x="0" y="0"/>
+            <wp:positionH relativeFrom="column">
+              <wp:align>center</wp:align>
+            </wp:positionH>
+            <wp:positionV relativeFrom="paragraph">
+              <wp:posOffset>635</wp:posOffset>
+            </wp:positionV>
+            <wp:extent cx="6299835" cy="3055620"/>
+            <wp:effectExtent l="0" t="0" r="0" b="0"/>
+            <wp:wrapSquare wrapText="largest"/>
+            <wp:docPr id="17" name="Imagen9" descr=""/>
+            <wp:cNvGraphicFramePr>
+              <a:graphicFrameLocks xmlns:a="http://schemas.openxmlformats.org/drawingml/2006/main" noChangeAspect="1"/>
+            </wp:cNvGraphicFramePr>
+            <a:graphic xmlns:a="http://schemas.openxmlformats.org/drawingml/2006/main">
+              <a:graphicData uri="http://schemas.openxmlformats.org/drawingml/2006/picture">
+                <pic:pic xmlns:pic="http://schemas.openxmlformats.org/drawingml/2006/picture">
+                  <pic:nvPicPr>
+                    <pic:cNvPr id="17" name="Imagen9" descr=""/>
+                    <pic:cNvPicPr>
+                      <a:picLocks noChangeAspect="1" noChangeArrowheads="1"/>
+                    </pic:cNvPicPr>
+                  </pic:nvPicPr>
+                  <pic:blipFill>
+                    <a:blip r:embed="rId19"/>
+                    <a:stretch>
+                      <a:fillRect/>
+                    </a:stretch>
+                  </pic:blipFill>
+                  <pic:spPr bwMode="auto">
+                    <a:xfrm>
+                      <a:off x="0" y="0"/>
+                      <a:ext cx="6299835" cy="3055620"/>
+                    </a:xfrm>
+                    <a:prstGeom prst="rect">
+                      <a:avLst/>
+                    </a:prstGeom>
+                  </pic:spPr>
+                </pic:pic>
+              </a:graphicData>
+            </a:graphic>
+          </wp:anchor>
+        </w:drawing>
+      </w:r>
+    </w:p>
+    <w:p>
+      <w:pPr>
+        <w:pStyle w:val="Normal"/>
+        <w:spacing w:before="0" w:after="120"/>
+        <w:ind w:hanging="0" w:left="0"/>
+        <w:jc w:val="both"/>
+        <w:rPr>
+          <w:color w:val="auto"/>
+        </w:rPr>
+      </w:pPr>
+      <w:r>
+        <w:rPr>
+          <w:b w:val="false"/>
+          <w:bCs w:val="false"/>
+          <w:i w:val="false"/>
+          <w:iCs w:val="false"/>
+          <w:color w:val="auto"/>
+        </w:rPr>
+        <w:t>Desde el visor web es posible leer los diversos errores que reportan los usuarios así como las sugerencias que nos hacen llegar desde la APP.</w:t>
+      </w:r>
+    </w:p>
+    <w:p>
+      <w:pPr>
+        <w:pStyle w:val="Normal"/>
+        <w:spacing w:before="0" w:after="120"/>
+        <w:ind w:hanging="0" w:left="0"/>
+        <w:jc w:val="both"/>
+        <w:rPr>
+          <w:color w:val="auto"/>
+        </w:rPr>
+      </w:pPr>
+      <w:r>
+        <w:rPr>
+          <w:b w:val="false"/>
+          <w:bCs w:val="false"/>
+          <w:i w:val="false"/>
+          <w:iCs w:val="false"/>
+          <w:color w:val="auto"/>
+        </w:rPr>
+        <w:t xml:space="preserve">Finalmente, la APP móvil se puede iniciar desde Android Studio en el emulador de Android. </w:t>
+      </w:r>
+      <w:r>
+        <w:rPr>
+          <w:b w:val="false"/>
+          <w:bCs w:val="false"/>
+          <w:i w:val="false"/>
+          <w:iCs w:val="false"/>
+          <w:color w:val="auto"/>
+        </w:rPr>
+        <w:t>Al iniciarla, nos da la opción de crear una cuenta o hacer login. Para demostrar el funcionamiento, asumiremos que somos un nuevo usuario y que queremos crear una cuenta.</w:t>
+      </w:r>
+    </w:p>
+    <w:p>
+      <w:pPr>
+        <w:pStyle w:val="Normal"/>
+        <w:spacing w:before="0" w:after="120"/>
+        <w:ind w:hanging="0" w:left="0"/>
+        <w:jc w:val="both"/>
+        <w:rPr>
+          <w:color w:val="auto"/>
+        </w:rPr>
+      </w:pPr>
+      <w:r>
+        <w:drawing>
+          <wp:anchor behindDoc="0" distT="0" distB="0" distL="0" distR="0" simplePos="0" locked="0" layoutInCell="0" allowOverlap="1" relativeHeight="11">
+            <wp:simplePos x="0" y="0"/>
+            <wp:positionH relativeFrom="column">
+              <wp:posOffset>6985</wp:posOffset>
+            </wp:positionH>
+            <wp:positionV relativeFrom="paragraph">
+              <wp:posOffset>635</wp:posOffset>
+            </wp:positionV>
+            <wp:extent cx="1883410" cy="4140835"/>
+            <wp:effectExtent l="0" t="0" r="0" b="0"/>
+            <wp:wrapSquare wrapText="largest"/>
+            <wp:docPr id="18" name="Imagen10" descr=""/>
+            <wp:cNvGraphicFramePr>
+              <a:graphicFrameLocks xmlns:a="http://schemas.openxmlformats.org/drawingml/2006/main" noChangeAspect="1"/>
+            </wp:cNvGraphicFramePr>
+            <a:graphic xmlns:a="http://schemas.openxmlformats.org/drawingml/2006/main">
+              <a:graphicData uri="http://schemas.openxmlformats.org/drawingml/2006/picture">
+                <pic:pic xmlns:pic="http://schemas.openxmlformats.org/drawingml/2006/picture">
+                  <pic:nvPicPr>
+                    <pic:cNvPr id="18" name="Imagen10" descr=""/>
+                    <pic:cNvPicPr>
+                      <a:picLocks noChangeAspect="1" noChangeArrowheads="1"/>
+                    </pic:cNvPicPr>
+                  </pic:nvPicPr>
+                  <pic:blipFill>
+                    <a:blip r:embed="rId20"/>
+                    <a:stretch>
+                      <a:fillRect/>
+                    </a:stretch>
+                  </pic:blipFill>
+                  <pic:spPr bwMode="auto">
+                    <a:xfrm>
+                      <a:off x="0" y="0"/>
+                      <a:ext cx="1883410" cy="4140835"/>
+                    </a:xfrm>
+                    <a:prstGeom prst="rect">
+                      <a:avLst/>
+                    </a:prstGeom>
+                  </pic:spPr>
+                </pic:pic>
+              </a:graphicData>
+            </a:graphic>
+          </wp:anchor>
+        </w:drawing>
+        <w:drawing>
+          <wp:anchor behindDoc="0" distT="0" distB="0" distL="0" distR="0" simplePos="0" locked="0" layoutInCell="0" allowOverlap="1" relativeHeight="12">
+            <wp:simplePos x="0" y="0"/>
+            <wp:positionH relativeFrom="column">
+              <wp:posOffset>2101215</wp:posOffset>
+            </wp:positionH>
+            <wp:positionV relativeFrom="paragraph">
+              <wp:posOffset>635</wp:posOffset>
+            </wp:positionV>
+            <wp:extent cx="1882775" cy="4142740"/>
+            <wp:effectExtent l="0" t="0" r="0" b="0"/>
+            <wp:wrapSquare wrapText="largest"/>
+            <wp:docPr id="19" name="Imagen11" descr=""/>
+            <wp:cNvGraphicFramePr>
+              <a:graphicFrameLocks xmlns:a="http://schemas.openxmlformats.org/drawingml/2006/main" noChangeAspect="1"/>
+            </wp:cNvGraphicFramePr>
+            <a:graphic xmlns:a="http://schemas.openxmlformats.org/drawingml/2006/main">
+              <a:graphicData uri="http://schemas.openxmlformats.org/drawingml/2006/picture">
+                <pic:pic xmlns:pic="http://schemas.openxmlformats.org/drawingml/2006/picture">
+                  <pic:nvPicPr>
+                    <pic:cNvPr id="19" name="Imagen11" descr=""/>
+                    <pic:cNvPicPr>
+                      <a:picLocks noChangeAspect="1" noChangeArrowheads="1"/>
+                    </pic:cNvPicPr>
+                  </pic:nvPicPr>
+                  <pic:blipFill>
+                    <a:blip r:embed="rId21"/>
+                    <a:stretch>
+                      <a:fillRect/>
+                    </a:stretch>
+                  </pic:blipFill>
+                  <pic:spPr bwMode="auto">
+                    <a:xfrm>
+                      <a:off x="0" y="0"/>
+                      <a:ext cx="1882775" cy="4142740"/>
+                    </a:xfrm>
+                    <a:prstGeom prst="rect">
+                      <a:avLst/>
+                    </a:prstGeom>
+                  </pic:spPr>
+                </pic:pic>
+              </a:graphicData>
+            </a:graphic>
+          </wp:anchor>
+        </w:drawing>
+        <w:drawing>
+          <wp:anchor behindDoc="0" distT="0" distB="0" distL="0" distR="0" simplePos="0" locked="0" layoutInCell="0" allowOverlap="1" relativeHeight="13">
+            <wp:simplePos x="0" y="0"/>
+            <wp:positionH relativeFrom="column">
+              <wp:posOffset>4195445</wp:posOffset>
+            </wp:positionH>
+            <wp:positionV relativeFrom="paragraph">
+              <wp:posOffset>17780</wp:posOffset>
+            </wp:positionV>
+            <wp:extent cx="1873250" cy="4093845"/>
+            <wp:effectExtent l="0" t="0" r="0" b="0"/>
+            <wp:wrapSquare wrapText="largest"/>
+            <wp:docPr id="20" name="Imagen12" descr=""/>
+            <wp:cNvGraphicFramePr>
+              <a:graphicFrameLocks xmlns:a="http://schemas.openxmlformats.org/drawingml/2006/main" noChangeAspect="1"/>
+            </wp:cNvGraphicFramePr>
+            <a:graphic xmlns:a="http://schemas.openxmlformats.org/drawingml/2006/main">
+              <a:graphicData uri="http://schemas.openxmlformats.org/drawingml/2006/picture">
+                <pic:pic xmlns:pic="http://schemas.openxmlformats.org/drawingml/2006/picture">
+                  <pic:nvPicPr>
+                    <pic:cNvPr id="20" name="Imagen12" descr=""/>
+                    <pic:cNvPicPr>
+                      <a:picLocks noChangeAspect="1" noChangeArrowheads="1"/>
+                    </pic:cNvPicPr>
+                  </pic:nvPicPr>
+                  <pic:blipFill>
+                    <a:blip r:embed="rId22"/>
+                    <a:stretch>
+                      <a:fillRect/>
+                    </a:stretch>
+                  </pic:blipFill>
+                  <pic:spPr bwMode="auto">
+                    <a:xfrm>
+                      <a:off x="0" y="0"/>
+                      <a:ext cx="1873250" cy="4093845"/>
+                    </a:xfrm>
+                    <a:prstGeom prst="rect">
+                      <a:avLst/>
+                    </a:prstGeom>
+                  </pic:spPr>
+                </pic:pic>
+              </a:graphicData>
+            </a:graphic>
+          </wp:anchor>
+        </w:drawing>
+      </w:r>
+      <w:r>
+        <w:rPr>
+          <w:b w:val="false"/>
+          <w:bCs w:val="false"/>
+          <w:i w:val="false"/>
+          <w:iCs w:val="false"/>
+          <w:color w:val="auto"/>
+        </w:rPr>
+        <w:br/>
+        <w:br/>
+        <w:br/>
+        <w:br/>
+        <w:br/>
+        <w:br/>
+        <w:br/>
+        <w:br/>
+        <w:br/>
+        <w:br/>
+        <w:br/>
+        <w:br/>
+        <w:br/>
+        <w:br/>
+        <w:br/>
+        <w:br/>
+        <w:br/>
+        <w:br/>
+        <w:br/>
+        <w:br/>
+        <w:br/>
+      </w:r>
+    </w:p>
+    <w:p>
+      <w:pPr>
+        <w:pStyle w:val="Normal"/>
+        <w:spacing w:before="0" w:after="120"/>
+        <w:ind w:hanging="0" w:left="0"/>
+        <w:jc w:val="both"/>
+        <w:rPr>
+          <w:color w:val="auto"/>
+        </w:rPr>
+      </w:pPr>
+      <w:r>
+        <w:rPr/>
+      </w:r>
+    </w:p>
+    <w:p>
+      <w:pPr>
+        <w:pStyle w:val="Normal"/>
+        <w:spacing w:before="0" w:after="120"/>
+        <w:ind w:hanging="0" w:left="0"/>
+        <w:jc w:val="both"/>
+        <w:rPr>
+          <w:color w:val="auto"/>
+        </w:rPr>
+      </w:pPr>
+      <w:r>
+        <w:rPr/>
+      </w:r>
+    </w:p>
+    <w:p>
+      <w:pPr>
+        <w:pStyle w:val="Normal"/>
+        <w:spacing w:before="0" w:after="120"/>
+        <w:ind w:hanging="0" w:left="0"/>
+        <w:jc w:val="both"/>
+        <w:rPr>
+          <w:color w:val="auto"/>
+        </w:rPr>
+      </w:pPr>
+      <w:r>
+        <w:rPr/>
+      </w:r>
+    </w:p>
+    <w:p>
+      <w:pPr>
+        <w:pStyle w:val="Normal"/>
+        <w:spacing w:before="0" w:after="120"/>
+        <w:ind w:hanging="0" w:left="0"/>
+        <w:jc w:val="both"/>
+        <w:rPr>
+          <w:color w:val="auto"/>
+        </w:rPr>
+      </w:pPr>
+      <w:r>
+        <w:rPr/>
+      </w:r>
+    </w:p>
+    <w:p>
+      <w:pPr>
+        <w:pStyle w:val="Normal"/>
+        <w:spacing w:before="0" w:after="120"/>
+        <w:ind w:hanging="0" w:left="0"/>
+        <w:jc w:val="both"/>
+        <w:rPr>
+          <w:color w:val="auto"/>
+        </w:rPr>
+      </w:pPr>
+      <w:r>
+        <w:rPr/>
+      </w:r>
+    </w:p>
+    <w:p>
+      <w:pPr>
+        <w:pStyle w:val="Normal"/>
+        <w:spacing w:before="0" w:after="120"/>
+        <w:ind w:hanging="0" w:left="0"/>
+        <w:jc w:val="both"/>
+        <w:rPr>
+          <w:color w:val="auto"/>
+        </w:rPr>
+      </w:pPr>
+      <w:r>
+        <w:rPr/>
+      </w:r>
+      <w:r>
+        <w:br w:type="page"/>
+      </w:r>
+    </w:p>
+    <w:p>
+      <w:pPr>
+        <w:pStyle w:val="Normal"/>
+        <w:spacing w:before="0" w:after="120"/>
+        <w:ind w:hanging="0" w:left="0"/>
+        <w:jc w:val="both"/>
+        <w:rPr>
+          <w:color w:val="auto"/>
+        </w:rPr>
+      </w:pPr>
+      <w:r>
+        <w:rPr>
+          <w:b w:val="false"/>
+          <w:bCs w:val="false"/>
+          <w:i w:val="false"/>
+          <w:iCs w:val="false"/>
+          <w:color w:val="auto"/>
+        </w:rPr>
+        <w:t>Desde el menú de inicio podemos navegar a varias partes de la aplicación, aunque la más importante es la de crear una campaña. En las siguientes capturas se muestra el flujo más común a la hora de crear y añadir contenido a una campaña.</w:t>
+      </w:r>
+    </w:p>
+    <w:p>
+      <w:pPr>
+        <w:pStyle w:val="Normal"/>
+        <w:spacing w:before="0" w:after="120"/>
+        <w:ind w:hanging="0" w:left="0"/>
+        <w:jc w:val="both"/>
+        <w:rPr>
+          <w:color w:val="auto"/>
+        </w:rPr>
+      </w:pPr>
+      <w:r>
+        <w:rPr>
+          <w:b w:val="false"/>
+          <w:bCs w:val="false"/>
+          <w:i w:val="false"/>
+          <w:iCs w:val="false"/>
+          <w:color w:val="auto"/>
+        </w:rPr>
+        <w:drawing>
+          <wp:anchor behindDoc="0" distT="0" distB="0" distL="0" distR="0" simplePos="0" locked="0" layoutInCell="0" allowOverlap="1" relativeHeight="14">
+            <wp:simplePos x="0" y="0"/>
+            <wp:positionH relativeFrom="column">
+              <wp:posOffset>-16510</wp:posOffset>
+            </wp:positionH>
+            <wp:positionV relativeFrom="paragraph">
+              <wp:posOffset>-17780</wp:posOffset>
+            </wp:positionV>
+            <wp:extent cx="1856105" cy="4135120"/>
+            <wp:effectExtent l="0" t="0" r="0" b="0"/>
+            <wp:wrapSquare wrapText="largest"/>
+            <wp:docPr id="21" name="Imagen14" descr=""/>
+            <wp:cNvGraphicFramePr>
+              <a:graphicFrameLocks xmlns:a="http://schemas.openxmlformats.org/drawingml/2006/main" noChangeAspect="1"/>
+            </wp:cNvGraphicFramePr>
+            <a:graphic xmlns:a="http://schemas.openxmlformats.org/drawingml/2006/main">
+              <a:graphicData uri="http://schemas.openxmlformats.org/drawingml/2006/picture">
+                <pic:pic xmlns:pic="http://schemas.openxmlformats.org/drawingml/2006/picture">
+                  <pic:nvPicPr>
+                    <pic:cNvPr id="21" name="Imagen14" descr=""/>
+                    <pic:cNvPicPr>
+                      <a:picLocks noChangeAspect="1" noChangeArrowheads="1"/>
+                    </pic:cNvPicPr>
+                  </pic:nvPicPr>
+                  <pic:blipFill>
+                    <a:blip r:embed="rId23"/>
+                    <a:stretch>
+                      <a:fillRect/>
+                    </a:stretch>
+                  </pic:blipFill>
+                  <pic:spPr bwMode="auto">
+                    <a:xfrm>
+                      <a:off x="0" y="0"/>
+                      <a:ext cx="1856105" cy="4135120"/>
+                    </a:xfrm>
+                    <a:prstGeom prst="rect">
+                      <a:avLst/>
+                    </a:prstGeom>
+                  </pic:spPr>
+                </pic:pic>
+              </a:graphicData>
+            </a:graphic>
+          </wp:anchor>
+        </w:drawing>
+        <w:drawing>
+          <wp:anchor behindDoc="0" distT="0" distB="0" distL="0" distR="0" simplePos="0" locked="0" layoutInCell="0" allowOverlap="1" relativeHeight="15">
+            <wp:simplePos x="0" y="0"/>
+            <wp:positionH relativeFrom="column">
+              <wp:posOffset>1939925</wp:posOffset>
+            </wp:positionH>
+            <wp:positionV relativeFrom="paragraph">
+              <wp:posOffset>635</wp:posOffset>
+            </wp:positionV>
+            <wp:extent cx="1859280" cy="4114165"/>
+            <wp:effectExtent l="0" t="0" r="0" b="0"/>
+            <wp:wrapSquare wrapText="largest"/>
+            <wp:docPr id="22" name="Imagen13" descr=""/>
+            <wp:cNvGraphicFramePr>
+              <a:graphicFrameLocks xmlns:a="http://schemas.openxmlformats.org/drawingml/2006/main" noChangeAspect="1"/>
+            </wp:cNvGraphicFramePr>
+            <a:graphic xmlns:a="http://schemas.openxmlformats.org/drawingml/2006/main">
+              <a:graphicData uri="http://schemas.openxmlformats.org/drawingml/2006/picture">
+                <pic:pic xmlns:pic="http://schemas.openxmlformats.org/drawingml/2006/picture">
+                  <pic:nvPicPr>
+                    <pic:cNvPr id="22" name="Imagen13" descr=""/>
+                    <pic:cNvPicPr>
+                      <a:picLocks noChangeAspect="1" noChangeArrowheads="1"/>
+                    </pic:cNvPicPr>
+                  </pic:nvPicPr>
+                  <pic:blipFill>
+                    <a:blip r:embed="rId24"/>
+                    <a:stretch>
+                      <a:fillRect/>
+                    </a:stretch>
+                  </pic:blipFill>
+                  <pic:spPr bwMode="auto">
+                    <a:xfrm>
+                      <a:off x="0" y="0"/>
+                      <a:ext cx="1859280" cy="4114165"/>
+                    </a:xfrm>
+                    <a:prstGeom prst="rect">
+                      <a:avLst/>
+                    </a:prstGeom>
+                  </pic:spPr>
+                </pic:pic>
+              </a:graphicData>
+            </a:graphic>
+          </wp:anchor>
+        </w:drawing>
+        <w:drawing>
+          <wp:anchor behindDoc="0" distT="0" distB="0" distL="0" distR="0" simplePos="0" locked="0" layoutInCell="0" allowOverlap="1" relativeHeight="16">
+            <wp:simplePos x="0" y="0"/>
+            <wp:positionH relativeFrom="column">
+              <wp:posOffset>3886200</wp:posOffset>
+            </wp:positionH>
+            <wp:positionV relativeFrom="paragraph">
+              <wp:posOffset>635</wp:posOffset>
+            </wp:positionV>
+            <wp:extent cx="1849755" cy="4114165"/>
+            <wp:effectExtent l="0" t="0" r="0" b="0"/>
+            <wp:wrapSquare wrapText="largest"/>
+            <wp:docPr id="23" name="Imagen15" descr=""/>
+            <wp:cNvGraphicFramePr>
+              <a:graphicFrameLocks xmlns:a="http://schemas.openxmlformats.org/drawingml/2006/main" noChangeAspect="1"/>
+            </wp:cNvGraphicFramePr>
+            <a:graphic xmlns:a="http://schemas.openxmlformats.org/drawingml/2006/main">
+              <a:graphicData uri="http://schemas.openxmlformats.org/drawingml/2006/picture">
+                <pic:pic xmlns:pic="http://schemas.openxmlformats.org/drawingml/2006/picture">
+                  <pic:nvPicPr>
+                    <pic:cNvPr id="23" name="Imagen15" descr=""/>
+                    <pic:cNvPicPr>
+                      <a:picLocks noChangeAspect="1" noChangeArrowheads="1"/>
+                    </pic:cNvPicPr>
+                  </pic:nvPicPr>
+                  <pic:blipFill>
+                    <a:blip r:embed="rId25"/>
+                    <a:stretch>
+                      <a:fillRect/>
+                    </a:stretch>
+                  </pic:blipFill>
+                  <pic:spPr bwMode="auto">
+                    <a:xfrm>
+                      <a:off x="0" y="0"/>
+                      <a:ext cx="1849755" cy="4114165"/>
+                    </a:xfrm>
+                    <a:prstGeom prst="rect">
+                      <a:avLst/>
+                    </a:prstGeom>
+                  </pic:spPr>
+                </pic:pic>
+              </a:graphicData>
+            </a:graphic>
+          </wp:anchor>
+        </w:drawing>
+        <w:br/>
+        <w:br/>
+        <w:br/>
+        <w:br/>
+        <w:br/>
+        <w:br/>
+        <w:br/>
+        <w:br/>
+        <w:br/>
+        <w:br/>
+        <w:br/>
+        <w:br/>
+        <w:br/>
+        <w:br/>
+        <w:br/>
+        <w:br/>
+        <w:br/>
+        <w:br/>
+        <w:br/>
+        <w:br/>
+        <w:br/>
+        <w:br/>
+        <w:br/>
+        <w:br/>
+        <w:br/>
+        <w:br/>
+        <w:br/>
+        <w:br/>
+        <w:br/>
+        <w:br/>
+      </w:r>
+      <w:r>
+        <w:drawing>
+          <wp:anchor behindDoc="0" distT="0" distB="0" distL="0" distR="0" simplePos="0" locked="0" layoutInCell="0" allowOverlap="1" relativeHeight="17">
+            <wp:simplePos x="0" y="0"/>
+            <wp:positionH relativeFrom="column">
+              <wp:posOffset>-16510</wp:posOffset>
+            </wp:positionH>
+            <wp:positionV relativeFrom="paragraph">
+              <wp:posOffset>4203065</wp:posOffset>
+            </wp:positionV>
+            <wp:extent cx="1856105" cy="4114165"/>
+            <wp:effectExtent l="0" t="0" r="0" b="0"/>
+            <wp:wrapSquare wrapText="largest"/>
+            <wp:docPr id="24" name="Imagen16" descr=""/>
+            <wp:cNvGraphicFramePr>
+              <a:graphicFrameLocks xmlns:a="http://schemas.openxmlformats.org/drawingml/2006/main" noChangeAspect="1"/>
+            </wp:cNvGraphicFramePr>
+            <a:graphic xmlns:a="http://schemas.openxmlformats.org/drawingml/2006/main">
+              <a:graphicData uri="http://schemas.openxmlformats.org/drawingml/2006/picture">
+                <pic:pic xmlns:pic="http://schemas.openxmlformats.org/drawingml/2006/picture">
+                  <pic:nvPicPr>
+                    <pic:cNvPr id="24" name="Imagen16" descr=""/>
+                    <pic:cNvPicPr>
+                      <a:picLocks noChangeAspect="1" noChangeArrowheads="1"/>
+                    </pic:cNvPicPr>
+                  </pic:nvPicPr>
+                  <pic:blipFill>
+                    <a:blip r:embed="rId26"/>
+                    <a:stretch>
+                      <a:fillRect/>
+                    </a:stretch>
+                  </pic:blipFill>
+                  <pic:spPr bwMode="auto">
+                    <a:xfrm>
+                      <a:off x="0" y="0"/>
+                      <a:ext cx="1856105" cy="4114165"/>
+                    </a:xfrm>
+                    <a:prstGeom prst="rect">
+                      <a:avLst/>
+                    </a:prstGeom>
+                  </pic:spPr>
+                </pic:pic>
+              </a:graphicData>
+            </a:graphic>
+          </wp:anchor>
+        </w:drawing>
+        <w:drawing>
+          <wp:anchor behindDoc="0" distT="0" distB="0" distL="0" distR="0" simplePos="0" locked="0" layoutInCell="0" allowOverlap="1" relativeHeight="18">
+            <wp:simplePos x="0" y="0"/>
+            <wp:positionH relativeFrom="column">
+              <wp:posOffset>1917700</wp:posOffset>
+            </wp:positionH>
+            <wp:positionV relativeFrom="paragraph">
+              <wp:posOffset>4208145</wp:posOffset>
+            </wp:positionV>
+            <wp:extent cx="1875155" cy="4114165"/>
+            <wp:effectExtent l="0" t="0" r="0" b="0"/>
+            <wp:wrapSquare wrapText="largest"/>
+            <wp:docPr id="25" name="Imagen17" descr=""/>
+            <wp:cNvGraphicFramePr>
+              <a:graphicFrameLocks xmlns:a="http://schemas.openxmlformats.org/drawingml/2006/main" noChangeAspect="1"/>
+            </wp:cNvGraphicFramePr>
+            <a:graphic xmlns:a="http://schemas.openxmlformats.org/drawingml/2006/main">
+              <a:graphicData uri="http://schemas.openxmlformats.org/drawingml/2006/picture">
+                <pic:pic xmlns:pic="http://schemas.openxmlformats.org/drawingml/2006/picture">
+                  <pic:nvPicPr>
+                    <pic:cNvPr id="25" name="Imagen17" descr=""/>
+                    <pic:cNvPicPr>
+                      <a:picLocks noChangeAspect="1" noChangeArrowheads="1"/>
+                    </pic:cNvPicPr>
+                  </pic:nvPicPr>
+                  <pic:blipFill>
+                    <a:blip r:embed="rId27"/>
+                    <a:stretch>
+                      <a:fillRect/>
+                    </a:stretch>
+                  </pic:blipFill>
+                  <pic:spPr bwMode="auto">
+                    <a:xfrm>
+                      <a:off x="0" y="0"/>
+                      <a:ext cx="1875155" cy="4114165"/>
+                    </a:xfrm>
+                    <a:prstGeom prst="rect">
+                      <a:avLst/>
+                    </a:prstGeom>
+                  </pic:spPr>
+                </pic:pic>
+              </a:graphicData>
+            </a:graphic>
+          </wp:anchor>
+        </w:drawing>
+        <w:drawing>
+          <wp:anchor behindDoc="0" distT="0" distB="0" distL="0" distR="0" simplePos="0" locked="0" layoutInCell="0" allowOverlap="1" relativeHeight="19">
+            <wp:simplePos x="0" y="0"/>
+            <wp:positionH relativeFrom="column">
+              <wp:posOffset>3899535</wp:posOffset>
+            </wp:positionH>
+            <wp:positionV relativeFrom="paragraph">
+              <wp:posOffset>4234180</wp:posOffset>
+            </wp:positionV>
+            <wp:extent cx="1877060" cy="4114165"/>
+            <wp:effectExtent l="0" t="0" r="0" b="0"/>
+            <wp:wrapSquare wrapText="largest"/>
+            <wp:docPr id="26" name="Imagen18" descr=""/>
+            <wp:cNvGraphicFramePr>
+              <a:graphicFrameLocks xmlns:a="http://schemas.openxmlformats.org/drawingml/2006/main" noChangeAspect="1"/>
+            </wp:cNvGraphicFramePr>
+            <a:graphic xmlns:a="http://schemas.openxmlformats.org/drawingml/2006/main">
+              <a:graphicData uri="http://schemas.openxmlformats.org/drawingml/2006/picture">
+                <pic:pic xmlns:pic="http://schemas.openxmlformats.org/drawingml/2006/picture">
+                  <pic:nvPicPr>
+                    <pic:cNvPr id="26" name="Imagen18" descr=""/>
+                    <pic:cNvPicPr>
+                      <a:picLocks noChangeAspect="1" noChangeArrowheads="1"/>
+                    </pic:cNvPicPr>
+                  </pic:nvPicPr>
+                  <pic:blipFill>
+                    <a:blip r:embed="rId28"/>
+                    <a:stretch>
+                      <a:fillRect/>
+                    </a:stretch>
+                  </pic:blipFill>
+                  <pic:spPr bwMode="auto">
+                    <a:xfrm>
+                      <a:off x="0" y="0"/>
+                      <a:ext cx="1877060" cy="4114165"/>
+                    </a:xfrm>
+                    <a:prstGeom prst="rect">
+                      <a:avLst/>
+                    </a:prstGeom>
+                  </pic:spPr>
+                </pic:pic>
+              </a:graphicData>
+            </a:graphic>
+          </wp:anchor>
+        </w:drawing>
+      </w:r>
+      <w:r>
+        <w:rPr>
+          <w:b w:val="false"/>
+          <w:bCs w:val="false"/>
+          <w:i w:val="false"/>
+          <w:iCs w:val="false"/>
+          <w:color w:val="auto"/>
+        </w:rPr>
+        <w:br/>
+        <w:br/>
+        <w:br/>
+        <w:br/>
+        <w:br/>
+        <w:br/>
+        <w:br/>
+        <w:br/>
+        <w:br/>
+        <w:br/>
+        <w:br/>
+        <w:br/>
+        <w:br/>
+        <w:br/>
+        <w:br/>
+        <w:br/>
+        <w:br/>
+        <w:br/>
+        <w:br/>
+        <w:br/>
+        <w:br/>
+        <w:br/>
+        <w:br/>
+        <w:br/>
+        <w:br/>
+        <w:br/>
+        <w:br/>
+        <w:br/>
+        <w:br/>
+        <w:br/>
+      </w:r>
+    </w:p>
+    <w:p>
+      <w:pPr>
+        <w:pStyle w:val="Normal"/>
+        <w:spacing w:before="0" w:after="120"/>
+        <w:ind w:hanging="0" w:left="0"/>
+        <w:jc w:val="both"/>
+        <w:rPr>
+          <w:color w:val="auto"/>
+        </w:rPr>
+      </w:pPr>
+      <w:r>
+        <w:rPr/>
+      </w:r>
+    </w:p>
+    <w:p>
+      <w:pPr>
+        <w:pStyle w:val="Normal"/>
+        <w:spacing w:before="0" w:after="120"/>
+        <w:ind w:hanging="0" w:left="0"/>
+        <w:jc w:val="both"/>
+        <w:rPr>
+          <w:color w:val="auto"/>
+        </w:rPr>
+      </w:pPr>
+      <w:r>
+        <w:rPr/>
+      </w:r>
+    </w:p>
+    <w:p>
+      <w:pPr>
+        <w:pStyle w:val="Normal"/>
+        <w:spacing w:before="0" w:after="120"/>
+        <w:ind w:hanging="0" w:left="0"/>
+        <w:jc w:val="both"/>
+        <w:rPr>
+          <w:color w:val="auto"/>
+        </w:rPr>
+      </w:pPr>
+      <w:r>
+        <w:drawing>
+          <wp:anchor behindDoc="0" distT="0" distB="0" distL="0" distR="0" simplePos="0" locked="0" layoutInCell="0" allowOverlap="1" relativeHeight="20">
+            <wp:simplePos x="0" y="0"/>
+            <wp:positionH relativeFrom="column">
+              <wp:posOffset>21590</wp:posOffset>
+            </wp:positionH>
+            <wp:positionV relativeFrom="paragraph">
+              <wp:posOffset>-34925</wp:posOffset>
+            </wp:positionV>
+            <wp:extent cx="1823085" cy="4023360"/>
+            <wp:effectExtent l="0" t="0" r="0" b="0"/>
+            <wp:wrapSquare wrapText="largest"/>
+            <wp:docPr id="27" name="Imagen19" descr=""/>
+            <wp:cNvGraphicFramePr>
+              <a:graphicFrameLocks xmlns:a="http://schemas.openxmlformats.org/drawingml/2006/main" noChangeAspect="1"/>
+            </wp:cNvGraphicFramePr>
+            <a:graphic xmlns:a="http://schemas.openxmlformats.org/drawingml/2006/main">
+              <a:graphicData uri="http://schemas.openxmlformats.org/drawingml/2006/picture">
+                <pic:pic xmlns:pic="http://schemas.openxmlformats.org/drawingml/2006/picture">
+                  <pic:nvPicPr>
+                    <pic:cNvPr id="27" name="Imagen19" descr=""/>
+                    <pic:cNvPicPr>
+                      <a:picLocks noChangeAspect="1" noChangeArrowheads="1"/>
+                    </pic:cNvPicPr>
+                  </pic:nvPicPr>
+                  <pic:blipFill>
+                    <a:blip r:embed="rId29"/>
+                    <a:stretch>
+                      <a:fillRect/>
+                    </a:stretch>
+                  </pic:blipFill>
+                  <pic:spPr bwMode="auto">
+                    <a:xfrm>
+                      <a:off x="0" y="0"/>
+                      <a:ext cx="1823085" cy="4023360"/>
+                    </a:xfrm>
+                    <a:prstGeom prst="rect">
+                      <a:avLst/>
+                    </a:prstGeom>
+                  </pic:spPr>
+                </pic:pic>
+              </a:graphicData>
+            </a:graphic>
+          </wp:anchor>
+        </w:drawing>
+        <w:drawing>
+          <wp:anchor behindDoc="0" distT="0" distB="0" distL="0" distR="0" simplePos="0" locked="0" layoutInCell="0" allowOverlap="1" relativeHeight="21">
+            <wp:simplePos x="0" y="0"/>
+            <wp:positionH relativeFrom="column">
+              <wp:posOffset>1939290</wp:posOffset>
+            </wp:positionH>
+            <wp:positionV relativeFrom="paragraph">
+              <wp:posOffset>635</wp:posOffset>
+            </wp:positionV>
+            <wp:extent cx="1797050" cy="3952875"/>
+            <wp:effectExtent l="0" t="0" r="0" b="0"/>
+            <wp:wrapSquare wrapText="largest"/>
+            <wp:docPr id="28" name="Imagen20" descr=""/>
+            <wp:cNvGraphicFramePr>
+              <a:graphicFrameLocks xmlns:a="http://schemas.openxmlformats.org/drawingml/2006/main" noChangeAspect="1"/>
+            </wp:cNvGraphicFramePr>
+            <a:graphic xmlns:a="http://schemas.openxmlformats.org/drawingml/2006/main">
+              <a:graphicData uri="http://schemas.openxmlformats.org/drawingml/2006/picture">
+                <pic:pic xmlns:pic="http://schemas.openxmlformats.org/drawingml/2006/picture">
+                  <pic:nvPicPr>
+                    <pic:cNvPr id="28" name="Imagen20" descr=""/>
+                    <pic:cNvPicPr>
+                      <a:picLocks noChangeAspect="1" noChangeArrowheads="1"/>
+                    </pic:cNvPicPr>
+                  </pic:nvPicPr>
+                  <pic:blipFill>
+                    <a:blip r:embed="rId30"/>
+                    <a:stretch>
+                      <a:fillRect/>
+                    </a:stretch>
+                  </pic:blipFill>
+                  <pic:spPr bwMode="auto">
+                    <a:xfrm>
+                      <a:off x="0" y="0"/>
+                      <a:ext cx="1797050" cy="3952875"/>
+                    </a:xfrm>
+                    <a:prstGeom prst="rect">
+                      <a:avLst/>
+                    </a:prstGeom>
+                  </pic:spPr>
+                </pic:pic>
+              </a:graphicData>
+            </a:graphic>
+          </wp:anchor>
+        </w:drawing>
+        <w:drawing>
+          <wp:anchor behindDoc="0" distT="0" distB="0" distL="0" distR="0" simplePos="0" locked="0" layoutInCell="0" allowOverlap="1" relativeHeight="22">
+            <wp:simplePos x="0" y="0"/>
+            <wp:positionH relativeFrom="column">
+              <wp:posOffset>3821430</wp:posOffset>
+            </wp:positionH>
+            <wp:positionV relativeFrom="paragraph">
+              <wp:posOffset>635</wp:posOffset>
+            </wp:positionV>
+            <wp:extent cx="1790700" cy="3952875"/>
+            <wp:effectExtent l="0" t="0" r="0" b="0"/>
+            <wp:wrapSquare wrapText="largest"/>
+            <wp:docPr id="29" name="Imagen21" descr=""/>
+            <wp:cNvGraphicFramePr>
+              <a:graphicFrameLocks xmlns:a="http://schemas.openxmlformats.org/drawingml/2006/main" noChangeAspect="1"/>
+            </wp:cNvGraphicFramePr>
+            <a:graphic xmlns:a="http://schemas.openxmlformats.org/drawingml/2006/main">
+              <a:graphicData uri="http://schemas.openxmlformats.org/drawingml/2006/picture">
+                <pic:pic xmlns:pic="http://schemas.openxmlformats.org/drawingml/2006/picture">
+                  <pic:nvPicPr>
+                    <pic:cNvPr id="29" name="Imagen21" descr=""/>
+                    <pic:cNvPicPr>
+                      <a:picLocks noChangeAspect="1" noChangeArrowheads="1"/>
+                    </pic:cNvPicPr>
+                  </pic:nvPicPr>
+                  <pic:blipFill>
+                    <a:blip r:embed="rId31"/>
+                    <a:stretch>
+                      <a:fillRect/>
+                    </a:stretch>
+                  </pic:blipFill>
+                  <pic:spPr bwMode="auto">
+                    <a:xfrm>
+                      <a:off x="0" y="0"/>
+                      <a:ext cx="1790700" cy="3952875"/>
+                    </a:xfrm>
+                    <a:prstGeom prst="rect">
+                      <a:avLst/>
+                    </a:prstGeom>
+                  </pic:spPr>
+                </pic:pic>
+              </a:graphicData>
+            </a:graphic>
+          </wp:anchor>
+        </w:drawing>
+        <w:drawing>
+          <wp:anchor behindDoc="0" distT="0" distB="0" distL="0" distR="0" simplePos="0" locked="0" layoutInCell="0" allowOverlap="1" relativeHeight="23">
+            <wp:simplePos x="0" y="0"/>
+            <wp:positionH relativeFrom="column">
+              <wp:posOffset>16510</wp:posOffset>
+            </wp:positionH>
+            <wp:positionV relativeFrom="paragraph">
+              <wp:posOffset>4077970</wp:posOffset>
+            </wp:positionV>
+            <wp:extent cx="1833245" cy="3996055"/>
+            <wp:effectExtent l="0" t="0" r="0" b="0"/>
+            <wp:wrapSquare wrapText="largest"/>
+            <wp:docPr id="30" name="Imagen22" descr=""/>
+            <wp:cNvGraphicFramePr>
+              <a:graphicFrameLocks xmlns:a="http://schemas.openxmlformats.org/drawingml/2006/main" noChangeAspect="1"/>
+            </wp:cNvGraphicFramePr>
+            <a:graphic xmlns:a="http://schemas.openxmlformats.org/drawingml/2006/main">
+              <a:graphicData uri="http://schemas.openxmlformats.org/drawingml/2006/picture">
+                <pic:pic xmlns:pic="http://schemas.openxmlformats.org/drawingml/2006/picture">
+                  <pic:nvPicPr>
+                    <pic:cNvPr id="30" name="Imagen22" descr=""/>
+                    <pic:cNvPicPr>
+                      <a:picLocks noChangeAspect="1" noChangeArrowheads="1"/>
+                    </pic:cNvPicPr>
+                  </pic:nvPicPr>
+                  <pic:blipFill>
+                    <a:blip r:embed="rId32"/>
+                    <a:stretch>
+                      <a:fillRect/>
+                    </a:stretch>
+                  </pic:blipFill>
+                  <pic:spPr bwMode="auto">
+                    <a:xfrm>
+                      <a:off x="0" y="0"/>
+                      <a:ext cx="1833245" cy="3996055"/>
+                    </a:xfrm>
+                    <a:prstGeom prst="rect">
+                      <a:avLst/>
+                    </a:prstGeom>
+                  </pic:spPr>
+                </pic:pic>
+              </a:graphicData>
+            </a:graphic>
+          </wp:anchor>
+        </w:drawing>
+        <w:drawing>
+          <wp:anchor behindDoc="0" distT="0" distB="0" distL="0" distR="0" simplePos="0" locked="0" layoutInCell="0" allowOverlap="1" relativeHeight="24">
+            <wp:simplePos x="0" y="0"/>
+            <wp:positionH relativeFrom="column">
+              <wp:posOffset>1966595</wp:posOffset>
+            </wp:positionH>
+            <wp:positionV relativeFrom="paragraph">
+              <wp:posOffset>4112895</wp:posOffset>
+            </wp:positionV>
+            <wp:extent cx="1794510" cy="3952875"/>
+            <wp:effectExtent l="0" t="0" r="0" b="0"/>
+            <wp:wrapSquare wrapText="largest"/>
+            <wp:docPr id="31" name="Imagen23" descr=""/>
+            <wp:cNvGraphicFramePr>
+              <a:graphicFrameLocks xmlns:a="http://schemas.openxmlformats.org/drawingml/2006/main" noChangeAspect="1"/>
+            </wp:cNvGraphicFramePr>
+            <a:graphic xmlns:a="http://schemas.openxmlformats.org/drawingml/2006/main">
+              <a:graphicData uri="http://schemas.openxmlformats.org/drawingml/2006/picture">
+                <pic:pic xmlns:pic="http://schemas.openxmlformats.org/drawingml/2006/picture">
+                  <pic:nvPicPr>
+                    <pic:cNvPr id="31" name="Imagen23" descr=""/>
+                    <pic:cNvPicPr>
+                      <a:picLocks noChangeAspect="1" noChangeArrowheads="1"/>
+                    </pic:cNvPicPr>
+                  </pic:nvPicPr>
+                  <pic:blipFill>
+                    <a:blip r:embed="rId33"/>
+                    <a:stretch>
+                      <a:fillRect/>
+                    </a:stretch>
+                  </pic:blipFill>
+                  <pic:spPr bwMode="auto">
+                    <a:xfrm>
+                      <a:off x="0" y="0"/>
+                      <a:ext cx="1794510" cy="3952875"/>
+                    </a:xfrm>
+                    <a:prstGeom prst="rect">
+                      <a:avLst/>
+                    </a:prstGeom>
+                  </pic:spPr>
+                </pic:pic>
+              </a:graphicData>
+            </a:graphic>
+          </wp:anchor>
+        </w:drawing>
+        <w:drawing>
+          <wp:anchor behindDoc="0" distT="0" distB="0" distL="0" distR="0" simplePos="0" locked="0" layoutInCell="0" allowOverlap="1" relativeHeight="25">
+            <wp:simplePos x="0" y="0"/>
+            <wp:positionH relativeFrom="column">
+              <wp:posOffset>3858260</wp:posOffset>
+            </wp:positionH>
+            <wp:positionV relativeFrom="paragraph">
+              <wp:posOffset>4114800</wp:posOffset>
+            </wp:positionV>
+            <wp:extent cx="1821180" cy="3952875"/>
+            <wp:effectExtent l="0" t="0" r="0" b="0"/>
+            <wp:wrapSquare wrapText="largest"/>
+            <wp:docPr id="32" name="Imagen24" descr=""/>
+            <wp:cNvGraphicFramePr>
+              <a:graphicFrameLocks xmlns:a="http://schemas.openxmlformats.org/drawingml/2006/main" noChangeAspect="1"/>
+            </wp:cNvGraphicFramePr>
+            <a:graphic xmlns:a="http://schemas.openxmlformats.org/drawingml/2006/main">
+              <a:graphicData uri="http://schemas.openxmlformats.org/drawingml/2006/picture">
+                <pic:pic xmlns:pic="http://schemas.openxmlformats.org/drawingml/2006/picture">
+                  <pic:nvPicPr>
+                    <pic:cNvPr id="32" name="Imagen24" descr=""/>
+                    <pic:cNvPicPr>
+                      <a:picLocks noChangeAspect="1" noChangeArrowheads="1"/>
+                    </pic:cNvPicPr>
+                  </pic:nvPicPr>
+                  <pic:blipFill>
+                    <a:blip r:embed="rId34"/>
+                    <a:stretch>
+                      <a:fillRect/>
+                    </a:stretch>
+                  </pic:blipFill>
+                  <pic:spPr bwMode="auto">
+                    <a:xfrm>
+                      <a:off x="0" y="0"/>
+                      <a:ext cx="1821180" cy="3952875"/>
+                    </a:xfrm>
+                    <a:prstGeom prst="rect">
+                      <a:avLst/>
+                    </a:prstGeom>
+                  </pic:spPr>
+                </pic:pic>
+              </a:graphicData>
+            </a:graphic>
+          </wp:anchor>
+        </w:drawing>
+      </w:r>
+      <w:r>
+        <w:rPr>
+          <w:b w:val="false"/>
+          <w:bCs w:val="false"/>
+          <w:i w:val="false"/>
+          <w:iCs w:val="false"/>
+          <w:color w:val="auto"/>
+        </w:rPr>
+        <w:br/>
+        <w:br/>
+        <w:br/>
+        <w:br/>
+        <w:br/>
+        <w:br/>
+        <w:br/>
+        <w:br/>
+        <w:br/>
+        <w:br/>
+        <w:br/>
+        <w:br/>
+        <w:br/>
+        <w:br/>
+        <w:br/>
+        <w:br/>
+        <w:br/>
+        <w:br/>
+        <w:br/>
+        <w:br/>
+        <w:br/>
+        <w:br/>
+        <w:br/>
+        <w:br/>
+        <w:br/>
+        <w:br/>
+        <w:br/>
+        <w:br/>
+        <w:br/>
+        <w:br/>
+        <w:br/>
+        <w:br/>
+        <w:br/>
+        <w:br/>
+        <w:br/>
+        <w:br/>
+        <w:br/>
+        <w:br/>
+        <w:br/>
+        <w:br/>
+        <w:br/>
+        <w:br/>
+        <w:br/>
+        <w:br/>
+        <w:br/>
+        <w:br/>
+        <w:br/>
+        <w:br/>
+        <w:br/>
+        <w:br/>
+        <w:br/>
+        <w:br/>
+        <w:br/>
+        <w:br/>
+        <w:br/>
+        <w:br/>
+        <w:br/>
+        <w:br/>
+        <w:br/>
+        <w:t>Todo el contenido que el usuario va creando en la APP se sincroniza (Si este cuenta con conexión a internet) con el servidor mediante la API, haciendo que varios usuarios puedan ver los cambios que crean los demás, logrando así el ambiente de APP colaborativa para la toma de notas.</w:t>
+      </w:r>
     </w:p>
     <w:sectPr>
-      <w:footerReference w:type="even" r:id="rId7"/>
-      <w:footerReference w:type="default" r:id="rId8"/>
-      <w:footerReference w:type="first" r:id="rId9"/>
+      <w:footerReference w:type="even" r:id="rId35"/>
+      <w:footerReference w:type="default" r:id="rId36"/>
+      <w:footerReference w:type="first" r:id="rId37"/>
       <w:type w:val="nextPage"/>
       <w:pgSz w:w="11906" w:h="16838"/>
       <w:pgMar w:left="1134" w:right="851" w:gutter="0" w:header="0" w:top="1134" w:footer="709" w:bottom="1134"/>
@@ -6724,7 +10254,7 @@
     <w:pPr>
       <w:widowControl/>
       <w:suppressAutoHyphens w:val="true"/>
-      <w:overflowPunct w:val="false"/>
+      <w:overflowPunct w:val="true"/>
       <w:bidi w:val="0"/>
       <w:spacing w:before="0" w:after="120"/>
       <w:ind w:firstLine="283" w:left="907"/>
@@ -7652,7 +11182,7 @@
         <w:tab w:val="clear" w:pos="907"/>
       </w:tabs>
       <w:suppressAutoHyphens w:val="false"/>
-      <w:overflowPunct w:val="true"/>
+      <w:overflowPunct w:val="false"/>
       <w:spacing w:lineRule="auto" w:line="259" w:before="240" w:after="0"/>
       <w:outlineLvl w:val="9"/>
     </w:pPr>
@@ -7675,7 +11205,7 @@
     <w:rsid w:val="003d528a"/>
     <w:pPr>
       <w:suppressAutoHyphens w:val="false"/>
-      <w:overflowPunct w:val="true"/>
+      <w:overflowPunct w:val="false"/>
       <w:spacing w:lineRule="auto" w:line="259" w:before="0" w:after="100"/>
       <w:ind w:hanging="0" w:left="220"/>
     </w:pPr>
@@ -7697,7 +11227,7 @@
     <w:rsid w:val="003d528a"/>
     <w:pPr>
       <w:suppressAutoHyphens w:val="false"/>
-      <w:overflowPunct w:val="true"/>
+      <w:overflowPunct w:val="false"/>
       <w:spacing w:lineRule="auto" w:line="259" w:before="0" w:after="100"/>
       <w:ind w:hanging="0" w:left="440"/>
     </w:pPr>

</xml_diff>

<commit_message>
Correciones menores y cambio de las imagenes de la memoria para reflejar la nueva interfaz
</commit_message>
<xml_diff>
--- a/Documentos/Memoria.docx
+++ b/Documentos/Memoria.docx
@@ -944,7 +944,7 @@
             <w:pPr>
               <w:pStyle w:val="Normal"/>
               <w:suppressAutoHyphens w:val="false"/>
-              <w:overflowPunct w:val="false"/>
+              <w:overflowPunct w:val="true"/>
               <w:spacing w:before="0" w:after="0"/>
               <w:ind w:hanging="0" w:left="0"/>
               <w:rPr>
@@ -2144,26 +2144,6 @@
           </w:p>
         </w:tc>
       </w:tr>
-    </w:tbl>
-    <w:tbl>
-      <w:tblPr>
-        <w:tblW w:w="8931" w:type="dxa"/>
-        <w:jc w:val="left"/>
-        <w:tblInd w:w="-5" w:type="dxa"/>
-        <w:tblLayout w:type="fixed"/>
-        <w:tblCellMar>
-          <w:top w:w="0" w:type="dxa"/>
-          <w:left w:w="93" w:type="dxa"/>
-          <w:bottom w:w="0" w:type="dxa"/>
-          <w:right w:w="108" w:type="dxa"/>
-        </w:tblCellMar>
-        <w:tblLook w:firstRow="1" w:noVBand="1" w:lastRow="0" w:firstColumn="1" w:lastColumn="0" w:noHBand="0" w:val="04a0"/>
-      </w:tblPr>
-      <w:tblGrid>
-        <w:gridCol w:w="1291"/>
-        <w:gridCol w:w="1257"/>
-        <w:gridCol w:w="6383"/>
-      </w:tblGrid>
       <w:tr>
         <w:trPr/>
         <w:tc>
@@ -2244,55 +2224,7 @@
                 <w:szCs w:val="16"/>
                 <w:lang w:val="gl-ES"/>
               </w:rPr>
-              <w:t>1</w:t>
-            </w:r>
-            <w:r>
-              <w:rPr>
-                <w:rFonts w:cs="Arial"/>
-                <w:b/>
-                <w:bCs/>
-                <w:spacing w:val="1"/>
-                <w:w w:val="81"/>
-                <w:szCs w:val="16"/>
-                <w:lang w:val="gl-ES"/>
-              </w:rPr>
-              <w:t>3</w:t>
-            </w:r>
-            <w:r>
-              <w:rPr>
-                <w:rFonts w:cs="Arial"/>
-                <w:b/>
-                <w:bCs/>
-                <w:spacing w:val="1"/>
-                <w:w w:val="81"/>
-                <w:szCs w:val="16"/>
-                <w:lang w:val="gl-ES"/>
-              </w:rPr>
-              <w:t>/0</w:t>
-            </w:r>
-            <w:r>
-              <w:rPr>
-                <w:rFonts w:cs="Arial"/>
-                <w:b/>
-                <w:bCs/>
-                <w:spacing w:val="1"/>
-                <w:w w:val="81"/>
-                <w:szCs w:val="16"/>
-                <w:lang w:val="gl-ES"/>
-              </w:rPr>
-              <w:t>5</w:t>
-            </w:r>
-            <w:r>
-              <w:rPr>
-                <w:rFonts w:cs="Arial"/>
-                <w:b/>
-                <w:bCs/>
-                <w:spacing w:val="1"/>
-                <w:w w:val="81"/>
-                <w:szCs w:val="16"/>
-                <w:lang w:val="gl-ES"/>
-              </w:rPr>
-              <w:t>/26</w:t>
+              <w:t>13/05/26</w:t>
             </w:r>
           </w:p>
         </w:tc>
@@ -2572,13 +2504,6 @@
             </w:r>
             <w:r>
               <w:rPr>
-                <w:rStyle w:val="Enlacedelndice"/>
-                <w:vanish w:val="false"/>
-              </w:rPr>
-              <w:tab/>
-            </w:r>
-            <w:r>
-              <w:rPr>
                 <w:webHidden/>
               </w:rPr>
               <w:fldChar w:fldCharType="begin"/>
@@ -2600,6 +2525,7 @@
                 <w:rStyle w:val="Enlacedelndice"/>
                 <w:vanish w:val="false"/>
               </w:rPr>
+              <w:tab/>
               <w:t>7</w:t>
             </w:r>
             <w:r>
@@ -2653,13 +2579,6 @@
             </w:r>
             <w:r>
               <w:rPr>
-                <w:rStyle w:val="Enlacedelndice"/>
-                <w:vanish w:val="false"/>
-              </w:rPr>
-              <w:tab/>
-            </w:r>
-            <w:r>
-              <w:rPr>
                 <w:webHidden/>
               </w:rPr>
               <w:fldChar w:fldCharType="begin"/>
@@ -2681,6 +2600,7 @@
                 <w:rStyle w:val="Enlacedelndice"/>
                 <w:vanish w:val="false"/>
               </w:rPr>
+              <w:tab/>
               <w:t>8</w:t>
             </w:r>
             <w:r>
@@ -2738,12 +2658,6 @@
                 <w:vanish w:val="false"/>
               </w:rPr>
               <w:tab/>
-            </w:r>
-            <w:r>
-              <w:rPr>
-                <w:rStyle w:val="Enlacedelndice"/>
-                <w:vanish w:val="false"/>
-              </w:rPr>
               <w:t>1</w:t>
             </w:r>
           </w:hyperlink>
@@ -2801,12 +2715,6 @@
                 <w:vanish w:val="false"/>
               </w:rPr>
               <w:tab/>
-            </w:r>
-            <w:r>
-              <w:rPr>
-                <w:rStyle w:val="Enlacedelndice"/>
-                <w:vanish w:val="false"/>
-              </w:rPr>
               <w:t>1</w:t>
             </w:r>
           </w:hyperlink>
@@ -2864,12 +2772,6 @@
                 <w:vanish w:val="false"/>
               </w:rPr>
               <w:tab/>
-            </w:r>
-            <w:r>
-              <w:rPr>
-                <w:rStyle w:val="Enlacedelndice"/>
-                <w:vanish w:val="false"/>
-              </w:rPr>
               <w:t>1</w:t>
             </w:r>
           </w:hyperlink>
@@ -2927,12 +2829,6 @@
                 <w:vanish w:val="false"/>
               </w:rPr>
               <w:tab/>
-            </w:r>
-            <w:r>
-              <w:rPr>
-                <w:rStyle w:val="Enlacedelndice"/>
-                <w:vanish w:val="false"/>
-              </w:rPr>
               <w:t>1</w:t>
             </w:r>
           </w:hyperlink>
@@ -2956,7 +2852,7 @@
         <w:pStyle w:val="Normal"/>
         <w:widowControl/>
         <w:suppressAutoHyphens w:val="true"/>
-        <w:overflowPunct w:val="true"/>
+        <w:overflowPunct w:val="false"/>
         <w:bidi w:val="0"/>
         <w:spacing w:before="0" w:after="120"/>
         <w:ind w:firstLine="283" w:left="907"/>
@@ -3857,43 +3753,7 @@
           <w:sz w:val="20"/>
           <w:szCs w:val="20"/>
         </w:rPr>
-        <w:t>A la hora de destacar apartados dif</w:t>
-      </w:r>
-      <w:r>
-        <w:rPr>
-          <w:b w:val="false"/>
-          <w:bCs w:val="false"/>
-          <w:i w:val="false"/>
-          <w:iCs w:val="false"/>
-          <w:color w:val="auto"/>
-          <w:sz w:val="20"/>
-          <w:szCs w:val="20"/>
-        </w:rPr>
-        <w:t>í</w:t>
-      </w:r>
-      <w:r>
-        <w:rPr>
-          <w:b w:val="false"/>
-          <w:bCs w:val="false"/>
-          <w:i w:val="false"/>
-          <w:iCs w:val="false"/>
-          <w:color w:val="auto"/>
-          <w:sz w:val="20"/>
-          <w:szCs w:val="20"/>
-        </w:rPr>
-        <w:t xml:space="preserve">ciles de implementar en el aspecto técnico, </w:t>
-      </w:r>
-      <w:r>
-        <w:rPr>
-          <w:b w:val="false"/>
-          <w:bCs w:val="false"/>
-          <w:i w:val="false"/>
-          <w:iCs w:val="false"/>
-          <w:color w:val="auto"/>
-          <w:sz w:val="20"/>
-          <w:szCs w:val="20"/>
-        </w:rPr>
-        <w:t>cabe resaltar la subida de imágenes desde un teléfono hasta el servidor, así como poner dichas imágenes disponibles para que se puedan ver desde los demás dispositivos.</w:t>
+        <w:t>A la hora de destacar apartados difíciles de implementar en el aspecto técnico, cabe resaltar la subida de imágenes desde un teléfono hasta el servidor, así como poner dichas imágenes disponibles para que se puedan ver desde los demás dispositivos.</w:t>
       </w:r>
     </w:p>
     <w:p>
@@ -3942,7 +3802,15 @@
         </w:rPr>
       </w:pPr>
       <w:r>
-        <w:rPr/>
+        <w:rPr>
+          <w:b w:val="false"/>
+          <w:bCs w:val="false"/>
+          <w:i w:val="false"/>
+          <w:iCs w:val="false"/>
+          <w:color w:val="auto"/>
+          <w:sz w:val="20"/>
+          <w:szCs w:val="20"/>
+        </w:rPr>
         <w:drawing>
           <wp:anchor behindDoc="0" distT="0" distB="0" distL="0" distR="0" simplePos="0" locked="0" layoutInCell="0" allowOverlap="1" relativeHeight="27">
             <wp:simplePos x="0" y="0"/>
@@ -4061,31 +3929,7 @@
           <w:sz w:val="20"/>
           <w:szCs w:val="20"/>
         </w:rPr>
-        <w:t xml:space="preserve">Después, será necesario realizar una correcta conexión con la API, siendo la parte más crucial del proceso la correcta asociación de una URL de imagen con los datos de la BBDD. Para esto, se hace esperar al usuario hasta que la API recibe de forma correcta la imagen y responde con la URL desde la que se puede acceder a la imagen </w:t>
-      </w:r>
-      <w:r>
-        <w:rPr>
-          <w:b w:val="false"/>
-          <w:bCs w:val="false"/>
-          <w:i w:val="false"/>
-          <w:iCs w:val="false"/>
-          <w:color w:val="auto"/>
-          <w:sz w:val="20"/>
-          <w:szCs w:val="20"/>
-        </w:rPr>
-        <w:t>subida</w:t>
-      </w:r>
-      <w:r>
-        <w:rPr>
-          <w:b w:val="false"/>
-          <w:bCs w:val="false"/>
-          <w:i w:val="false"/>
-          <w:iCs w:val="false"/>
-          <w:color w:val="auto"/>
-          <w:sz w:val="20"/>
-          <w:szCs w:val="20"/>
-        </w:rPr>
-        <w:t>.</w:t>
+        <w:t>Después, será necesario realizar una correcta conexión con la API, siendo la parte más crucial del proceso la correcta asociación de una URL de imagen con los datos de la BBDD. Para esto, se hace esperar al usuario hasta que la API recibe de forma correcta la imagen y responde con la URL desde la que se puede acceder a la imagen subida.</w:t>
       </w:r>
     </w:p>
     <w:p>
@@ -4105,7 +3949,15 @@
         </w:rPr>
       </w:pPr>
       <w:r>
-        <w:rPr/>
+        <w:rPr>
+          <w:b w:val="false"/>
+          <w:bCs w:val="false"/>
+          <w:i w:val="false"/>
+          <w:iCs w:val="false"/>
+          <w:color w:val="auto"/>
+          <w:sz w:val="20"/>
+          <w:szCs w:val="20"/>
+        </w:rPr>
         <w:drawing>
           <wp:anchor behindDoc="0" distT="0" distB="0" distL="0" distR="0" simplePos="0" locked="0" layoutInCell="0" allowOverlap="1" relativeHeight="29">
             <wp:simplePos x="0" y="0"/>
@@ -4170,7 +4022,15 @@
         </w:rPr>
       </w:pPr>
       <w:r>
-        <w:rPr/>
+        <w:rPr>
+          <w:b w:val="false"/>
+          <w:bCs w:val="false"/>
+          <w:i w:val="false"/>
+          <w:iCs w:val="false"/>
+          <w:color w:val="auto"/>
+          <w:sz w:val="20"/>
+          <w:szCs w:val="20"/>
+        </w:rPr>
       </w:r>
     </w:p>
     <w:p>
@@ -4190,7 +4050,15 @@
         </w:rPr>
       </w:pPr>
       <w:r>
-        <w:rPr/>
+        <w:rPr>
+          <w:b w:val="false"/>
+          <w:bCs w:val="false"/>
+          <w:i w:val="false"/>
+          <w:iCs w:val="false"/>
+          <w:color w:val="auto"/>
+          <w:sz w:val="20"/>
+          <w:szCs w:val="20"/>
+        </w:rPr>
       </w:r>
     </w:p>
     <w:p>
@@ -4210,7 +4078,15 @@
         </w:rPr>
       </w:pPr>
       <w:r>
-        <w:rPr/>
+        <w:rPr>
+          <w:b w:val="false"/>
+          <w:bCs w:val="false"/>
+          <w:i w:val="false"/>
+          <w:iCs w:val="false"/>
+          <w:color w:val="auto"/>
+          <w:sz w:val="20"/>
+          <w:szCs w:val="20"/>
+        </w:rPr>
       </w:r>
     </w:p>
     <w:p>
@@ -4230,7 +4106,15 @@
         </w:rPr>
       </w:pPr>
       <w:r>
-        <w:rPr/>
+        <w:rPr>
+          <w:b w:val="false"/>
+          <w:bCs w:val="false"/>
+          <w:i w:val="false"/>
+          <w:iCs w:val="false"/>
+          <w:color w:val="auto"/>
+          <w:sz w:val="20"/>
+          <w:szCs w:val="20"/>
+        </w:rPr>
       </w:r>
     </w:p>
     <w:p>
@@ -4250,7 +4134,15 @@
         </w:rPr>
       </w:pPr>
       <w:r>
-        <w:rPr/>
+        <w:rPr>
+          <w:b w:val="false"/>
+          <w:bCs w:val="false"/>
+          <w:i w:val="false"/>
+          <w:iCs w:val="false"/>
+          <w:color w:val="auto"/>
+          <w:sz w:val="20"/>
+          <w:szCs w:val="20"/>
+        </w:rPr>
       </w:r>
     </w:p>
     <w:p>
@@ -4270,7 +4162,15 @@
         </w:rPr>
       </w:pPr>
       <w:r>
-        <w:rPr/>
+        <w:rPr>
+          <w:b w:val="false"/>
+          <w:bCs w:val="false"/>
+          <w:i w:val="false"/>
+          <w:iCs w:val="false"/>
+          <w:color w:val="auto"/>
+          <w:sz w:val="20"/>
+          <w:szCs w:val="20"/>
+        </w:rPr>
       </w:r>
     </w:p>
     <w:p>
@@ -4290,7 +4190,15 @@
         </w:rPr>
       </w:pPr>
       <w:r>
-        <w:rPr/>
+        <w:rPr>
+          <w:b w:val="false"/>
+          <w:bCs w:val="false"/>
+          <w:i w:val="false"/>
+          <w:iCs w:val="false"/>
+          <w:color w:val="auto"/>
+          <w:sz w:val="20"/>
+          <w:szCs w:val="20"/>
+        </w:rPr>
       </w:r>
     </w:p>
     <w:p>
@@ -4310,7 +4218,15 @@
         </w:rPr>
       </w:pPr>
       <w:r>
-        <w:rPr/>
+        <w:rPr>
+          <w:b w:val="false"/>
+          <w:bCs w:val="false"/>
+          <w:i w:val="false"/>
+          <w:iCs w:val="false"/>
+          <w:color w:val="auto"/>
+          <w:sz w:val="20"/>
+          <w:szCs w:val="20"/>
+        </w:rPr>
       </w:r>
     </w:p>
     <w:p>
@@ -4330,7 +4246,15 @@
         </w:rPr>
       </w:pPr>
       <w:r>
-        <w:rPr/>
+        <w:rPr>
+          <w:b w:val="false"/>
+          <w:bCs w:val="false"/>
+          <w:i w:val="false"/>
+          <w:iCs w:val="false"/>
+          <w:color w:val="auto"/>
+          <w:sz w:val="20"/>
+          <w:szCs w:val="20"/>
+        </w:rPr>
       </w:r>
     </w:p>
     <w:p>
@@ -4350,7 +4274,15 @@
         </w:rPr>
       </w:pPr>
       <w:r>
-        <w:rPr/>
+        <w:rPr>
+          <w:b w:val="false"/>
+          <w:bCs w:val="false"/>
+          <w:i w:val="false"/>
+          <w:iCs w:val="false"/>
+          <w:color w:val="auto"/>
+          <w:sz w:val="20"/>
+          <w:szCs w:val="20"/>
+        </w:rPr>
       </w:r>
     </w:p>
     <w:p>
@@ -4370,7 +4302,15 @@
         </w:rPr>
       </w:pPr>
       <w:r>
-        <w:rPr/>
+        <w:rPr>
+          <w:b w:val="false"/>
+          <w:bCs w:val="false"/>
+          <w:i w:val="false"/>
+          <w:iCs w:val="false"/>
+          <w:color w:val="auto"/>
+          <w:sz w:val="20"/>
+          <w:szCs w:val="20"/>
+        </w:rPr>
       </w:r>
     </w:p>
     <w:p>
@@ -4390,7 +4330,15 @@
         </w:rPr>
       </w:pPr>
       <w:r>
-        <w:rPr/>
+        <w:rPr>
+          <w:b w:val="false"/>
+          <w:bCs w:val="false"/>
+          <w:i w:val="false"/>
+          <w:iCs w:val="false"/>
+          <w:color w:val="auto"/>
+          <w:sz w:val="20"/>
+          <w:szCs w:val="20"/>
+        </w:rPr>
       </w:r>
     </w:p>
     <w:p>
@@ -4410,7 +4358,15 @@
         </w:rPr>
       </w:pPr>
       <w:r>
-        <w:rPr/>
+        <w:rPr>
+          <w:b w:val="false"/>
+          <w:bCs w:val="false"/>
+          <w:i w:val="false"/>
+          <w:iCs w:val="false"/>
+          <w:color w:val="auto"/>
+          <w:sz w:val="20"/>
+          <w:szCs w:val="20"/>
+        </w:rPr>
       </w:r>
     </w:p>
     <w:p>
@@ -4430,7 +4386,15 @@
         </w:rPr>
       </w:pPr>
       <w:r>
-        <w:rPr/>
+        <w:rPr>
+          <w:b w:val="false"/>
+          <w:bCs w:val="false"/>
+          <w:i w:val="false"/>
+          <w:iCs w:val="false"/>
+          <w:color w:val="auto"/>
+          <w:sz w:val="20"/>
+          <w:szCs w:val="20"/>
+        </w:rPr>
       </w:r>
     </w:p>
     <w:p>
@@ -4450,7 +4414,15 @@
         </w:rPr>
       </w:pPr>
       <w:r>
-        <w:rPr/>
+        <w:rPr>
+          <w:b w:val="false"/>
+          <w:bCs w:val="false"/>
+          <w:i w:val="false"/>
+          <w:iCs w:val="false"/>
+          <w:color w:val="auto"/>
+          <w:sz w:val="20"/>
+          <w:szCs w:val="20"/>
+        </w:rPr>
       </w:r>
     </w:p>
     <w:p>
@@ -4470,7 +4442,15 @@
         </w:rPr>
       </w:pPr>
       <w:r>
-        <w:rPr/>
+        <w:rPr>
+          <w:b w:val="false"/>
+          <w:bCs w:val="false"/>
+          <w:i w:val="false"/>
+          <w:iCs w:val="false"/>
+          <w:color w:val="auto"/>
+          <w:sz w:val="20"/>
+          <w:szCs w:val="20"/>
+        </w:rPr>
       </w:r>
     </w:p>
     <w:p>
@@ -4490,7 +4470,15 @@
         </w:rPr>
       </w:pPr>
       <w:r>
-        <w:rPr/>
+        <w:rPr>
+          <w:b w:val="false"/>
+          <w:bCs w:val="false"/>
+          <w:i w:val="false"/>
+          <w:iCs w:val="false"/>
+          <w:color w:val="auto"/>
+          <w:sz w:val="20"/>
+          <w:szCs w:val="20"/>
+        </w:rPr>
       </w:r>
     </w:p>
     <w:p>
@@ -4510,7 +4498,15 @@
         </w:rPr>
       </w:pPr>
       <w:r>
-        <w:rPr/>
+        <w:rPr>
+          <w:b w:val="false"/>
+          <w:bCs w:val="false"/>
+          <w:i w:val="false"/>
+          <w:iCs w:val="false"/>
+          <w:color w:val="auto"/>
+          <w:sz w:val="20"/>
+          <w:szCs w:val="20"/>
+        </w:rPr>
       </w:r>
     </w:p>
     <w:p>
@@ -4530,7 +4526,15 @@
         </w:rPr>
       </w:pPr>
       <w:r>
-        <w:rPr/>
+        <w:rPr>
+          <w:b w:val="false"/>
+          <w:bCs w:val="false"/>
+          <w:i w:val="false"/>
+          <w:iCs w:val="false"/>
+          <w:color w:val="auto"/>
+          <w:sz w:val="20"/>
+          <w:szCs w:val="20"/>
+        </w:rPr>
       </w:r>
     </w:p>
     <w:p>
@@ -4550,7 +4554,15 @@
         </w:rPr>
       </w:pPr>
       <w:r>
-        <w:rPr/>
+        <w:rPr>
+          <w:b w:val="false"/>
+          <w:bCs w:val="false"/>
+          <w:i w:val="false"/>
+          <w:iCs w:val="false"/>
+          <w:color w:val="auto"/>
+          <w:sz w:val="20"/>
+          <w:szCs w:val="20"/>
+        </w:rPr>
       </w:r>
     </w:p>
     <w:p>
@@ -4570,7 +4582,15 @@
         </w:rPr>
       </w:pPr>
       <w:r>
-        <w:rPr/>
+        <w:rPr>
+          <w:b w:val="false"/>
+          <w:bCs w:val="false"/>
+          <w:i w:val="false"/>
+          <w:iCs w:val="false"/>
+          <w:color w:val="auto"/>
+          <w:sz w:val="20"/>
+          <w:szCs w:val="20"/>
+        </w:rPr>
       </w:r>
     </w:p>
     <w:p>
@@ -4590,7 +4610,15 @@
         </w:rPr>
       </w:pPr>
       <w:r>
-        <w:rPr/>
+        <w:rPr>
+          <w:b w:val="false"/>
+          <w:bCs w:val="false"/>
+          <w:i w:val="false"/>
+          <w:iCs w:val="false"/>
+          <w:color w:val="auto"/>
+          <w:sz w:val="20"/>
+          <w:szCs w:val="20"/>
+        </w:rPr>
       </w:r>
     </w:p>
     <w:p>
@@ -4610,7 +4638,15 @@
         </w:rPr>
       </w:pPr>
       <w:r>
-        <w:rPr/>
+        <w:rPr>
+          <w:b w:val="false"/>
+          <w:bCs w:val="false"/>
+          <w:i w:val="false"/>
+          <w:iCs w:val="false"/>
+          <w:color w:val="auto"/>
+          <w:sz w:val="20"/>
+          <w:szCs w:val="20"/>
+        </w:rPr>
       </w:r>
     </w:p>
     <w:p>
@@ -4630,7 +4666,15 @@
         </w:rPr>
       </w:pPr>
       <w:r>
-        <w:rPr/>
+        <w:rPr>
+          <w:b w:val="false"/>
+          <w:bCs w:val="false"/>
+          <w:i w:val="false"/>
+          <w:iCs w:val="false"/>
+          <w:color w:val="auto"/>
+          <w:sz w:val="20"/>
+          <w:szCs w:val="20"/>
+        </w:rPr>
       </w:r>
     </w:p>
     <w:p>
@@ -4650,7 +4694,15 @@
         </w:rPr>
       </w:pPr>
       <w:r>
-        <w:rPr/>
+        <w:rPr>
+          <w:b w:val="false"/>
+          <w:bCs w:val="false"/>
+          <w:i w:val="false"/>
+          <w:iCs w:val="false"/>
+          <w:color w:val="auto"/>
+          <w:sz w:val="20"/>
+          <w:szCs w:val="20"/>
+        </w:rPr>
       </w:r>
     </w:p>
     <w:p>
@@ -4670,7 +4722,15 @@
         </w:rPr>
       </w:pPr>
       <w:r>
-        <w:rPr/>
+        <w:rPr>
+          <w:b w:val="false"/>
+          <w:bCs w:val="false"/>
+          <w:i w:val="false"/>
+          <w:iCs w:val="false"/>
+          <w:color w:val="auto"/>
+          <w:sz w:val="20"/>
+          <w:szCs w:val="20"/>
+        </w:rPr>
       </w:r>
     </w:p>
     <w:p>
@@ -4690,7 +4750,15 @@
         </w:rPr>
       </w:pPr>
       <w:r>
-        <w:rPr/>
+        <w:rPr>
+          <w:b w:val="false"/>
+          <w:bCs w:val="false"/>
+          <w:i w:val="false"/>
+          <w:iCs w:val="false"/>
+          <w:color w:val="auto"/>
+          <w:sz w:val="20"/>
+          <w:szCs w:val="20"/>
+        </w:rPr>
       </w:r>
     </w:p>
     <w:p>
@@ -4710,7 +4778,15 @@
         </w:rPr>
       </w:pPr>
       <w:r>
-        <w:rPr/>
+        <w:rPr>
+          <w:b w:val="false"/>
+          <w:bCs w:val="false"/>
+          <w:i w:val="false"/>
+          <w:iCs w:val="false"/>
+          <w:color w:val="auto"/>
+          <w:sz w:val="20"/>
+          <w:szCs w:val="20"/>
+        </w:rPr>
       </w:r>
     </w:p>
     <w:p>
@@ -4730,7 +4806,15 @@
         </w:rPr>
       </w:pPr>
       <w:r>
-        <w:rPr/>
+        <w:rPr>
+          <w:b w:val="false"/>
+          <w:bCs w:val="false"/>
+          <w:i w:val="false"/>
+          <w:iCs w:val="false"/>
+          <w:color w:val="auto"/>
+          <w:sz w:val="20"/>
+          <w:szCs w:val="20"/>
+        </w:rPr>
       </w:r>
     </w:p>
     <w:p>
@@ -4750,7 +4834,15 @@
         </w:rPr>
       </w:pPr>
       <w:r>
-        <w:rPr/>
+        <w:rPr>
+          <w:b w:val="false"/>
+          <w:bCs w:val="false"/>
+          <w:i w:val="false"/>
+          <w:iCs w:val="false"/>
+          <w:color w:val="auto"/>
+          <w:sz w:val="20"/>
+          <w:szCs w:val="20"/>
+        </w:rPr>
       </w:r>
     </w:p>
     <w:p>
@@ -4770,7 +4862,15 @@
         </w:rPr>
       </w:pPr>
       <w:r>
-        <w:rPr/>
+        <w:rPr>
+          <w:b w:val="false"/>
+          <w:bCs w:val="false"/>
+          <w:i w:val="false"/>
+          <w:iCs w:val="false"/>
+          <w:color w:val="auto"/>
+          <w:sz w:val="20"/>
+          <w:szCs w:val="20"/>
+        </w:rPr>
       </w:r>
     </w:p>
     <w:p>
@@ -4790,7 +4890,15 @@
         </w:rPr>
       </w:pPr>
       <w:r>
-        <w:rPr/>
+        <w:rPr>
+          <w:b w:val="false"/>
+          <w:bCs w:val="false"/>
+          <w:i w:val="false"/>
+          <w:iCs w:val="false"/>
+          <w:color w:val="auto"/>
+          <w:sz w:val="20"/>
+          <w:szCs w:val="20"/>
+        </w:rPr>
       </w:r>
     </w:p>
     <w:p>
@@ -4810,7 +4918,15 @@
         </w:rPr>
       </w:pPr>
       <w:r>
-        <w:rPr/>
+        <w:rPr>
+          <w:b w:val="false"/>
+          <w:bCs w:val="false"/>
+          <w:i w:val="false"/>
+          <w:iCs w:val="false"/>
+          <w:color w:val="auto"/>
+          <w:sz w:val="20"/>
+          <w:szCs w:val="20"/>
+        </w:rPr>
       </w:r>
     </w:p>
     <w:p>
@@ -4830,7 +4946,15 @@
         </w:rPr>
       </w:pPr>
       <w:r>
-        <w:rPr/>
+        <w:rPr>
+          <w:b w:val="false"/>
+          <w:bCs w:val="false"/>
+          <w:i w:val="false"/>
+          <w:iCs w:val="false"/>
+          <w:color w:val="auto"/>
+          <w:sz w:val="20"/>
+          <w:szCs w:val="20"/>
+        </w:rPr>
       </w:r>
     </w:p>
     <w:p>
@@ -4850,7 +4974,15 @@
         </w:rPr>
       </w:pPr>
       <w:r>
-        <w:rPr/>
+        <w:rPr>
+          <w:b w:val="false"/>
+          <w:bCs w:val="false"/>
+          <w:i w:val="false"/>
+          <w:iCs w:val="false"/>
+          <w:color w:val="auto"/>
+          <w:sz w:val="20"/>
+          <w:szCs w:val="20"/>
+        </w:rPr>
       </w:r>
     </w:p>
     <w:p>
@@ -4870,7 +5002,15 @@
         </w:rPr>
       </w:pPr>
       <w:r>
-        <w:rPr/>
+        <w:rPr>
+          <w:b w:val="false"/>
+          <w:bCs w:val="false"/>
+          <w:i w:val="false"/>
+          <w:iCs w:val="false"/>
+          <w:color w:val="auto"/>
+          <w:sz w:val="20"/>
+          <w:szCs w:val="20"/>
+        </w:rPr>
       </w:r>
     </w:p>
     <w:p>
@@ -4890,7 +5030,15 @@
         </w:rPr>
       </w:pPr>
       <w:r>
-        <w:rPr/>
+        <w:rPr>
+          <w:b w:val="false"/>
+          <w:bCs w:val="false"/>
+          <w:i w:val="false"/>
+          <w:iCs w:val="false"/>
+          <w:color w:val="auto"/>
+          <w:sz w:val="20"/>
+          <w:szCs w:val="20"/>
+        </w:rPr>
         <w:drawing>
           <wp:anchor behindDoc="0" distT="0" distB="0" distL="0" distR="0" simplePos="0" locked="0" layoutInCell="0" allowOverlap="1" relativeHeight="30">
             <wp:simplePos x="0" y="0"/>
@@ -5000,7 +5148,15 @@
         </w:rPr>
       </w:pPr>
       <w:r>
-        <w:rPr/>
+        <w:rPr>
+          <w:b w:val="false"/>
+          <w:bCs w:val="false"/>
+          <w:i w:val="false"/>
+          <w:iCs w:val="false"/>
+          <w:color w:val="auto"/>
+          <w:sz w:val="20"/>
+          <w:szCs w:val="20"/>
+        </w:rPr>
       </w:r>
     </w:p>
     <w:p>
@@ -5020,7 +5176,15 @@
         </w:rPr>
       </w:pPr>
       <w:r>
-        <w:rPr/>
+        <w:rPr>
+          <w:b w:val="false"/>
+          <w:bCs w:val="false"/>
+          <w:i w:val="false"/>
+          <w:iCs w:val="false"/>
+          <w:color w:val="auto"/>
+          <w:sz w:val="20"/>
+          <w:szCs w:val="20"/>
+        </w:rPr>
       </w:r>
     </w:p>
     <w:p>
@@ -5040,7 +5204,15 @@
         </w:rPr>
       </w:pPr>
       <w:r>
-        <w:rPr/>
+        <w:rPr>
+          <w:b w:val="false"/>
+          <w:bCs w:val="false"/>
+          <w:i w:val="false"/>
+          <w:iCs w:val="false"/>
+          <w:color w:val="auto"/>
+          <w:sz w:val="20"/>
+          <w:szCs w:val="20"/>
+        </w:rPr>
       </w:r>
     </w:p>
     <w:p>
@@ -5060,7 +5232,15 @@
         </w:rPr>
       </w:pPr>
       <w:r>
-        <w:rPr/>
+        <w:rPr>
+          <w:b w:val="false"/>
+          <w:bCs w:val="false"/>
+          <w:i w:val="false"/>
+          <w:iCs w:val="false"/>
+          <w:color w:val="auto"/>
+          <w:sz w:val="20"/>
+          <w:szCs w:val="20"/>
+        </w:rPr>
       </w:r>
     </w:p>
     <w:p>
@@ -5080,7 +5260,15 @@
         </w:rPr>
       </w:pPr>
       <w:r>
-        <w:rPr/>
+        <w:rPr>
+          <w:b w:val="false"/>
+          <w:bCs w:val="false"/>
+          <w:i w:val="false"/>
+          <w:iCs w:val="false"/>
+          <w:color w:val="auto"/>
+          <w:sz w:val="20"/>
+          <w:szCs w:val="20"/>
+        </w:rPr>
         <w:drawing>
           <wp:anchor behindDoc="0" distT="0" distB="0" distL="0" distR="0" simplePos="0" locked="0" layoutInCell="0" allowOverlap="1" relativeHeight="32">
             <wp:simplePos x="0" y="0"/>
@@ -5174,7 +5362,15 @@
         </w:rPr>
       </w:pPr>
       <w:r>
-        <w:rPr/>
+        <w:rPr>
+          <w:b w:val="false"/>
+          <w:bCs w:val="false"/>
+          <w:i w:val="false"/>
+          <w:iCs w:val="false"/>
+          <w:color w:val="auto"/>
+          <w:sz w:val="20"/>
+          <w:szCs w:val="20"/>
+        </w:rPr>
         <w:drawing>
           <wp:anchor behindDoc="0" distT="0" distB="0" distL="0" distR="0" simplePos="0" locked="0" layoutInCell="0" allowOverlap="1" relativeHeight="33">
             <wp:simplePos x="0" y="0"/>
@@ -5239,7 +5435,15 @@
         </w:rPr>
       </w:pPr>
       <w:r>
-        <w:rPr/>
+        <w:rPr>
+          <w:b w:val="false"/>
+          <w:bCs w:val="false"/>
+          <w:i w:val="false"/>
+          <w:iCs w:val="false"/>
+          <w:color w:val="auto"/>
+          <w:sz w:val="20"/>
+          <w:szCs w:val="20"/>
+        </w:rPr>
       </w:r>
     </w:p>
     <w:p>
@@ -5259,7 +5463,15 @@
         </w:rPr>
       </w:pPr>
       <w:r>
-        <w:rPr/>
+        <w:rPr>
+          <w:b w:val="false"/>
+          <w:bCs w:val="false"/>
+          <w:i w:val="false"/>
+          <w:iCs w:val="false"/>
+          <w:color w:val="auto"/>
+          <w:sz w:val="20"/>
+          <w:szCs w:val="20"/>
+        </w:rPr>
       </w:r>
     </w:p>
     <w:p>
@@ -5279,7 +5491,15 @@
         </w:rPr>
       </w:pPr>
       <w:r>
-        <w:rPr/>
+        <w:rPr>
+          <w:b w:val="false"/>
+          <w:bCs w:val="false"/>
+          <w:i w:val="false"/>
+          <w:iCs w:val="false"/>
+          <w:color w:val="auto"/>
+          <w:sz w:val="20"/>
+          <w:szCs w:val="20"/>
+        </w:rPr>
       </w:r>
     </w:p>
     <w:p>
@@ -5299,7 +5519,15 @@
         </w:rPr>
       </w:pPr>
       <w:r>
-        <w:rPr/>
+        <w:rPr>
+          <w:b w:val="false"/>
+          <w:bCs w:val="false"/>
+          <w:i w:val="false"/>
+          <w:iCs w:val="false"/>
+          <w:color w:val="auto"/>
+          <w:sz w:val="20"/>
+          <w:szCs w:val="20"/>
+        </w:rPr>
       </w:r>
     </w:p>
     <w:p>
@@ -5319,7 +5547,15 @@
         </w:rPr>
       </w:pPr>
       <w:r>
-        <w:rPr/>
+        <w:rPr>
+          <w:b w:val="false"/>
+          <w:bCs w:val="false"/>
+          <w:i w:val="false"/>
+          <w:iCs w:val="false"/>
+          <w:color w:val="auto"/>
+          <w:sz w:val="20"/>
+          <w:szCs w:val="20"/>
+        </w:rPr>
       </w:r>
     </w:p>
     <w:p>
@@ -5339,7 +5575,15 @@
         </w:rPr>
       </w:pPr>
       <w:r>
-        <w:rPr/>
+        <w:rPr>
+          <w:b w:val="false"/>
+          <w:bCs w:val="false"/>
+          <w:i w:val="false"/>
+          <w:iCs w:val="false"/>
+          <w:color w:val="auto"/>
+          <w:sz w:val="20"/>
+          <w:szCs w:val="20"/>
+        </w:rPr>
       </w:r>
     </w:p>
     <w:p>
@@ -5359,7 +5603,15 @@
         </w:rPr>
       </w:pPr>
       <w:r>
-        <w:rPr/>
+        <w:rPr>
+          <w:b w:val="false"/>
+          <w:bCs w:val="false"/>
+          <w:i w:val="false"/>
+          <w:iCs w:val="false"/>
+          <w:color w:val="auto"/>
+          <w:sz w:val="20"/>
+          <w:szCs w:val="20"/>
+        </w:rPr>
       </w:r>
     </w:p>
     <w:p>
@@ -5379,7 +5631,15 @@
         </w:rPr>
       </w:pPr>
       <w:r>
-        <w:rPr/>
+        <w:rPr>
+          <w:b w:val="false"/>
+          <w:bCs w:val="false"/>
+          <w:i w:val="false"/>
+          <w:iCs w:val="false"/>
+          <w:color w:val="auto"/>
+          <w:sz w:val="20"/>
+          <w:szCs w:val="20"/>
+        </w:rPr>
       </w:r>
     </w:p>
     <w:p>
@@ -5399,7 +5659,15 @@
         </w:rPr>
       </w:pPr>
       <w:r>
-        <w:rPr/>
+        <w:rPr>
+          <w:b w:val="false"/>
+          <w:bCs w:val="false"/>
+          <w:i w:val="false"/>
+          <w:iCs w:val="false"/>
+          <w:color w:val="auto"/>
+          <w:sz w:val="20"/>
+          <w:szCs w:val="20"/>
+        </w:rPr>
       </w:r>
     </w:p>
     <w:p>
@@ -5419,7 +5687,15 @@
         </w:rPr>
       </w:pPr>
       <w:r>
-        <w:rPr/>
+        <w:rPr>
+          <w:b w:val="false"/>
+          <w:bCs w:val="false"/>
+          <w:i w:val="false"/>
+          <w:iCs w:val="false"/>
+          <w:color w:val="auto"/>
+          <w:sz w:val="20"/>
+          <w:szCs w:val="20"/>
+        </w:rPr>
       </w:r>
     </w:p>
     <w:p>
@@ -5439,7 +5715,15 @@
         </w:rPr>
       </w:pPr>
       <w:r>
-        <w:rPr/>
+        <w:rPr>
+          <w:b w:val="false"/>
+          <w:bCs w:val="false"/>
+          <w:i w:val="false"/>
+          <w:iCs w:val="false"/>
+          <w:color w:val="auto"/>
+          <w:sz w:val="20"/>
+          <w:szCs w:val="20"/>
+        </w:rPr>
       </w:r>
     </w:p>
     <w:p>
@@ -5459,7 +5743,15 @@
         </w:rPr>
       </w:pPr>
       <w:r>
-        <w:rPr/>
+        <w:rPr>
+          <w:b w:val="false"/>
+          <w:bCs w:val="false"/>
+          <w:i w:val="false"/>
+          <w:iCs w:val="false"/>
+          <w:color w:val="auto"/>
+          <w:sz w:val="20"/>
+          <w:szCs w:val="20"/>
+        </w:rPr>
       </w:r>
     </w:p>
     <w:p>
@@ -5479,7 +5771,15 @@
         </w:rPr>
       </w:pPr>
       <w:r>
-        <w:rPr/>
+        <w:rPr>
+          <w:b w:val="false"/>
+          <w:bCs w:val="false"/>
+          <w:i w:val="false"/>
+          <w:iCs w:val="false"/>
+          <w:color w:val="auto"/>
+          <w:sz w:val="20"/>
+          <w:szCs w:val="20"/>
+        </w:rPr>
       </w:r>
     </w:p>
     <w:p>
@@ -5499,7 +5799,15 @@
         </w:rPr>
       </w:pPr>
       <w:r>
-        <w:rPr/>
+        <w:rPr>
+          <w:b w:val="false"/>
+          <w:bCs w:val="false"/>
+          <w:i w:val="false"/>
+          <w:iCs w:val="false"/>
+          <w:color w:val="auto"/>
+          <w:sz w:val="20"/>
+          <w:szCs w:val="20"/>
+        </w:rPr>
       </w:r>
     </w:p>
     <w:p>
@@ -5519,7 +5827,15 @@
         </w:rPr>
       </w:pPr>
       <w:r>
-        <w:rPr/>
+        <w:rPr>
+          <w:b w:val="false"/>
+          <w:bCs w:val="false"/>
+          <w:i w:val="false"/>
+          <w:iCs w:val="false"/>
+          <w:color w:val="auto"/>
+          <w:sz w:val="20"/>
+          <w:szCs w:val="20"/>
+        </w:rPr>
       </w:r>
     </w:p>
     <w:p>
@@ -5539,7 +5855,15 @@
         </w:rPr>
       </w:pPr>
       <w:r>
-        <w:rPr/>
+        <w:rPr>
+          <w:b w:val="false"/>
+          <w:bCs w:val="false"/>
+          <w:i w:val="false"/>
+          <w:iCs w:val="false"/>
+          <w:color w:val="auto"/>
+          <w:sz w:val="20"/>
+          <w:szCs w:val="20"/>
+        </w:rPr>
       </w:r>
     </w:p>
     <w:p>
@@ -5559,7 +5883,15 @@
         </w:rPr>
       </w:pPr>
       <w:r>
-        <w:rPr/>
+        <w:rPr>
+          <w:b w:val="false"/>
+          <w:bCs w:val="false"/>
+          <w:i w:val="false"/>
+          <w:iCs w:val="false"/>
+          <w:color w:val="auto"/>
+          <w:sz w:val="20"/>
+          <w:szCs w:val="20"/>
+        </w:rPr>
       </w:r>
     </w:p>
     <w:p>
@@ -7667,7 +7999,9 @@
         </w:rPr>
       </w:pPr>
       <w:r>
-        <w:rPr/>
+        <w:rPr>
+          <w:color w:val="auto"/>
+        </w:rPr>
         <w:drawing>
           <wp:anchor behindDoc="0" distT="0" distB="0" distL="0" distR="0" simplePos="0" locked="0" layoutInCell="0" allowOverlap="1" relativeHeight="7">
             <wp:simplePos x="0" y="0"/>
@@ -7726,7 +8060,9 @@
         </w:rPr>
       </w:pPr>
       <w:r>
-        <w:rPr/>
+        <w:rPr>
+          <w:color w:val="auto"/>
+        </w:rPr>
       </w:r>
     </w:p>
     <w:p>
@@ -7765,7 +8101,9 @@
         </w:rPr>
       </w:pPr>
       <w:r>
-        <w:rPr/>
+        <w:rPr>
+          <w:color w:val="auto"/>
+        </w:rPr>
         <w:drawing>
           <wp:anchor behindDoc="0" distT="0" distB="0" distL="0" distR="0" simplePos="0" locked="0" layoutInCell="0" allowOverlap="1" relativeHeight="8">
             <wp:simplePos x="0" y="0"/>
@@ -7824,7 +8162,9 @@
         </w:rPr>
       </w:pPr>
       <w:r>
-        <w:rPr/>
+        <w:rPr>
+          <w:color w:val="auto"/>
+        </w:rPr>
       </w:r>
     </w:p>
     <w:p>
@@ -7838,7 +8178,9 @@
         </w:rPr>
       </w:pPr>
       <w:r>
-        <w:rPr/>
+        <w:rPr>
+          <w:color w:val="auto"/>
+        </w:rPr>
       </w:r>
     </w:p>
     <w:p>
@@ -7852,7 +8194,9 @@
         </w:rPr>
       </w:pPr>
       <w:r>
-        <w:rPr/>
+        <w:rPr>
+          <w:color w:val="auto"/>
+        </w:rPr>
       </w:r>
     </w:p>
     <w:p>
@@ -7866,7 +8210,9 @@
         </w:rPr>
       </w:pPr>
       <w:r>
-        <w:rPr/>
+        <w:rPr>
+          <w:color w:val="auto"/>
+        </w:rPr>
       </w:r>
     </w:p>
     <w:p>
@@ -7880,7 +8226,9 @@
         </w:rPr>
       </w:pPr>
       <w:r>
-        <w:rPr/>
+        <w:rPr>
+          <w:color w:val="auto"/>
+        </w:rPr>
       </w:r>
     </w:p>
     <w:p>
@@ -7894,7 +8242,9 @@
         </w:rPr>
       </w:pPr>
       <w:r>
-        <w:rPr/>
+        <w:rPr>
+          <w:color w:val="auto"/>
+        </w:rPr>
       </w:r>
     </w:p>
     <w:p>
@@ -8061,7 +8411,9 @@
         </w:rPr>
       </w:pPr>
       <w:r>
-        <w:rPr/>
+        <w:rPr>
+          <w:color w:val="auto"/>
+        </w:rPr>
         <w:drawing>
           <wp:anchor behindDoc="0" distT="0" distB="0" distL="0" distR="0" simplePos="0" locked="0" layoutInCell="0" allowOverlap="1" relativeHeight="9">
             <wp:simplePos x="0" y="0"/>
@@ -8141,7 +8493,9 @@
         </w:rPr>
       </w:pPr>
       <w:r>
-        <w:rPr/>
+        <w:rPr>
+          <w:color w:val="auto"/>
+        </w:rPr>
         <w:drawing>
           <wp:anchor behindDoc="0" distT="0" distB="0" distL="0" distR="0" simplePos="0" locked="0" layoutInCell="0" allowOverlap="1" relativeHeight="10">
             <wp:simplePos x="0" y="0"/>
@@ -8228,17 +8582,7 @@
           <w:iCs w:val="false"/>
           <w:color w:val="auto"/>
         </w:rPr>
-        <w:t xml:space="preserve">Finalmente, la APP móvil se puede iniciar desde Android Studio en el emulador de Android. </w:t>
-      </w:r>
-      <w:r>
-        <w:rPr>
-          <w:b w:val="false"/>
-          <w:bCs w:val="false"/>
-          <w:i w:val="false"/>
-          <w:iCs w:val="false"/>
-          <w:color w:val="auto"/>
-        </w:rPr>
-        <w:t>Al iniciarla, nos da la opción de crear una cuenta o hacer login. Para demostrar el funcionamiento, asumiremos que somos un nuevo usuario y que queremos crear una cuenta.</w:t>
+        <w:t>Finalmente, la APP móvil se puede iniciar desde Android Studio en el emulador de Android. Al iniciarla, nos da la opción de crear una cuenta o hacer login. Para demostrar el funcionamiento, asumiremos que somos un nuevo usuario y que queremos crear una cuenta.</w:t>
       </w:r>
     </w:p>
     <w:p>
@@ -8430,7 +8774,9 @@
         </w:rPr>
       </w:pPr>
       <w:r>
-        <w:rPr/>
+        <w:rPr>
+          <w:color w:val="auto"/>
+        </w:rPr>
       </w:r>
     </w:p>
     <w:p>
@@ -8444,7 +8790,9 @@
         </w:rPr>
       </w:pPr>
       <w:r>
-        <w:rPr/>
+        <w:rPr>
+          <w:color w:val="auto"/>
+        </w:rPr>
       </w:r>
     </w:p>
     <w:p>
@@ -8458,7 +8806,9 @@
         </w:rPr>
       </w:pPr>
       <w:r>
-        <w:rPr/>
+        <w:rPr>
+          <w:color w:val="auto"/>
+        </w:rPr>
       </w:r>
     </w:p>
     <w:p>
@@ -8472,7 +8822,9 @@
         </w:rPr>
       </w:pPr>
       <w:r>
-        <w:rPr/>
+        <w:rPr>
+          <w:color w:val="auto"/>
+        </w:rPr>
       </w:r>
     </w:p>
     <w:p>
@@ -8486,7 +8838,9 @@
         </w:rPr>
       </w:pPr>
       <w:r>
-        <w:rPr/>
+        <w:rPr>
+          <w:color w:val="auto"/>
+        </w:rPr>
       </w:r>
     </w:p>
     <w:p>
@@ -8500,7 +8854,9 @@
         </w:rPr>
       </w:pPr>
       <w:r>
-        <w:rPr/>
+        <w:rPr>
+          <w:color w:val="auto"/>
+        </w:rPr>
       </w:r>
       <w:r>
         <w:br w:type="page"/>
@@ -8899,7 +9255,9 @@
         </w:rPr>
       </w:pPr>
       <w:r>
-        <w:rPr/>
+        <w:rPr>
+          <w:color w:val="auto"/>
+        </w:rPr>
       </w:r>
     </w:p>
     <w:p>
@@ -8913,7 +9271,9 @@
         </w:rPr>
       </w:pPr>
       <w:r>
-        <w:rPr/>
+        <w:rPr>
+          <w:color w:val="auto"/>
+        </w:rPr>
       </w:r>
     </w:p>
     <w:p>
@@ -10254,7 +10614,7 @@
     <w:pPr>
       <w:widowControl/>
       <w:suppressAutoHyphens w:val="true"/>
-      <w:overflowPunct w:val="true"/>
+      <w:overflowPunct w:val="false"/>
       <w:bidi w:val="0"/>
       <w:spacing w:before="0" w:after="120"/>
       <w:ind w:firstLine="283" w:left="907"/>
@@ -11182,7 +11542,7 @@
         <w:tab w:val="clear" w:pos="907"/>
       </w:tabs>
       <w:suppressAutoHyphens w:val="false"/>
-      <w:overflowPunct w:val="false"/>
+      <w:overflowPunct w:val="true"/>
       <w:spacing w:lineRule="auto" w:line="259" w:before="240" w:after="0"/>
       <w:outlineLvl w:val="9"/>
     </w:pPr>
@@ -11205,7 +11565,7 @@
     <w:rsid w:val="003d528a"/>
     <w:pPr>
       <w:suppressAutoHyphens w:val="false"/>
-      <w:overflowPunct w:val="false"/>
+      <w:overflowPunct w:val="true"/>
       <w:spacing w:lineRule="auto" w:line="259" w:before="0" w:after="100"/>
       <w:ind w:hanging="0" w:left="220"/>
     </w:pPr>
@@ -11227,7 +11587,7 @@
     <w:rsid w:val="003d528a"/>
     <w:pPr>
       <w:suppressAutoHyphens w:val="false"/>
-      <w:overflowPunct w:val="false"/>
+      <w:overflowPunct w:val="true"/>
       <w:spacing w:lineRule="auto" w:line="259" w:before="0" w:after="100"/>
       <w:ind w:hanging="0" w:left="440"/>
     </w:pPr>

</xml_diff>